<commit_message>
Update AURIS_Makale_Metni.docx with revised author details, highlights, and abstract for improved clarity and presentation
</commit_message>
<xml_diff>
--- a/docs/academic/paper/deliverables/AURIS_Genisletilmis_Ingilizce_Ozet.docx
+++ b/docs/academic/paper/deliverables/AURIS_Genisletilmis_Ingilizce_Ozet.docx
@@ -1,6 +1,6 @@
 
 <file path=word/document.xml><?xml version="1.0" encoding="utf-8"?>
-<w:document xmlns:wpc="http://schemas.microsoft.com/office/word/2010/wordprocessingCanvas" xmlns:cx="http://schemas.microsoft.com/office/drawing/2014/chartex" xmlns:cx1="http://schemas.microsoft.com/office/drawing/2015/9/8/chartex" xmlns:cx2="http://schemas.microsoft.com/office/drawing/2015/10/21/chartex" xmlns:cx3="http://schemas.microsoft.com/office/drawing/2016/5/9/chartex" xmlns:cx4="http://schemas.microsoft.com/office/drawing/2016/5/10/chartex" xmlns:cx5="http://schemas.microsoft.com/office/drawing/2016/5/11/chartex" xmlns:cx6="http://schemas.microsoft.com/office/drawing/2016/5/12/chartex" xmlns:cx7="http://schemas.microsoft.com/office/drawing/2016/5/13/chartex" xmlns:cx8="http://schemas.microsoft.com/office/drawing/2016/5/14/chartex" xmlns:mc="http://schemas.openxmlformats.org/markup-compatibility/2006" xmlns:aink="http://schemas.microsoft.com/office/drawing/2016/ink" xmlns:am3d="http://schemas.microsoft.com/office/drawing/2017/model3d" xmlns:o="urn:schemas-microsoft-com:office:office" xmlns:r="http://schemas.openxmlformats.org/officeDocument/2006/relationships" xmlns:m="http://schemas.openxmlformats.org/officeDocument/2006/math" xmlns:v="urn:schemas-microsoft-com:vml" xmlns:wp14="http://schemas.microsoft.com/office/word/2010/wordprocessingDrawing" xmlns:wp="http://schemas.openxmlformats.org/drawingml/2006/wordprocessingDrawing" xmlns:w10="urn:schemas-microsoft-com:office:word" xmlns:w="http://schemas.openxmlformats.org/wordprocessingml/2006/main" xmlns:w14="http://schemas.microsoft.com/office/word/2010/wordml" xmlns:w15="http://schemas.microsoft.com/office/word/2012/wordml" xmlns:w16cid="http://schemas.microsoft.com/office/word/2016/wordml/cid" xmlns:w16se="http://schemas.microsoft.com/office/word/2015/wordml/symex" xmlns:wpg="http://schemas.microsoft.com/office/word/2010/wordprocessingGroup" xmlns:wpi="http://schemas.microsoft.com/office/word/2010/wordprocessingInk" xmlns:wne="http://schemas.microsoft.com/office/word/2006/wordml" xmlns:wps="http://schemas.microsoft.com/office/word/2010/wordprocessingShape" mc:Ignorable="w14 w15 w16se w16cid wp14">
+<w:document xmlns:wpc="http://schemas.microsoft.com/office/word/2010/wordprocessingCanvas" xmlns:cx="http://schemas.microsoft.com/office/drawing/2014/chartex" xmlns:cx1="http://schemas.microsoft.com/office/drawing/2015/9/8/chartex" xmlns:cx2="http://schemas.microsoft.com/office/drawing/2015/10/21/chartex" xmlns:cx3="http://schemas.microsoft.com/office/drawing/2016/5/9/chartex" xmlns:cx4="http://schemas.microsoft.com/office/drawing/2016/5/10/chartex" xmlns:cx5="http://schemas.microsoft.com/office/drawing/2016/5/11/chartex" xmlns:cx6="http://schemas.microsoft.com/office/drawing/2016/5/12/chartex" xmlns:cx7="http://schemas.microsoft.com/office/drawing/2016/5/13/chartex" xmlns:cx8="http://schemas.microsoft.com/office/drawing/2016/5/14/chartex" xmlns:mc="http://schemas.openxmlformats.org/markup-compatibility/2006" xmlns:aink="http://schemas.microsoft.com/office/drawing/2016/ink" xmlns:am3d="http://schemas.microsoft.com/office/drawing/2017/model3d" xmlns:o="urn:schemas-microsoft-com:office:office" xmlns:oel="http://schemas.microsoft.com/office/2019/extlst" xmlns:r="http://schemas.openxmlformats.org/officeDocument/2006/relationships" xmlns:m="http://schemas.openxmlformats.org/officeDocument/2006/math" xmlns:v="urn:schemas-microsoft-com:vml" xmlns:wp14="http://schemas.microsoft.com/office/word/2010/wordprocessingDrawing" xmlns:wp="http://schemas.openxmlformats.org/drawingml/2006/wordprocessingDrawing" xmlns:w10="urn:schemas-microsoft-com:office:word" xmlns:w="http://schemas.openxmlformats.org/wordprocessingml/2006/main" xmlns:w14="http://schemas.microsoft.com/office/word/2010/wordml" xmlns:w15="http://schemas.microsoft.com/office/word/2012/wordml" xmlns:w16cex="http://schemas.microsoft.com/office/word/2018/wordml/cex" xmlns:w16cid="http://schemas.microsoft.com/office/word/2016/wordml/cid" xmlns:w16="http://schemas.microsoft.com/office/word/2018/wordml" xmlns:w16du="http://schemas.microsoft.com/office/word/2023/wordml/word16du" xmlns:w16sdtdh="http://schemas.microsoft.com/office/word/2020/wordml/sdtdatahash" xmlns:w16sdtfl="http://schemas.microsoft.com/office/word/2024/wordml/sdtformatlock" xmlns:w16se="http://schemas.microsoft.com/office/word/2015/wordml/symex" xmlns:wpg="http://schemas.microsoft.com/office/word/2010/wordprocessingGroup" xmlns:wpi="http://schemas.microsoft.com/office/word/2010/wordprocessingInk" xmlns:wne="http://schemas.microsoft.com/office/word/2006/wordml" xmlns:wps="http://schemas.microsoft.com/office/word/2010/wordprocessingShape" mc:Ignorable="w14 w15 w16se w16cid w16 w16cex w16sdtdh w16sdtfl w16du wp14">
   <w:body>
     <w:tbl>
       <w:tblPr>
@@ -27,7 +27,7 @@
       <w:tr>
         <w:tc>
           <w:tcPr>
-            <w:tcW w:w="10490" w:type="dxa"/>
+            <w:tcW w:w="10144" w:type="dxa"/>
           </w:tcPr>
           <w:p>
             <w:pPr>
@@ -50,396 +50,25 @@
       <w:tr>
         <w:tc>
           <w:tcPr>
-            <w:tcW w:w="10490" w:type="dxa"/>
+            <w:tcW w:w="10144" w:type="dxa"/>
           </w:tcPr>
           <w:p>
-            <w:r>
-              <w:rPr>
-                <w:rFonts w:ascii="Times New Roman" w:hAnsi="Times New Roman" w:cs="Times New Roman" w:eastAsia="Times New Roman"/>
-                <w:b/>
-                <w:i w:val="0"/>
+            <w:pPr>
+              <w:rPr>
+                <w:rFonts w:asciiTheme="majorBidi" w:hAnsiTheme="majorBidi" w:cstheme="majorBidi"/>
                 <w:sz w:val="28"/>
+                <w:szCs w:val="28"/>
+                <w:lang w:val="en-US"/>
+              </w:rPr>
+            </w:pPr>
+            <w:r>
+              <w:rPr>
+                <w:rFonts w:asciiTheme="majorBidi" w:hAnsiTheme="majorBidi" w:cstheme="majorBidi"/>
+                <w:sz w:val="28"/>
+                <w:szCs w:val="28"/>
+                <w:lang w:val="en-US"/>
               </w:rPr>
               <w:t>AURIS: A multi-model ensemble approach for the detection of AI-generated music</w:t>
-            </w:r>
-          </w:p>
-        </w:tc>
-      </w:tr>
-      <w:tr>
-        <w:tc>
-          <w:tcPr>
-            <w:tcW w:w="10490" w:type="dxa"/>
-          </w:tcPr>
-          <w:p>
-            <w:pPr>
-              <w:jc w:val="both"/>
-              <w:rPr>
-                <w:rFonts w:asciiTheme="majorBidi" w:hAnsiTheme="majorBidi" w:cstheme="majorBidi"/>
-                <w:sz w:val="18"/>
-                <w:szCs w:val="18"/>
-              </w:rPr>
-            </w:pPr>
-            <w:r>
-              <w:rPr>
-                <w:rFonts w:asciiTheme="majorBidi" w:hAnsiTheme="majorBidi" w:cstheme="majorBidi"/>
-                <w:b/>
-                <w:bCs/>
-                <w:color w:val="000000"/>
-                <w:sz w:val="16"/>
-                <w:szCs w:val="16"/>
-                <w:highlight w:val="red"/>
-                <w:shd w:val="clear" w:color="auto" w:fill="FFFFFF"/>
-              </w:rPr>
-              <w:t>ÖNEMLİ</w:t>
-            </w:r>
-            <w:r>
-              <w:rPr>
-                <w:rFonts w:asciiTheme="majorBidi" w:hAnsiTheme="majorBidi" w:cstheme="majorBidi"/>
-                <w:b/>
-                <w:bCs/>
-                <w:color w:val="000000"/>
-                <w:sz w:val="16"/>
-                <w:szCs w:val="16"/>
-                <w:highlight w:val="yellow"/>
-                <w:shd w:val="clear" w:color="auto" w:fill="FFFFFF"/>
-              </w:rPr>
-              <w:t xml:space="preserve">: </w:t>
-            </w:r>
-            <w:r>
-              <w:rPr>
-                <w:rFonts w:asciiTheme="majorBidi" w:hAnsiTheme="majorBidi" w:cstheme="majorBidi"/>
-                <w:b/>
-                <w:bCs/>
-                <w:color w:val="000000"/>
-                <w:sz w:val="16"/>
-                <w:szCs w:val="16"/>
-                <w:highlight w:val="yellow"/>
-                <w:shd w:val="clear" w:color="auto" w:fill="FFFFFF"/>
-              </w:rPr>
-              <w:t>Sarı dolgulu</w:t>
-            </w:r>
-            <w:r>
-              <w:rPr>
-                <w:rFonts w:asciiTheme="majorBidi" w:hAnsiTheme="majorBidi" w:cstheme="majorBidi"/>
-                <w:b/>
-                <w:bCs/>
-                <w:color w:val="000000"/>
-                <w:sz w:val="16"/>
-                <w:szCs w:val="16"/>
-                <w:highlight w:val="yellow"/>
-                <w:shd w:val="clear" w:color="auto" w:fill="FFFFFF"/>
-              </w:rPr>
-              <w:t xml:space="preserve"> yerleri</w:t>
-            </w:r>
-            <w:r>
-              <w:rPr>
-                <w:rFonts w:asciiTheme="majorBidi" w:hAnsiTheme="majorBidi" w:cstheme="majorBidi"/>
-                <w:b/>
-                <w:bCs/>
-                <w:color w:val="000000"/>
-                <w:sz w:val="16"/>
-                <w:szCs w:val="16"/>
-                <w:highlight w:val="yellow"/>
-                <w:shd w:val="clear" w:color="auto" w:fill="FFFFFF"/>
-              </w:rPr>
-              <w:t xml:space="preserve"> BU </w:t>
-            </w:r>
-            <w:r>
-              <w:rPr>
-                <w:rFonts w:asciiTheme="majorBidi" w:hAnsiTheme="majorBidi" w:cstheme="majorBidi"/>
-                <w:b/>
-                <w:bCs/>
-                <w:color w:val="000000"/>
-                <w:sz w:val="16"/>
-                <w:szCs w:val="16"/>
-                <w:highlight w:val="yellow"/>
-                <w:u w:val="single"/>
-                <w:shd w:val="clear" w:color="auto" w:fill="FFFFFF"/>
-              </w:rPr>
-              <w:t xml:space="preserve">DOSYA </w:t>
-            </w:r>
-            <w:r>
-              <w:rPr>
-                <w:rFonts w:asciiTheme="majorBidi" w:hAnsiTheme="majorBidi" w:cstheme="majorBidi"/>
-                <w:b/>
-                <w:bCs/>
-                <w:color w:val="000000"/>
-                <w:sz w:val="16"/>
-                <w:szCs w:val="16"/>
-                <w:highlight w:val="yellow"/>
-                <w:u w:val="single"/>
-                <w:shd w:val="clear" w:color="auto" w:fill="FFFFFF"/>
-              </w:rPr>
-              <w:t>ÜZERİNDE</w:t>
-            </w:r>
-            <w:r>
-              <w:rPr>
-                <w:rFonts w:asciiTheme="majorBidi" w:hAnsiTheme="majorBidi" w:cstheme="majorBidi"/>
-                <w:b/>
-                <w:bCs/>
-                <w:color w:val="000000"/>
-                <w:sz w:val="16"/>
-                <w:szCs w:val="16"/>
-                <w:highlight w:val="yellow"/>
-                <w:shd w:val="clear" w:color="auto" w:fill="FFFFFF"/>
-              </w:rPr>
-              <w:t xml:space="preserve"> </w:t>
-            </w:r>
-            <w:r>
-              <w:rPr>
-                <w:rFonts w:asciiTheme="majorBidi" w:hAnsiTheme="majorBidi" w:cstheme="majorBidi"/>
-                <w:b/>
-                <w:bCs/>
-                <w:color w:val="000000"/>
-                <w:sz w:val="16"/>
-                <w:szCs w:val="16"/>
-                <w:highlight w:val="red"/>
-                <w:u w:val="single"/>
-                <w:shd w:val="clear" w:color="auto" w:fill="FFFFFF"/>
-              </w:rPr>
-              <w:t>DOLDURMAYINIZ</w:t>
-            </w:r>
-            <w:r>
-              <w:rPr>
-                <w:rFonts w:asciiTheme="majorBidi" w:hAnsiTheme="majorBidi" w:cstheme="majorBidi"/>
-                <w:b/>
-                <w:bCs/>
-                <w:color w:val="000000"/>
-                <w:sz w:val="16"/>
-                <w:szCs w:val="16"/>
-                <w:highlight w:val="red"/>
-                <w:u w:val="single"/>
-                <w:shd w:val="clear" w:color="auto" w:fill="FFFFFF"/>
-              </w:rPr>
-              <w:t>.</w:t>
-            </w:r>
-            <w:r>
-              <w:rPr>
-                <w:rFonts w:asciiTheme="majorBidi" w:hAnsiTheme="majorBidi" w:cstheme="majorBidi"/>
-                <w:b/>
-                <w:bCs/>
-                <w:color w:val="000000"/>
-                <w:sz w:val="16"/>
-                <w:szCs w:val="16"/>
-                <w:highlight w:val="red"/>
-                <w:u w:val="single"/>
-                <w:shd w:val="clear" w:color="auto" w:fill="FFFFFF"/>
-              </w:rPr>
-              <w:t xml:space="preserve"> </w:t>
-            </w:r>
-            <w:r>
-              <w:rPr>
-                <w:rFonts w:asciiTheme="majorBidi" w:hAnsiTheme="majorBidi" w:cstheme="majorBidi"/>
-                <w:b/>
-                <w:bCs/>
-                <w:color w:val="000000"/>
-                <w:sz w:val="16"/>
-                <w:szCs w:val="16"/>
-                <w:highlight w:val="yellow"/>
-                <w:shd w:val="clear" w:color="auto" w:fill="FFFFFF"/>
-              </w:rPr>
-              <w:t xml:space="preserve">/ </w:t>
-            </w:r>
-            <w:r>
-              <w:rPr>
-                <w:rFonts w:asciiTheme="majorBidi" w:hAnsiTheme="majorBidi" w:cstheme="majorBidi"/>
-                <w:b/>
-                <w:bCs/>
-                <w:color w:val="000000"/>
-                <w:sz w:val="16"/>
-                <w:szCs w:val="16"/>
-                <w:highlight w:val="yellow"/>
-                <w:u w:val="single"/>
-                <w:shd w:val="clear" w:color="auto" w:fill="FFFFFF"/>
-              </w:rPr>
-              <w:t>İsim</w:t>
-            </w:r>
-            <w:r>
-              <w:rPr>
-                <w:rFonts w:asciiTheme="majorBidi" w:hAnsiTheme="majorBidi" w:cstheme="majorBidi"/>
-                <w:b/>
-                <w:bCs/>
-                <w:color w:val="000000"/>
-                <w:sz w:val="16"/>
-                <w:szCs w:val="16"/>
-                <w:highlight w:val="yellow"/>
-                <w:shd w:val="clear" w:color="auto" w:fill="FFFFFF"/>
-              </w:rPr>
-              <w:t xml:space="preserve">, </w:t>
-            </w:r>
-            <w:r>
-              <w:rPr>
-                <w:rFonts w:asciiTheme="majorBidi" w:hAnsiTheme="majorBidi" w:cstheme="majorBidi"/>
-                <w:b/>
-                <w:bCs/>
-                <w:color w:val="000000"/>
-                <w:sz w:val="16"/>
-                <w:szCs w:val="16"/>
-                <w:highlight w:val="yellow"/>
-                <w:u w:val="single"/>
-                <w:shd w:val="clear" w:color="auto" w:fill="FFFFFF"/>
-              </w:rPr>
-              <w:t>Kurum Adresi</w:t>
-            </w:r>
-            <w:r>
-              <w:rPr>
-                <w:rFonts w:asciiTheme="majorBidi" w:hAnsiTheme="majorBidi" w:cstheme="majorBidi"/>
-                <w:b/>
-                <w:bCs/>
-                <w:color w:val="000000"/>
-                <w:sz w:val="16"/>
-                <w:szCs w:val="16"/>
-                <w:highlight w:val="yellow"/>
-                <w:shd w:val="clear" w:color="auto" w:fill="FFFFFF"/>
-              </w:rPr>
-              <w:t xml:space="preserve"> (Türkçe ve İngilizce olarak verilmelidi</w:t>
-            </w:r>
-            <w:r>
-              <w:rPr>
-                <w:rFonts w:asciiTheme="majorBidi" w:hAnsiTheme="majorBidi" w:cstheme="majorBidi"/>
-                <w:b/>
-                <w:bCs/>
-                <w:color w:val="000000"/>
-                <w:sz w:val="16"/>
-                <w:szCs w:val="16"/>
-                <w:highlight w:val="yellow"/>
-                <w:shd w:val="clear" w:color="auto" w:fill="FFFFFF"/>
-              </w:rPr>
-              <w:t>r</w:t>
-            </w:r>
-            <w:r>
-              <w:rPr>
-                <w:rFonts w:asciiTheme="majorBidi" w:hAnsiTheme="majorBidi" w:cstheme="majorBidi"/>
-                <w:b/>
-                <w:bCs/>
-                <w:color w:val="000000"/>
-                <w:sz w:val="16"/>
-                <w:szCs w:val="16"/>
-                <w:highlight w:val="yellow"/>
-                <w:shd w:val="clear" w:color="auto" w:fill="FFFFFF"/>
-              </w:rPr>
-              <w:t>)</w:t>
-            </w:r>
-            <w:r>
-              <w:rPr>
-                <w:rFonts w:asciiTheme="majorBidi" w:hAnsiTheme="majorBidi" w:cstheme="majorBidi"/>
-                <w:b/>
-                <w:bCs/>
-                <w:color w:val="000000"/>
-                <w:sz w:val="16"/>
-                <w:szCs w:val="16"/>
-                <w:highlight w:val="yellow"/>
-                <w:shd w:val="clear" w:color="auto" w:fill="FFFFFF"/>
-              </w:rPr>
-              <w:t>,</w:t>
-            </w:r>
-            <w:r>
-              <w:rPr>
-                <w:rFonts w:asciiTheme="majorBidi" w:hAnsiTheme="majorBidi" w:cstheme="majorBidi"/>
-                <w:b/>
-                <w:bCs/>
-                <w:color w:val="000000"/>
-                <w:sz w:val="16"/>
-                <w:szCs w:val="16"/>
-                <w:highlight w:val="yellow"/>
-                <w:shd w:val="clear" w:color="auto" w:fill="FFFFFF"/>
-              </w:rPr>
-              <w:t xml:space="preserve"> vd. bilgiler KAPAK SAYFASI </w:t>
-            </w:r>
-            <w:r>
-              <w:rPr>
-                <w:rFonts w:asciiTheme="majorBidi" w:hAnsiTheme="majorBidi" w:cstheme="majorBidi"/>
-                <w:b/>
-                <w:bCs/>
-                <w:color w:val="000000"/>
-                <w:sz w:val="16"/>
-                <w:szCs w:val="16"/>
-                <w:highlight w:val="yellow"/>
-                <w:shd w:val="clear" w:color="auto" w:fill="FFFFFF"/>
-              </w:rPr>
-              <w:t>hazırlanarak</w:t>
-            </w:r>
-            <w:r>
-              <w:rPr>
-                <w:rFonts w:asciiTheme="majorBidi" w:hAnsiTheme="majorBidi" w:cstheme="majorBidi"/>
-                <w:b/>
-                <w:bCs/>
-                <w:color w:val="000000"/>
-                <w:sz w:val="16"/>
-                <w:szCs w:val="16"/>
-                <w:highlight w:val="yellow"/>
-                <w:shd w:val="clear" w:color="auto" w:fill="FFFFFF"/>
-              </w:rPr>
-              <w:t xml:space="preserve"> ayrı dosya olarak dergipark sisteme yüklenmelidir.</w:t>
-            </w:r>
-            <w:r>
-              <w:rPr>
-                <w:rFonts w:asciiTheme="majorBidi" w:hAnsiTheme="majorBidi" w:cstheme="majorBidi"/>
-                <w:b/>
-                <w:bCs/>
-                <w:color w:val="000000"/>
-                <w:sz w:val="16"/>
-                <w:szCs w:val="16"/>
-                <w:highlight w:val="yellow"/>
-                <w:shd w:val="clear" w:color="auto" w:fill="FFFFFF"/>
-              </w:rPr>
-              <w:t xml:space="preserve"> (</w:t>
-            </w:r>
-            <w:proofErr w:type="spellStart"/>
-            <w:proofErr w:type="gramStart"/>
-            <w:r>
-              <w:rPr>
-                <w:rFonts w:asciiTheme="majorBidi" w:hAnsiTheme="majorBidi" w:cstheme="majorBidi"/>
-                <w:b/>
-                <w:bCs/>
-                <w:color w:val="000000"/>
-                <w:sz w:val="16"/>
-                <w:szCs w:val="16"/>
-                <w:highlight w:val="yellow"/>
-                <w:shd w:val="clear" w:color="auto" w:fill="FFFFFF"/>
-              </w:rPr>
-              <w:t>bknz</w:t>
-            </w:r>
-            <w:proofErr w:type="spellEnd"/>
-            <w:proofErr w:type="gramEnd"/>
-            <w:r>
-              <w:rPr>
-                <w:rFonts w:asciiTheme="majorBidi" w:hAnsiTheme="majorBidi" w:cstheme="majorBidi"/>
-                <w:b/>
-                <w:bCs/>
-                <w:color w:val="000000"/>
-                <w:sz w:val="16"/>
-                <w:szCs w:val="16"/>
-                <w:highlight w:val="yellow"/>
-                <w:shd w:val="clear" w:color="auto" w:fill="FFFFFF"/>
-              </w:rPr>
-              <w:t xml:space="preserve"> Yazar Rehberi</w:t>
-            </w:r>
-            <w:r>
-              <w:rPr>
-                <w:rFonts w:asciiTheme="majorBidi" w:hAnsiTheme="majorBidi" w:cstheme="majorBidi"/>
-                <w:b/>
-                <w:bCs/>
-                <w:color w:val="000000"/>
-                <w:sz w:val="16"/>
-                <w:szCs w:val="16"/>
-                <w:highlight w:val="yellow"/>
-                <w:shd w:val="clear" w:color="auto" w:fill="FFFFFF"/>
-              </w:rPr>
-              <w:t>/</w:t>
-            </w:r>
-            <w:r>
-              <w:rPr>
-                <w:rFonts w:asciiTheme="majorBidi" w:hAnsiTheme="majorBidi" w:cstheme="majorBidi"/>
-                <w:b/>
-                <w:bCs/>
-                <w:color w:val="000000"/>
-                <w:sz w:val="16"/>
-                <w:szCs w:val="16"/>
-                <w:highlight w:val="yellow"/>
-                <w:shd w:val="clear" w:color="auto" w:fill="FFFFFF"/>
-              </w:rPr>
-              <w:t>Kapak Sayfası Taslak dosya)</w:t>
             </w:r>
           </w:p>
         </w:tc>
@@ -491,8 +120,8 @@
       </w:tblPr>
       <w:tblGrid>
         <w:gridCol w:w="2127"/>
-        <w:gridCol w:w="283"/>
-        <w:gridCol w:w="7734"/>
+        <w:gridCol w:w="23"/>
+        <w:gridCol w:w="7994"/>
       </w:tblGrid>
       <w:tr>
         <w:tc>
@@ -501,14 +130,117 @@
             <w:gridSpan w:val="3"/>
           </w:tcPr>
           <w:p>
-            <w:r>
-              <w:rPr>
-                <w:rFonts w:ascii="Times New Roman" w:hAnsi="Times New Roman" w:cs="Times New Roman" w:eastAsia="Times New Roman"/>
+            <w:pPr>
+              <w:jc w:val="both"/>
+              <w:rPr>
+                <w:rFonts w:asciiTheme="majorBidi" w:hAnsiTheme="majorBidi" w:cstheme="majorBidi"/>
                 <w:b/>
-                <w:i w:val="0"/>
-                <w:sz w:val="20"/>
-              </w:rPr>
-              <w:t>Hasan Arthur Altuntaş1,*</w:t>
+                <w:sz w:val="18"/>
+                <w:szCs w:val="18"/>
+                <w:lang w:val="en-US"/>
+              </w:rPr>
+            </w:pPr>
+            <w:r>
+              <w:rPr>
+                <w:rFonts w:asciiTheme="majorBidi" w:hAnsiTheme="majorBidi" w:cstheme="majorBidi"/>
+                <w:color w:val="000000"/>
+                <w:sz w:val="18"/>
+                <w:szCs w:val="18"/>
+                <w:shd w:val="clear" w:color="auto" w:fill="FFFFFF"/>
+                <w:lang w:val="en-US"/>
+              </w:rPr>
+              <w:t>Author1</w:t>
+            </w:r>
+            <w:r>
+              <w:rPr>
+                <w:rFonts w:asciiTheme="majorBidi" w:hAnsiTheme="majorBidi" w:cstheme="majorBidi"/>
+                <w:color w:val="000000"/>
+                <w:sz w:val="18"/>
+                <w:szCs w:val="18"/>
+                <w:shd w:val="clear" w:color="auto" w:fill="FFFFFF"/>
+                <w:vertAlign w:val="superscript"/>
+                <w:lang w:val="en-US"/>
+              </w:rPr>
+              <w:t>1*</w:t>
+            </w:r>
+            <w:r>
+              <w:rPr>
+                <w:rFonts w:asciiTheme="majorBidi" w:hAnsiTheme="majorBidi" w:cstheme="majorBidi"/>
+                <w:color w:val="000000"/>
+                <w:sz w:val="18"/>
+                <w:szCs w:val="18"/>
+                <w:shd w:val="clear" w:color="auto" w:fill="FFFFFF"/>
+                <w:lang w:val="en-US"/>
+              </w:rPr>
+              <w:t xml:space="preserve">, </w:t>
+            </w:r>
+            <w:r>
+              <w:rPr>
+                <w:rFonts w:asciiTheme="majorBidi" w:hAnsiTheme="majorBidi" w:cstheme="majorBidi"/>
+                <w:color w:val="000000"/>
+                <w:sz w:val="18"/>
+                <w:szCs w:val="18"/>
+                <w:shd w:val="clear" w:color="auto" w:fill="FFFFFF"/>
+                <w:lang w:val="en-US"/>
+              </w:rPr>
+              <w:t>Author2</w:t>
+            </w:r>
+            <w:r>
+              <w:rPr>
+                <w:rFonts w:asciiTheme="majorBidi" w:hAnsiTheme="majorBidi" w:cstheme="majorBidi"/>
+                <w:color w:val="000000"/>
+                <w:sz w:val="18"/>
+                <w:szCs w:val="18"/>
+                <w:shd w:val="clear" w:color="auto" w:fill="FFFFFF"/>
+                <w:vertAlign w:val="superscript"/>
+                <w:lang w:val="en-US"/>
+              </w:rPr>
+              <w:t>1</w:t>
+            </w:r>
+            <w:r>
+              <w:rPr>
+                <w:rFonts w:asciiTheme="majorBidi" w:hAnsiTheme="majorBidi" w:cstheme="majorBidi"/>
+                <w:color w:val="000000"/>
+                <w:sz w:val="18"/>
+                <w:szCs w:val="18"/>
+                <w:shd w:val="clear" w:color="auto" w:fill="FFFFFF"/>
+                <w:lang w:val="en-US"/>
+              </w:rPr>
+              <w:t xml:space="preserve">, </w:t>
+            </w:r>
+            <w:r>
+              <w:rPr>
+                <w:rFonts w:asciiTheme="majorBidi" w:hAnsiTheme="majorBidi" w:cstheme="majorBidi"/>
+                <w:color w:val="000000"/>
+                <w:sz w:val="18"/>
+                <w:szCs w:val="18"/>
+                <w:shd w:val="clear" w:color="auto" w:fill="FFFFFF"/>
+                <w:lang w:val="en-US"/>
+              </w:rPr>
+              <w:t>Author3</w:t>
+            </w:r>
+            <w:r>
+              <w:rPr>
+                <w:rFonts w:asciiTheme="majorBidi" w:hAnsiTheme="majorBidi" w:cstheme="majorBidi"/>
+                <w:color w:val="000000"/>
+                <w:sz w:val="18"/>
+                <w:szCs w:val="18"/>
+                <w:shd w:val="clear" w:color="auto" w:fill="FFFFFF"/>
+                <w:vertAlign w:val="superscript"/>
+                <w:lang w:val="en-US"/>
+              </w:rPr>
+              <w:t>2</w:t>
+            </w:r>
+            <w:r>
+              <w:rPr>
+                <w:rFonts w:asciiTheme="majorBidi" w:hAnsiTheme="majorBidi" w:cstheme="majorBidi"/>
+                <w:color w:val="000000"/>
+                <w:sz w:val="18"/>
+                <w:szCs w:val="18"/>
+                <w:shd w:val="clear" w:color="auto" w:fill="FFFFFF"/>
+                <w:lang w:val="en-US"/>
+              </w:rPr>
+              <w:t xml:space="preserve">                                     </w:t>
             </w:r>
           </w:p>
         </w:tc>
@@ -523,14 +255,157 @@
             </w:tcBorders>
           </w:tcPr>
           <w:p>
-            <w:r>
-              <w:rPr>
-                <w:rFonts w:ascii="Times New Roman" w:hAnsi="Times New Roman" w:cs="Times New Roman" w:eastAsia="Times New Roman"/>
-                <w:b w:val="0"/>
-                <w:i/>
-                <w:sz w:val="18"/>
-              </w:rPr>
-              <w:t>1Department of Computer Engineering, Faculty of Engineering, Düzce University, 81620, Düzce, Türkiye</w:t>
+            <w:pPr>
+              <w:jc w:val="both"/>
+              <w:rPr>
+                <w:rFonts w:asciiTheme="majorBidi" w:hAnsiTheme="majorBidi" w:cstheme="majorBidi"/>
+                <w:sz w:val="16"/>
+                <w:szCs w:val="16"/>
+                <w:lang w:val="en-US"/>
+              </w:rPr>
+            </w:pPr>
+            <w:r>
+              <w:rPr>
+                <w:rFonts w:asciiTheme="majorBidi" w:hAnsiTheme="majorBidi" w:cstheme="majorBidi"/>
+                <w:color w:val="000000"/>
+                <w:sz w:val="16"/>
+                <w:szCs w:val="16"/>
+                <w:shd w:val="clear" w:color="auto" w:fill="FFFFFF"/>
+                <w:vertAlign w:val="superscript"/>
+                <w:lang w:val="en-US"/>
+              </w:rPr>
+              <w:t>1</w:t>
+            </w:r>
+            <w:r>
+              <w:rPr>
+                <w:rFonts w:asciiTheme="majorBidi" w:hAnsiTheme="majorBidi" w:cstheme="majorBidi"/>
+                <w:sz w:val="16"/>
+                <w:szCs w:val="16"/>
+                <w:lang w:val="en-US"/>
+              </w:rPr>
+              <w:t>Department,</w:t>
+            </w:r>
+            <w:r>
+              <w:rPr>
+                <w:rFonts w:asciiTheme="majorBidi" w:hAnsiTheme="majorBidi" w:cstheme="majorBidi"/>
+                <w:sz w:val="16"/>
+                <w:szCs w:val="16"/>
+                <w:lang w:val="en-US"/>
+              </w:rPr>
+              <w:t xml:space="preserve"> Faculty, </w:t>
+            </w:r>
+            <w:r>
+              <w:rPr>
+                <w:rFonts w:asciiTheme="majorBidi" w:hAnsiTheme="majorBidi" w:cstheme="majorBidi"/>
+                <w:sz w:val="16"/>
+                <w:szCs w:val="16"/>
+                <w:lang w:val="en-US"/>
+              </w:rPr>
+              <w:t xml:space="preserve">University, </w:t>
+            </w:r>
+            <w:r>
+              <w:rPr>
+                <w:rFonts w:asciiTheme="majorBidi" w:hAnsiTheme="majorBidi" w:cstheme="majorBidi"/>
+                <w:sz w:val="16"/>
+                <w:szCs w:val="16"/>
+                <w:lang w:val="en-US"/>
+              </w:rPr>
+              <w:t>City</w:t>
+            </w:r>
+            <w:r>
+              <w:rPr>
+                <w:rFonts w:asciiTheme="majorBidi" w:hAnsiTheme="majorBidi" w:cstheme="majorBidi"/>
+                <w:sz w:val="16"/>
+                <w:szCs w:val="16"/>
+                <w:lang w:val="en-US"/>
+              </w:rPr>
+              <w:t xml:space="preserve">, </w:t>
+            </w:r>
+            <w:r>
+              <w:rPr>
+                <w:rFonts w:asciiTheme="majorBidi" w:hAnsiTheme="majorBidi" w:cstheme="majorBidi"/>
+                <w:sz w:val="16"/>
+                <w:szCs w:val="16"/>
+                <w:lang w:val="en-US"/>
+              </w:rPr>
+              <w:t>Postal Code</w:t>
+            </w:r>
+            <w:r>
+              <w:rPr>
+                <w:rFonts w:asciiTheme="majorBidi" w:hAnsiTheme="majorBidi" w:cstheme="majorBidi"/>
+                <w:sz w:val="16"/>
+                <w:szCs w:val="16"/>
+                <w:lang w:val="en-US"/>
+              </w:rPr>
+              <w:t xml:space="preserve">, </w:t>
+            </w:r>
+            <w:r>
+              <w:rPr>
+                <w:rFonts w:asciiTheme="majorBidi" w:hAnsiTheme="majorBidi" w:cstheme="majorBidi"/>
+                <w:sz w:val="16"/>
+                <w:szCs w:val="16"/>
+                <w:lang w:val="en-US"/>
+              </w:rPr>
+              <w:t>Country</w:t>
+            </w:r>
+          </w:p>
+          <w:p>
+            <w:pPr>
+              <w:jc w:val="both"/>
+              <w:rPr>
+                <w:rFonts w:asciiTheme="majorBidi" w:hAnsiTheme="majorBidi" w:cstheme="majorBidi"/>
+                <w:sz w:val="18"/>
+                <w:szCs w:val="18"/>
+                <w:lang w:val="en-US"/>
+              </w:rPr>
+            </w:pPr>
+            <w:r>
+              <w:rPr>
+                <w:rFonts w:asciiTheme="majorBidi" w:hAnsiTheme="majorBidi" w:cstheme="majorBidi"/>
+                <w:color w:val="000000"/>
+                <w:sz w:val="16"/>
+                <w:szCs w:val="16"/>
+                <w:shd w:val="clear" w:color="auto" w:fill="FFFFFF"/>
+                <w:vertAlign w:val="superscript"/>
+                <w:lang w:val="en-US"/>
+              </w:rPr>
+              <w:t>2</w:t>
+            </w:r>
+            <w:r>
+              <w:rPr>
+                <w:rFonts w:asciiTheme="majorBidi" w:hAnsiTheme="majorBidi" w:cstheme="majorBidi"/>
+                <w:sz w:val="16"/>
+                <w:szCs w:val="16"/>
+                <w:lang w:val="en-US"/>
+              </w:rPr>
+              <w:t xml:space="preserve">Department, </w:t>
+            </w:r>
+            <w:r>
+              <w:rPr>
+                <w:rFonts w:asciiTheme="majorBidi" w:hAnsiTheme="majorBidi" w:cstheme="majorBidi"/>
+                <w:sz w:val="16"/>
+                <w:szCs w:val="16"/>
+                <w:lang w:val="en-US"/>
+              </w:rPr>
+              <w:t>Faculty,</w:t>
+            </w:r>
+            <w:r>
+              <w:rPr>
+                <w:rFonts w:asciiTheme="majorBidi" w:hAnsiTheme="majorBidi" w:cstheme="majorBidi"/>
+                <w:sz w:val="16"/>
+                <w:szCs w:val="16"/>
+                <w:lang w:val="en-US"/>
+              </w:rPr>
+              <w:t xml:space="preserve"> </w:t>
+            </w:r>
+            <w:r>
+              <w:rPr>
+                <w:rFonts w:asciiTheme="majorBidi" w:hAnsiTheme="majorBidi" w:cstheme="majorBidi"/>
+                <w:sz w:val="16"/>
+                <w:szCs w:val="16"/>
+                <w:lang w:val="en-US"/>
+              </w:rPr>
+              <w:t>University, City, Postal Code, Country</w:t>
             </w:r>
           </w:p>
         </w:tc>
@@ -567,12 +442,24 @@
             </w:tcBorders>
           </w:tcPr>
           <w:p>
-            <w:r>
-              <w:rPr>
-                <w:rFonts w:ascii="Times New Roman" w:hAnsi="Times New Roman" w:cs="Times New Roman" w:eastAsia="Times New Roman"/>
+            <w:pPr>
+              <w:pStyle w:val="ilkyaynmetin"/>
+              <w:spacing w:before="0" w:after="0" w:line="240" w:lineRule="auto"/>
+              <w:rPr>
+                <w:rFonts w:asciiTheme="majorBidi" w:hAnsiTheme="majorBidi" w:cstheme="majorBidi"/>
                 <w:b/>
-                <w:i w:val="0"/>
-                <w:sz w:val="18"/>
+                <w:sz w:val="18"/>
+                <w:szCs w:val="18"/>
+                <w:lang w:val="en-US"/>
+              </w:rPr>
+            </w:pPr>
+            <w:r>
+              <w:rPr>
+                <w:rFonts w:asciiTheme="majorBidi" w:hAnsiTheme="majorBidi" w:cstheme="majorBidi"/>
+                <w:b/>
+                <w:sz w:val="18"/>
+                <w:szCs w:val="18"/>
+                <w:lang w:val="en-US"/>
               </w:rPr>
               <w:t>Highlights:</w:t>
             </w:r>
@@ -580,7 +467,7 @@
         </w:tc>
         <w:tc>
           <w:tcPr>
-            <w:tcW w:w="283" w:type="dxa"/>
+            <w:tcW w:w="23" w:type="dxa"/>
             <w:tcBorders>
               <w:left w:val="nil"/>
             </w:tcBorders>
@@ -600,28 +487,70 @@
         </w:tc>
         <w:tc>
           <w:tcPr>
-            <w:tcW w:w="7734" w:type="dxa"/>
+            <w:tcW w:w="7994" w:type="dxa"/>
             <w:tcBorders>
               <w:left w:val="nil"/>
               <w:bottom w:val="single" w:sz="4" w:space="0" w:color="auto"/>
             </w:tcBorders>
           </w:tcPr>
           <w:p>
-            <w:r>
-              <w:rPr>
-                <w:rFonts w:ascii="Times New Roman" w:hAnsi="Times New Roman" w:cs="Times New Roman" w:eastAsia="Times New Roman"/>
+            <w:pPr>
+              <w:pStyle w:val="ilkyaynmetin"/>
+              <w:spacing w:before="0" w:after="0" w:line="240" w:lineRule="auto"/>
+              <w:rPr>
+                <w:rFonts w:asciiTheme="majorBidi" w:hAnsiTheme="majorBidi" w:cstheme="majorBidi"/>
                 <w:b/>
-                <w:i w:val="0"/>
-                <w:sz w:val="18"/>
-              </w:rPr>
-              <w:t>Graphical/Tabular Abstract</w:t>
+                <w:sz w:val="18"/>
+                <w:szCs w:val="18"/>
+                <w:lang w:val="en-US"/>
+              </w:rPr>
+            </w:pPr>
+            <w:r>
+              <w:rPr>
+                <w:rFonts w:asciiTheme="majorBidi" w:hAnsiTheme="majorBidi" w:cstheme="majorBidi"/>
+                <w:b/>
+                <w:sz w:val="18"/>
+                <w:szCs w:val="18"/>
+                <w:lang w:val="en-US"/>
+              </w:rPr>
+              <w:t>Graphical</w:t>
+            </w:r>
+            <w:r>
+              <w:rPr>
+                <w:rFonts w:asciiTheme="majorBidi" w:hAnsiTheme="majorBidi" w:cstheme="majorBidi"/>
+                <w:b/>
+                <w:sz w:val="18"/>
+                <w:szCs w:val="18"/>
+                <w:lang w:val="en-US"/>
+              </w:rPr>
+              <w:t>/Tabular</w:t>
+            </w:r>
+            <w:r>
+              <w:rPr>
+                <w:rFonts w:asciiTheme="majorBidi" w:hAnsiTheme="majorBidi" w:cstheme="majorBidi"/>
+                <w:b/>
+                <w:sz w:val="18"/>
+                <w:szCs w:val="18"/>
+                <w:lang w:val="en-US"/>
+              </w:rPr>
+              <w:t xml:space="preserve"> </w:t>
+            </w:r>
+            <w:r>
+              <w:rPr>
+                <w:rFonts w:asciiTheme="majorBidi" w:hAnsiTheme="majorBidi" w:cstheme="majorBidi"/>
+                <w:b/>
+                <w:sz w:val="18"/>
+                <w:szCs w:val="18"/>
+                <w:lang w:val="en-US"/>
+              </w:rPr>
+              <w:t>Abstract</w:t>
             </w:r>
           </w:p>
         </w:tc>
       </w:tr>
       <w:tr>
         <w:trPr>
-          <w:trHeight w:val="819"/>
+          <w:trHeight w:val="2913"/>
         </w:trPr>
         <w:tc>
           <w:tcPr>
@@ -631,39 +560,118 @@
             </w:tcBorders>
           </w:tcPr>
           <w:p>
-            <w:r>
-              <w:rPr>
-                <w:rFonts w:ascii="Times New Roman" w:hAnsi="Times New Roman" w:cs="Times New Roman" w:eastAsia="Times New Roman"/>
-                <w:b w:val="0"/>
-                <w:sz w:val="18"/>
-              </w:rPr>
-              <w:t>• Proposed AURIS: end-to-end AI music detection with 47-dimensional acoustic feature vector</w:t>
-            </w:r>
-          </w:p>
-          <w:p>
-            <w:r>
-              <w:rPr>
-                <w:rFonts w:ascii="Times New Roman" w:hAnsi="Times New Roman" w:cs="Times New Roman" w:eastAsia="Times New Roman"/>
-                <w:b w:val="0"/>
-                <w:sz w:val="18"/>
-              </w:rPr>
-              <w:t>• 11-model ensemble (7 ML + 4 DL), LightGBM 95.48% ROC-AUC, lowest cross-fold variance (±0.0023)</w:t>
-            </w:r>
-          </w:p>
-          <w:p>
-            <w:r>
-              <w:rPr>
-                <w:rFonts w:ascii="Times New Roman" w:hAnsi="Times New Roman" w:cs="Times New Roman" w:eastAsia="Times New Roman"/>
-                <w:b w:val="0"/>
-                <w:sz w:val="18"/>
-              </w:rPr>
-              <w:t>• Spectral flatness identified as most informative feature; 17 of 47 features add no measurable accuracy</w:t>
+            <w:pPr>
+              <w:pStyle w:val="ListeParagraf"/>
+              <w:numPr>
+                <w:ilvl w:val="0"/>
+                <w:numId w:val="19"/>
+              </w:numPr>
+              <w:spacing w:line="238" w:lineRule="auto"/>
+              <w:ind w:left="170" w:right="113" w:hanging="170"/>
+              <w:jc w:val="both"/>
+              <w:rPr>
+                <w:rFonts w:asciiTheme="majorBidi" w:hAnsiTheme="majorBidi" w:cstheme="majorBidi"/>
+                <w:sz w:val="18"/>
+                <w:szCs w:val="18"/>
+                <w:shd w:val="clear" w:color="auto" w:fill="FFFFFF"/>
+                <w:lang w:val="en-US"/>
+              </w:rPr>
+            </w:pPr>
+            <w:r>
+              <w:rPr>
+                <w:rFonts w:asciiTheme="majorBidi" w:hAnsiTheme="majorBidi" w:cstheme="majorBidi"/>
+                <w:sz w:val="18"/>
+                <w:szCs w:val="18"/>
+                <w:shd w:val="clear" w:color="auto" w:fill="FFFFFF"/>
+                <w:lang w:val="en-US"/>
+              </w:rPr>
+              <w:t>Proposed AURIS: end-to-end AI-generated music detection with 47-dimensional feature vector</w:t>
+            </w:r>
+          </w:p>
+          <w:p>
+            <w:pPr>
+              <w:pStyle w:val="ListeParagraf"/>
+              <w:numPr>
+                <w:ilvl w:val="0"/>
+                <w:numId w:val="19"/>
+              </w:numPr>
+              <w:spacing w:line="238" w:lineRule="auto"/>
+              <w:ind w:left="170" w:right="113" w:hanging="170"/>
+              <w:jc w:val="both"/>
+              <w:rPr>
+                <w:rFonts w:asciiTheme="majorBidi" w:hAnsiTheme="majorBidi" w:cstheme="majorBidi"/>
+                <w:sz w:val="18"/>
+                <w:szCs w:val="18"/>
+                <w:shd w:val="clear" w:color="auto" w:fill="FFFFFF"/>
+                <w:lang w:val="en-US"/>
+              </w:rPr>
+            </w:pPr>
+            <w:r>
+              <w:rPr>
+                <w:rFonts w:asciiTheme="majorBidi" w:hAnsiTheme="majorBidi" w:cstheme="majorBidi"/>
+                <w:sz w:val="18"/>
+                <w:szCs w:val="18"/>
+                <w:shd w:val="clear" w:color="auto" w:fill="FFFFFF"/>
+                <w:lang w:val="en-US"/>
+              </w:rPr>
+              <w:t xml:space="preserve">Achieved 95.48% ROC-AUC with </w:t>
+            </w:r>
+            <w:proofErr w:type="spellStart"/>
+            <w:r>
+              <w:rPr>
+                <w:rFonts w:asciiTheme="majorBidi" w:hAnsiTheme="majorBidi" w:cstheme="majorBidi"/>
+                <w:sz w:val="18"/>
+                <w:szCs w:val="18"/>
+                <w:shd w:val="clear" w:color="auto" w:fill="FFFFFF"/>
+                <w:lang w:val="en-US"/>
+              </w:rPr>
+              <w:t>LightGBM</w:t>
+            </w:r>
+            <w:proofErr w:type="spellEnd"/>
+            <w:r>
+              <w:rPr>
+                <w:rFonts w:asciiTheme="majorBidi" w:hAnsiTheme="majorBidi" w:cstheme="majorBidi"/>
+                <w:sz w:val="18"/>
+                <w:szCs w:val="18"/>
+                <w:shd w:val="clear" w:color="auto" w:fill="FFFFFF"/>
+                <w:lang w:val="en-US"/>
+              </w:rPr>
+              <w:t xml:space="preserve"> and ±0.0023 cross-fold</w:t>
+            </w:r>
+          </w:p>
+          <w:p>
+            <w:pPr>
+              <w:pStyle w:val="ListeParagraf"/>
+              <w:numPr>
+                <w:ilvl w:val="0"/>
+                <w:numId w:val="19"/>
+              </w:numPr>
+              <w:spacing w:line="238" w:lineRule="auto"/>
+              <w:ind w:left="170" w:right="113" w:hanging="170"/>
+              <w:jc w:val="both"/>
+              <w:rPr>
+                <w:rFonts w:asciiTheme="majorBidi" w:hAnsiTheme="majorBidi" w:cstheme="majorBidi"/>
+                <w:sz w:val="18"/>
+                <w:szCs w:val="18"/>
+                <w:shd w:val="clear" w:color="auto" w:fill="FFFFFF"/>
+                <w:lang w:val="en-US"/>
+              </w:rPr>
+            </w:pPr>
+            <w:r>
+              <w:rPr>
+                <w:rFonts w:asciiTheme="majorBidi" w:hAnsiTheme="majorBidi" w:cstheme="majorBidi"/>
+                <w:sz w:val="18"/>
+                <w:szCs w:val="18"/>
+                <w:shd w:val="clear" w:color="auto" w:fill="FFFFFF"/>
+                <w:lang w:val="en-US"/>
+              </w:rPr>
+              <w:t>Spectral flatness standard deviation identified as most informative feature for AI vs. human music distinction</w:t>
             </w:r>
           </w:p>
         </w:tc>
         <w:tc>
           <w:tcPr>
-            <w:tcW w:w="283" w:type="dxa"/>
+            <w:tcW w:w="23" w:type="dxa"/>
             <w:tcBorders>
               <w:left w:val="nil"/>
             </w:tcBorders>
@@ -685,7 +693,7 @@
         </w:tc>
         <w:tc>
           <w:tcPr>
-            <w:tcW w:w="7734" w:type="dxa"/>
+            <w:tcW w:w="7994" w:type="dxa"/>
             <w:vMerge w:val="restart"/>
             <w:tcBorders>
               <w:top w:val="single" w:sz="4" w:space="0" w:color="auto"/>
@@ -693,20 +701,570 @@
             </w:tcBorders>
           </w:tcPr>
           <w:p>
-            <w:r>
-              <w:rPr>
-                <w:rFonts w:ascii="Times New Roman" w:hAnsi="Times New Roman" w:cs="Times New Roman" w:eastAsia="Times New Roman"/>
-                <w:b w:val="0"/>
-                <w:i w:val="0"/>
-                <w:sz w:val="18"/>
-              </w:rPr>
+            <w:pPr>
+              <w:pStyle w:val="ListeParagraf"/>
+              <w:ind w:left="0"/>
+              <w:jc w:val="both"/>
+              <w:rPr>
+                <w:rFonts w:asciiTheme="majorBidi" w:hAnsiTheme="majorBidi" w:cstheme="majorBidi"/>
+                <w:sz w:val="18"/>
+                <w:szCs w:val="18"/>
+                <w:lang w:val="en-US"/>
+              </w:rPr>
+            </w:pPr>
+            <w:r>
+              <w:rPr>
+                <w:rFonts w:asciiTheme="majorBidi" w:hAnsiTheme="majorBidi" w:cstheme="majorBidi"/>
+                <w:sz w:val="18"/>
+                <w:szCs w:val="18"/>
+                <w:lang w:val="en-US"/>
+              </w:rPr>
+              <w:t xml:space="preserve">The proliferation of text-to-music generators such as Suno, </w:t>
+            </w:r>
+            <w:proofErr w:type="spellStart"/>
+            <w:r>
+              <w:rPr>
+                <w:rFonts w:asciiTheme="majorBidi" w:hAnsiTheme="majorBidi" w:cstheme="majorBidi"/>
+                <w:sz w:val="18"/>
+                <w:szCs w:val="18"/>
+                <w:lang w:val="en-US"/>
+              </w:rPr>
+              <w:t>Udio</w:t>
+            </w:r>
+            <w:proofErr w:type="spellEnd"/>
+            <w:r>
+              <w:rPr>
+                <w:rFonts w:asciiTheme="majorBidi" w:hAnsiTheme="majorBidi" w:cstheme="majorBidi"/>
+                <w:sz w:val="18"/>
+                <w:szCs w:val="18"/>
+                <w:lang w:val="en-US"/>
+              </w:rPr>
+              <w:t xml:space="preserve"> and </w:t>
+            </w:r>
+            <w:proofErr w:type="spellStart"/>
+            <w:r>
+              <w:rPr>
+                <w:rFonts w:asciiTheme="majorBidi" w:hAnsiTheme="majorBidi" w:cstheme="majorBidi"/>
+                <w:sz w:val="18"/>
+                <w:szCs w:val="18"/>
+                <w:lang w:val="en-US"/>
+              </w:rPr>
+              <w:t>MusicGen</w:t>
+            </w:r>
+            <w:proofErr w:type="spellEnd"/>
+            <w:r>
+              <w:rPr>
+                <w:rFonts w:asciiTheme="majorBidi" w:hAnsiTheme="majorBidi" w:cstheme="majorBidi"/>
+                <w:sz w:val="18"/>
+                <w:szCs w:val="18"/>
+                <w:lang w:val="en-US"/>
+              </w:rPr>
+              <w:t xml:space="preserve"> has created a detection problem of practical importance for copyright attribution, streaming-platform integrity and artist economics. This paper proposes AURIS, a system that couples a 47-dimensional handcrafted acoustic feature vector with an ensemble of eleven classifiers. The models are trained on a dataset of 5,195 samples drawn from twelve AI generation systems and multiple human sources (GTZAN, FMA, </w:t>
+            </w:r>
+            <w:proofErr w:type="spellStart"/>
+            <w:r>
+              <w:rPr>
+                <w:rFonts w:asciiTheme="majorBidi" w:hAnsiTheme="majorBidi" w:cstheme="majorBidi"/>
+                <w:sz w:val="18"/>
+                <w:szCs w:val="18"/>
+                <w:lang w:val="en-US"/>
+              </w:rPr>
+              <w:t>SleepyJesse</w:t>
+            </w:r>
+            <w:proofErr w:type="spellEnd"/>
+            <w:r>
+              <w:rPr>
+                <w:rFonts w:asciiTheme="majorBidi" w:hAnsiTheme="majorBidi" w:cstheme="majorBidi"/>
+                <w:sz w:val="18"/>
+                <w:szCs w:val="18"/>
+                <w:lang w:val="en-US"/>
+              </w:rPr>
+              <w:t xml:space="preserve"> covers) under 5-fold cross-validation. </w:t>
+            </w:r>
+            <w:proofErr w:type="spellStart"/>
+            <w:r>
+              <w:rPr>
+                <w:rFonts w:asciiTheme="majorBidi" w:hAnsiTheme="majorBidi" w:cstheme="majorBidi"/>
+                <w:sz w:val="18"/>
+                <w:szCs w:val="18"/>
+                <w:lang w:val="en-US"/>
+              </w:rPr>
+              <w:t>LightGBM</w:t>
+            </w:r>
+            <w:proofErr w:type="spellEnd"/>
+            <w:r>
+              <w:rPr>
+                <w:rFonts w:asciiTheme="majorBidi" w:hAnsiTheme="majorBidi" w:cstheme="majorBidi"/>
+                <w:sz w:val="18"/>
+                <w:szCs w:val="18"/>
+                <w:lang w:val="en-US"/>
+              </w:rPr>
+              <w:t xml:space="preserve"> achieves the top ROC-AUC of 0.9548 (±0.0023). Spectral-flatness standard deviation ranks first in feature importance. A Youden-J </w:t>
+            </w:r>
+            <w:proofErr w:type="spellStart"/>
+            <w:r>
+              <w:rPr>
+                <w:rFonts w:asciiTheme="majorBidi" w:hAnsiTheme="majorBidi" w:cstheme="majorBidi"/>
+                <w:sz w:val="18"/>
+                <w:szCs w:val="18"/>
+                <w:lang w:val="en-US"/>
+              </w:rPr>
+              <w:t>optimised</w:t>
+            </w:r>
+            <w:proofErr w:type="spellEnd"/>
+            <w:r>
+              <w:rPr>
+                <w:rFonts w:asciiTheme="majorBidi" w:hAnsiTheme="majorBidi" w:cstheme="majorBidi"/>
+                <w:sz w:val="18"/>
+                <w:szCs w:val="18"/>
+                <w:lang w:val="en-US"/>
+              </w:rPr>
+              <w:t xml:space="preserve"> threshold of θ* = 0.4316 improves balanced accuracy. The architecture of AURIS is presented in Figure A.</w:t>
+            </w:r>
+          </w:p>
+          <w:p>
+            <w:pPr>
+              <w:pStyle w:val="ListeParagraf"/>
+              <w:ind w:left="0"/>
+              <w:jc w:val="both"/>
+              <w:rPr>
+                <w:rFonts w:asciiTheme="majorBidi" w:hAnsiTheme="majorBidi" w:cstheme="majorBidi"/>
+                <w:sz w:val="16"/>
+                <w:szCs w:val="16"/>
+                <w:highlight w:val="yellow"/>
+                <w:shd w:val="clear" w:color="auto" w:fill="FFFFFF"/>
+                <w:lang w:val="en-US"/>
+              </w:rPr>
+            </w:pPr>
+          </w:p>
+          <w:p>
+            <w:pPr>
+              <w:pStyle w:val="ListeParagraf"/>
+              <w:ind w:left="0"/>
+              <w:jc w:val="both"/>
+              <w:rPr>
+                <w:rFonts w:asciiTheme="majorBidi" w:hAnsiTheme="majorBidi" w:cstheme="majorBidi"/>
+                <w:sz w:val="10"/>
+                <w:szCs w:val="10"/>
+              </w:rPr>
+            </w:pPr>
+            <w:r>
+              <w:rPr>
+                <w:noProof/>
+              </w:rPr>
+              <w:drawing>
+                <wp:inline distT="0" distB="0" distL="0" distR="0" wp14:anchorId="718DEE24" wp14:editId="6CF5D5CF">
+                  <wp:extent cx="4917832" cy="1566407"/>
+                  <wp:effectExtent l="0" t="0" r="0" b="0"/>
+                  <wp:docPr id="62" name="Picture 62"/>
+                  <wp:cNvGraphicFramePr>
+                    <a:graphicFrameLocks xmlns:a="http://schemas.openxmlformats.org/drawingml/2006/main" noChangeAspect="1"/>
+                  </wp:cNvGraphicFramePr>
+                  <a:graphic xmlns:a="http://schemas.openxmlformats.org/drawingml/2006/main">
+                    <a:graphicData uri="http://schemas.openxmlformats.org/drawingml/2006/picture">
+                      <pic:pic xmlns:pic="http://schemas.openxmlformats.org/drawingml/2006/picture">
+                        <pic:nvPicPr>
+                          <pic:cNvPr id="0" name="paper_pipeline_diagram.png"/>
+                          <pic:cNvPicPr/>
+                        </pic:nvPicPr>
+                        <pic:blipFill>
+                          <a:blip r:embed="rId12"/>
+                          <a:stretch>
+                            <a:fillRect/>
+                          </a:stretch>
+                        </pic:blipFill>
+                        <pic:spPr>
+                          <a:xfrm>
+                            <a:off x="0" y="0"/>
+                            <a:ext cx="4958041" cy="1579214"/>
+                          </a:xfrm>
+                          <a:prstGeom prst="rect">
+                            <a:avLst/>
+                          </a:prstGeom>
+                        </pic:spPr>
+                      </pic:pic>
+                    </a:graphicData>
+                  </a:graphic>
+                </wp:inline>
+              </w:drawing>
+            </w:r>
+          </w:p>
+          <w:p>
+            <w:pPr>
+              <w:pStyle w:val="ListeParagraf"/>
+              <w:ind w:left="157"/>
+              <w:jc w:val="center"/>
+              <w:rPr>
+                <w:rFonts w:asciiTheme="majorBidi" w:eastAsia="Calibri" w:hAnsiTheme="majorBidi" w:cstheme="majorBidi"/>
+                <w:b/>
+                <w:bCs/>
+                <w:noProof/>
+                <w:sz w:val="4"/>
+                <w:szCs w:val="4"/>
+                <w:lang w:val="en-GB" w:eastAsia="tr-TR"/>
+              </w:rPr>
+            </w:pPr>
+          </w:p>
+          <w:p>
+            <w:pPr>
+              <w:pStyle w:val="ListeParagraf"/>
+              <w:ind w:left="157"/>
+              <w:jc w:val="center"/>
+              <w:rPr>
+                <w:rFonts w:asciiTheme="majorBidi" w:eastAsia="Calibri" w:hAnsiTheme="majorBidi" w:cstheme="majorBidi"/>
+                <w:noProof/>
+                <w:sz w:val="18"/>
+                <w:szCs w:val="18"/>
+                <w:lang w:val="en-GB" w:eastAsia="tr-TR"/>
+              </w:rPr>
+            </w:pPr>
+            <w:r>
+              <w:rPr>
+                <w:rFonts w:asciiTheme="majorBidi" w:eastAsia="Calibri" w:hAnsiTheme="majorBidi" w:cstheme="majorBidi"/>
+                <w:b/>
+                <w:bCs/>
+                <w:noProof/>
+                <w:sz w:val="18"/>
+                <w:szCs w:val="18"/>
+                <w:lang w:val="en-GB" w:eastAsia="tr-TR"/>
+              </w:rPr>
+              <w:t xml:space="preserve">Figure A. </w:t>
+            </w:r>
+            <w:r>
+              <w:rPr>
+                <w:rFonts w:asciiTheme="majorBidi" w:eastAsia="Calibri" w:hAnsiTheme="majorBidi" w:cstheme="majorBidi"/>
+                <w:noProof/>
+                <w:sz w:val="18"/>
+                <w:szCs w:val="18"/>
+                <w:lang w:val="en-GB" w:eastAsia="tr-TR"/>
+              </w:rPr>
+              <w:t>An overview of the proposed AURIS system pipeline</w:t>
+            </w:r>
+          </w:p>
+          <w:p>
+            <w:pPr>
+              <w:pStyle w:val="ListeParagraf"/>
+              <w:ind w:left="0"/>
+              <w:jc w:val="both"/>
+              <w:rPr>
+                <w:rFonts w:asciiTheme="majorBidi" w:hAnsiTheme="majorBidi" w:cstheme="majorBidi"/>
+                <w:noProof/>
+                <w:sz w:val="16"/>
+                <w:szCs w:val="16"/>
+                <w:lang w:eastAsia="tr-TR"/>
+              </w:rPr>
+            </w:pPr>
+          </w:p>
+          <w:p>
+            <w:pPr>
+              <w:pStyle w:val="ilkyaynmetin"/>
+              <w:spacing w:before="0" w:after="0" w:line="240" w:lineRule="auto"/>
+              <w:rPr>
+                <w:rFonts w:asciiTheme="majorBidi" w:eastAsiaTheme="minorHAnsi" w:hAnsiTheme="majorBidi" w:cstheme="majorBidi"/>
+                <w:sz w:val="18"/>
+                <w:szCs w:val="18"/>
+                <w:lang w:val="en-US"/>
+              </w:rPr>
+            </w:pPr>
+            <w:r>
+              <w:rPr>
+                <w:rFonts w:asciiTheme="majorBidi" w:hAnsiTheme="majorBidi" w:cstheme="majorBidi"/>
+                <w:b/>
+                <w:sz w:val="18"/>
+                <w:szCs w:val="18"/>
+                <w:lang w:val="en-US"/>
+              </w:rPr>
+              <w:t>Purpose:</w:t>
+            </w:r>
+            <w:r>
+              <w:rPr>
+                <w:rFonts w:asciiTheme="majorBidi" w:hAnsiTheme="majorBidi" w:cstheme="majorBidi"/>
+                <w:b/>
+                <w:sz w:val="18"/>
+                <w:szCs w:val="18"/>
+                <w:lang w:val="en-US"/>
+              </w:rPr>
+              <w:t xml:space="preserve"> </w:t>
+            </w:r>
+            <w:r>
+              <w:rPr>
+                <w:rFonts w:asciiTheme="majorBidi" w:eastAsiaTheme="minorHAnsi" w:hAnsiTheme="majorBidi" w:cstheme="majorBidi"/>
+                <w:sz w:val="18"/>
+                <w:szCs w:val="18"/>
+                <w:lang w:val="en-US"/>
+              </w:rPr>
+              <w:t xml:space="preserve">The widespread diffusion of text-to-music generators such as Suno, </w:t>
+            </w:r>
+            <w:proofErr w:type="spellStart"/>
+            <w:r>
+              <w:rPr>
+                <w:rFonts w:asciiTheme="majorBidi" w:eastAsiaTheme="minorHAnsi" w:hAnsiTheme="majorBidi" w:cstheme="majorBidi"/>
+                <w:sz w:val="18"/>
+                <w:szCs w:val="18"/>
+                <w:lang w:val="en-US"/>
+              </w:rPr>
+              <w:t>Udio</w:t>
+            </w:r>
+            <w:proofErr w:type="spellEnd"/>
+            <w:r>
+              <w:rPr>
+                <w:rFonts w:asciiTheme="majorBidi" w:eastAsiaTheme="minorHAnsi" w:hAnsiTheme="majorBidi" w:cstheme="majorBidi"/>
+                <w:sz w:val="18"/>
+                <w:szCs w:val="18"/>
+                <w:lang w:val="en-US"/>
+              </w:rPr>
+              <w:t xml:space="preserve"> and </w:t>
+            </w:r>
+            <w:proofErr w:type="spellStart"/>
+            <w:r>
+              <w:rPr>
+                <w:rFonts w:asciiTheme="majorBidi" w:eastAsiaTheme="minorHAnsi" w:hAnsiTheme="majorBidi" w:cstheme="majorBidi"/>
+                <w:sz w:val="18"/>
+                <w:szCs w:val="18"/>
+                <w:lang w:val="en-US"/>
+              </w:rPr>
+              <w:t>MusicGen</w:t>
+            </w:r>
+            <w:proofErr w:type="spellEnd"/>
+            <w:r>
+              <w:rPr>
+                <w:rFonts w:asciiTheme="majorBidi" w:eastAsiaTheme="minorHAnsi" w:hAnsiTheme="majorBidi" w:cstheme="majorBidi"/>
+                <w:sz w:val="18"/>
+                <w:szCs w:val="18"/>
+                <w:lang w:val="en-US"/>
+              </w:rPr>
+              <w:t xml:space="preserve"> has raised a detection problem of practical importance for copyright attribution, streaming-platform integrity and artist economics. This study aims to design an end-to-end system that distinguishes AI-generated music from human composition with competitive accuracy and operational interpretability.</w:t>
+            </w:r>
+          </w:p>
+          <w:p>
+            <w:pPr>
+              <w:pStyle w:val="ilkyaynmetin"/>
+              <w:spacing w:before="0" w:after="0" w:line="240" w:lineRule="auto"/>
+              <w:rPr>
+                <w:rFonts w:asciiTheme="majorBidi" w:hAnsiTheme="majorBidi" w:cstheme="majorBidi"/>
+                <w:b/>
+                <w:color w:val="231F20"/>
+                <w:sz w:val="16"/>
+                <w:szCs w:val="16"/>
+                <w:lang w:val="en-US"/>
+              </w:rPr>
+            </w:pPr>
+          </w:p>
+          <w:p>
+            <w:pPr>
+              <w:pStyle w:val="ilkyaynmetin"/>
+              <w:spacing w:before="0" w:after="0" w:line="240" w:lineRule="auto"/>
+              <w:rPr>
+                <w:rFonts w:asciiTheme="majorBidi" w:hAnsiTheme="majorBidi" w:cstheme="majorBidi"/>
+                <w:color w:val="231F20"/>
+                <w:sz w:val="18"/>
+                <w:szCs w:val="18"/>
+                <w:lang w:val="en-US"/>
+              </w:rPr>
+            </w:pPr>
+            <w:r>
+              <w:rPr>
+                <w:rFonts w:asciiTheme="majorBidi" w:hAnsiTheme="majorBidi" w:cstheme="majorBidi"/>
+                <w:b/>
+                <w:color w:val="231F20"/>
+                <w:sz w:val="18"/>
+                <w:szCs w:val="18"/>
+                <w:lang w:val="en-US"/>
+              </w:rPr>
+              <w:t>Theory and Methods:</w:t>
+            </w:r>
+            <w:r>
+              <w:rPr>
+                <w:rFonts w:asciiTheme="majorBidi" w:hAnsiTheme="majorBidi" w:cstheme="majorBidi"/>
+                <w:b/>
+                <w:color w:val="231F20"/>
+                <w:sz w:val="18"/>
+                <w:szCs w:val="18"/>
+                <w:lang w:val="en-US"/>
+              </w:rPr>
+              <w:t xml:space="preserve"> </w:t>
+            </w:r>
+            <w:r>
+              <w:rPr>
+                <w:rFonts w:asciiTheme="majorBidi" w:hAnsiTheme="majorBidi" w:cstheme="majorBidi"/>
+                <w:color w:val="231F20"/>
+                <w:sz w:val="18"/>
+                <w:szCs w:val="18"/>
+                <w:lang w:val="en-US"/>
+              </w:rPr>
+              <w:t xml:space="preserve">A 47-dimensional acoustic feature vector covering spectral, temporal, harmonic-tonal, MFCC and vocal families is extracted using </w:t>
+            </w:r>
+            <w:proofErr w:type="spellStart"/>
+            <w:r>
+              <w:rPr>
+                <w:rFonts w:asciiTheme="majorBidi" w:hAnsiTheme="majorBidi" w:cstheme="majorBidi"/>
+                <w:color w:val="231F20"/>
+                <w:sz w:val="18"/>
+                <w:szCs w:val="18"/>
+                <w:lang w:val="en-US"/>
+              </w:rPr>
+              <w:t>librosa</w:t>
+            </w:r>
+            <w:proofErr w:type="spellEnd"/>
+            <w:r>
+              <w:rPr>
+                <w:rFonts w:asciiTheme="majorBidi" w:hAnsiTheme="majorBidi" w:cstheme="majorBidi"/>
+                <w:color w:val="231F20"/>
+                <w:sz w:val="18"/>
+                <w:szCs w:val="18"/>
+                <w:lang w:val="en-US"/>
+              </w:rPr>
+              <w:t xml:space="preserve">. An ensemble of eleven classifiers (seven ML and four DL architectures) is trained on 5,195 samples from twelve AI generation systems and multiple human sources under stratified 5-fold cross-validation. Youden-J </w:t>
+            </w:r>
+            <w:proofErr w:type="spellStart"/>
+            <w:r>
+              <w:rPr>
+                <w:rFonts w:asciiTheme="majorBidi" w:hAnsiTheme="majorBidi" w:cstheme="majorBidi"/>
+                <w:color w:val="231F20"/>
+                <w:sz w:val="18"/>
+                <w:szCs w:val="18"/>
+                <w:lang w:val="en-US"/>
+              </w:rPr>
+              <w:t>optimisation</w:t>
+            </w:r>
+            <w:proofErr w:type="spellEnd"/>
+            <w:r>
+              <w:rPr>
+                <w:rFonts w:asciiTheme="majorBidi" w:hAnsiTheme="majorBidi" w:cstheme="majorBidi"/>
+                <w:color w:val="231F20"/>
+                <w:sz w:val="18"/>
+                <w:szCs w:val="18"/>
+                <w:lang w:val="en-US"/>
+              </w:rPr>
+              <w:t xml:space="preserve"> is used for threshold selection; SHAP analysis for interpretability.</w:t>
+            </w:r>
+          </w:p>
+          <w:p>
+            <w:pPr>
+              <w:pStyle w:val="ilkyaynmetin"/>
+              <w:spacing w:before="0" w:after="0" w:line="240" w:lineRule="auto"/>
+              <w:rPr>
+                <w:rFonts w:asciiTheme="majorBidi" w:hAnsiTheme="majorBidi" w:cstheme="majorBidi"/>
+                <w:b/>
+                <w:color w:val="231F20"/>
+                <w:sz w:val="16"/>
+                <w:szCs w:val="16"/>
+                <w:lang w:val="en-US"/>
+              </w:rPr>
+            </w:pPr>
+          </w:p>
+          <w:p>
+            <w:pPr>
+              <w:jc w:val="both"/>
+              <w:rPr>
+                <w:rFonts w:asciiTheme="majorBidi" w:eastAsia="Calibri" w:hAnsiTheme="majorBidi" w:cstheme="majorBidi"/>
+                <w:sz w:val="18"/>
+                <w:szCs w:val="18"/>
+                <w:lang w:val="en-US"/>
+              </w:rPr>
+            </w:pPr>
+            <w:r>
+              <w:rPr>
+                <w:rFonts w:asciiTheme="majorBidi" w:hAnsiTheme="majorBidi" w:cstheme="majorBidi"/>
+                <w:b/>
+                <w:color w:val="231F20"/>
+                <w:sz w:val="18"/>
+                <w:szCs w:val="18"/>
+                <w:lang w:val="en-US"/>
+              </w:rPr>
+              <w:t>Results:</w:t>
+            </w:r>
+            <w:r>
+              <w:rPr>
+                <w:rFonts w:asciiTheme="majorBidi" w:hAnsiTheme="majorBidi" w:cstheme="majorBidi"/>
+                <w:b/>
+                <w:color w:val="231F20"/>
+                <w:sz w:val="18"/>
+                <w:szCs w:val="18"/>
+                <w:lang w:val="en-US"/>
+              </w:rPr>
+              <w:t xml:space="preserve"> </w:t>
+            </w:r>
+            <w:proofErr w:type="spellStart"/>
+            <w:r>
+              <w:rPr>
+                <w:rFonts w:asciiTheme="majorBidi" w:eastAsia="Calibri" w:hAnsiTheme="majorBidi" w:cstheme="majorBidi"/>
+                <w:sz w:val="18"/>
+                <w:szCs w:val="18"/>
+                <w:lang w:val="en-US"/>
+              </w:rPr>
+              <w:t>LightGBM</w:t>
+            </w:r>
+            <w:proofErr w:type="spellEnd"/>
+            <w:r>
+              <w:rPr>
+                <w:rFonts w:asciiTheme="majorBidi" w:eastAsia="Calibri" w:hAnsiTheme="majorBidi" w:cstheme="majorBidi"/>
+                <w:sz w:val="18"/>
+                <w:szCs w:val="18"/>
+                <w:lang w:val="en-US"/>
+              </w:rPr>
+              <w:t xml:space="preserve"> achieves the highest mean ROC-AUC at 0.9548 with the lowest fold-to-fold standard deviation (±0.0023) in the entire pool. Deep MLP follows narrowly at 0.9542. Spectral-flatness standard deviation ranks first in feature importance. The Youden-optimal threshold θ* = 0.4316 yields a balanced confusion matrix with 89.4% AI sensitivity and 87.4% human specificity. A Brier score of 0.083 confirms well-calibrated probabilities.</w:t>
+            </w:r>
+          </w:p>
+          <w:p>
+            <w:pPr>
+              <w:jc w:val="both"/>
+              <w:rPr>
+                <w:rFonts w:asciiTheme="majorBidi" w:hAnsiTheme="majorBidi" w:cstheme="majorBidi"/>
+                <w:sz w:val="16"/>
+                <w:szCs w:val="16"/>
+                <w:lang w:val="en-US"/>
+              </w:rPr>
+            </w:pPr>
+          </w:p>
+          <w:p>
+            <w:pPr>
+              <w:jc w:val="both"/>
+              <w:rPr>
+                <w:rFonts w:asciiTheme="majorBidi" w:hAnsiTheme="majorBidi" w:cstheme="majorBidi"/>
+                <w:sz w:val="18"/>
+                <w:szCs w:val="18"/>
+                <w:shd w:val="clear" w:color="auto" w:fill="FFFFFF"/>
+                <w:lang w:val="en-US"/>
+              </w:rPr>
+            </w:pPr>
+            <w:r>
+              <w:rPr>
+                <w:rFonts w:asciiTheme="majorBidi" w:hAnsiTheme="majorBidi" w:cstheme="majorBidi"/>
+                <w:b/>
+                <w:color w:val="231F20"/>
+                <w:sz w:val="18"/>
+                <w:szCs w:val="18"/>
+                <w:lang w:val="en-US"/>
+              </w:rPr>
+              <w:t>Conclusion:</w:t>
+            </w:r>
+            <w:r>
+              <w:rPr>
+                <w:rFonts w:asciiTheme="majorBidi" w:hAnsiTheme="majorBidi" w:cstheme="majorBidi"/>
+                <w:b/>
+                <w:color w:val="231F20"/>
+                <w:sz w:val="18"/>
+                <w:szCs w:val="18"/>
+                <w:lang w:val="en-US"/>
+              </w:rPr>
+              <w:t xml:space="preserve"> </w:t>
+            </w:r>
+            <w:r>
+              <w:rPr>
+                <w:rFonts w:asciiTheme="majorBidi" w:hAnsiTheme="majorBidi" w:cstheme="majorBidi"/>
+                <w:sz w:val="18"/>
+                <w:szCs w:val="18"/>
+                <w:lang w:val="en-US"/>
+              </w:rPr>
+              <w:t>The proposed AURIS system demonstrates that a handcrafted feature vector combined with a heterogeneous ensemble is competitive with deep-learning alternatives for AI-generated music detection, while remaining interpretable and deployable on consumer hardware.</w:t>
             </w:r>
           </w:p>
         </w:tc>
       </w:tr>
       <w:tr>
         <w:trPr>
-          <w:trHeight w:val="193"/>
+          <w:trHeight w:val="259"/>
         </w:trPr>
         <w:tc>
           <w:tcPr>
@@ -716,12 +1274,28 @@
             </w:tcBorders>
           </w:tcPr>
           <w:p>
-            <w:r>
-              <w:rPr>
-                <w:rFonts w:ascii="Times New Roman" w:hAnsi="Times New Roman" w:cs="Times New Roman" w:eastAsia="Times New Roman"/>
+            <w:pPr>
+              <w:pStyle w:val="ListeParagraf"/>
+              <w:spacing w:line="238" w:lineRule="auto"/>
+              <w:ind w:left="0"/>
+              <w:jc w:val="both"/>
+              <w:rPr>
+                <w:rFonts w:asciiTheme="majorBidi" w:hAnsiTheme="majorBidi" w:cstheme="majorBidi"/>
                 <w:b/>
-                <w:i w:val="0"/>
-                <w:sz w:val="18"/>
+                <w:sz w:val="18"/>
+                <w:szCs w:val="18"/>
+                <w:shd w:val="clear" w:color="auto" w:fill="FFFFFF"/>
+                <w:lang w:val="en-US"/>
+              </w:rPr>
+            </w:pPr>
+            <w:r>
+              <w:rPr>
+                <w:rFonts w:asciiTheme="majorBidi" w:hAnsiTheme="majorBidi" w:cstheme="majorBidi"/>
+                <w:b/>
+                <w:bCs/>
+                <w:sz w:val="18"/>
+                <w:szCs w:val="18"/>
+                <w:lang w:val="en-US"/>
               </w:rPr>
               <w:t>Keywords:</w:t>
             </w:r>
@@ -729,7 +1303,7 @@
         </w:tc>
         <w:tc>
           <w:tcPr>
-            <w:tcW w:w="283" w:type="dxa"/>
+            <w:tcW w:w="23" w:type="dxa"/>
             <w:tcBorders>
               <w:left w:val="nil"/>
             </w:tcBorders>
@@ -751,7 +1325,7 @@
         </w:tc>
         <w:tc>
           <w:tcPr>
-            <w:tcW w:w="7734" w:type="dxa"/>
+            <w:tcW w:w="7994" w:type="dxa"/>
             <w:vMerge/>
           </w:tcPr>
           <w:p>
@@ -780,59 +1354,166 @@
             </w:tcBorders>
           </w:tcPr>
           <w:p>
-            <w:r>
-              <w:rPr>
-                <w:rFonts w:ascii="Times New Roman" w:hAnsi="Times New Roman" w:cs="Times New Roman" w:eastAsia="Times New Roman"/>
-                <w:b w:val="0"/>
-                <w:sz w:val="18"/>
+            <w:pPr>
+              <w:pStyle w:val="ListeParagraf"/>
+              <w:numPr>
+                <w:ilvl w:val="0"/>
+                <w:numId w:val="19"/>
+              </w:numPr>
+              <w:spacing w:line="238" w:lineRule="auto"/>
+              <w:ind w:left="170" w:right="113" w:hanging="170"/>
+              <w:jc w:val="both"/>
+              <w:rPr>
+                <w:rFonts w:asciiTheme="majorBidi" w:hAnsiTheme="majorBidi" w:cstheme="majorBidi"/>
+                <w:sz w:val="18"/>
+                <w:szCs w:val="18"/>
+                <w:shd w:val="clear" w:color="auto" w:fill="FFFFFF"/>
+                <w:lang w:val="en-US"/>
+              </w:rPr>
+            </w:pPr>
+            <w:r>
+              <w:rPr>
+                <w:rFonts w:asciiTheme="majorBidi" w:hAnsiTheme="majorBidi" w:cstheme="majorBidi"/>
+                <w:sz w:val="18"/>
+                <w:szCs w:val="18"/>
+                <w:shd w:val="clear" w:color="auto" w:fill="FFFFFF"/>
+                <w:lang w:val="en-US"/>
               </w:rPr>
               <w:t>AI-generated music</w:t>
             </w:r>
           </w:p>
           <w:p>
-            <w:r>
-              <w:rPr>
-                <w:rFonts w:ascii="Times New Roman" w:hAnsi="Times New Roman" w:cs="Times New Roman" w:eastAsia="Times New Roman"/>
-                <w:b w:val="0"/>
-                <w:sz w:val="18"/>
+            <w:pPr>
+              <w:pStyle w:val="ListeParagraf"/>
+              <w:numPr>
+                <w:ilvl w:val="0"/>
+                <w:numId w:val="19"/>
+              </w:numPr>
+              <w:spacing w:line="238" w:lineRule="auto"/>
+              <w:ind w:left="170" w:right="113" w:hanging="170"/>
+              <w:jc w:val="both"/>
+              <w:rPr>
+                <w:rFonts w:asciiTheme="majorBidi" w:hAnsiTheme="majorBidi" w:cstheme="majorBidi"/>
+                <w:sz w:val="18"/>
+                <w:szCs w:val="18"/>
+                <w:shd w:val="clear" w:color="auto" w:fill="FFFFFF"/>
+                <w:lang w:val="en-US"/>
+              </w:rPr>
+            </w:pPr>
+            <w:r>
+              <w:rPr>
+                <w:rFonts w:asciiTheme="majorBidi" w:hAnsiTheme="majorBidi" w:cstheme="majorBidi"/>
+                <w:bCs/>
+                <w:sz w:val="18"/>
+                <w:szCs w:val="18"/>
+                <w:lang w:val="en-US"/>
+              </w:rPr>
+              <w:t>Spectral flatness</w:t>
+            </w:r>
+          </w:p>
+          <w:p>
+            <w:pPr>
+              <w:pStyle w:val="ListeParagraf"/>
+              <w:numPr>
+                <w:ilvl w:val="0"/>
+                <w:numId w:val="19"/>
+              </w:numPr>
+              <w:spacing w:line="238" w:lineRule="auto"/>
+              <w:ind w:left="170" w:right="113" w:hanging="170"/>
+              <w:jc w:val="both"/>
+              <w:rPr>
+                <w:rFonts w:asciiTheme="majorBidi" w:hAnsiTheme="majorBidi" w:cstheme="majorBidi"/>
+                <w:sz w:val="18"/>
+                <w:szCs w:val="18"/>
+                <w:shd w:val="clear" w:color="auto" w:fill="FFFFFF"/>
+                <w:lang w:val="en-US"/>
+              </w:rPr>
+            </w:pPr>
+            <w:r>
+              <w:rPr>
+                <w:rFonts w:asciiTheme="majorBidi" w:hAnsiTheme="majorBidi" w:cstheme="majorBidi"/>
+                <w:bCs/>
+                <w:sz w:val="18"/>
+                <w:szCs w:val="18"/>
+                <w:lang w:val="en-US"/>
+              </w:rPr>
+              <w:t xml:space="preserve">Ensemble </w:t>
+            </w:r>
+            <w:proofErr w:type="gramStart"/>
+            <w:r>
+              <w:rPr>
+                <w:rFonts w:asciiTheme="majorBidi" w:hAnsiTheme="majorBidi" w:cstheme="majorBidi"/>
+                <w:bCs/>
+                <w:sz w:val="18"/>
+                <w:szCs w:val="18"/>
+                <w:lang w:val="en-US"/>
+              </w:rPr>
+              <w:t>learning</w:t>
+            </w:r>
+            <w:proofErr w:type="gramEnd"/>
+          </w:p>
+          <w:p>
+            <w:pPr>
+              <w:pStyle w:val="ListeParagraf"/>
+              <w:numPr>
+                <w:ilvl w:val="0"/>
+                <w:numId w:val="19"/>
+              </w:numPr>
+              <w:spacing w:line="238" w:lineRule="auto"/>
+              <w:ind w:left="170" w:right="113" w:hanging="170"/>
+              <w:jc w:val="both"/>
+              <w:rPr>
+                <w:rFonts w:asciiTheme="majorBidi" w:hAnsiTheme="majorBidi" w:cstheme="majorBidi"/>
+                <w:sz w:val="18"/>
+                <w:szCs w:val="18"/>
+                <w:shd w:val="clear" w:color="auto" w:fill="FFFFFF"/>
+                <w:lang w:val="en-US"/>
+              </w:rPr>
+            </w:pPr>
+            <w:r>
+              <w:rPr>
+                <w:rFonts w:asciiTheme="majorBidi" w:hAnsiTheme="majorBidi" w:cstheme="majorBidi"/>
+                <w:bCs/>
+                <w:sz w:val="18"/>
+                <w:szCs w:val="18"/>
+                <w:lang w:val="en-US"/>
+              </w:rPr>
+              <w:t>Gradient boosting</w:t>
+            </w:r>
+          </w:p>
+          <w:p>
+            <w:pPr>
+              <w:pStyle w:val="ListeParagraf"/>
+              <w:numPr>
+                <w:ilvl w:val="0"/>
+                <w:numId w:val="19"/>
+              </w:numPr>
+              <w:spacing w:line="238" w:lineRule="auto"/>
+              <w:ind w:left="170" w:right="113" w:hanging="170"/>
+              <w:jc w:val="both"/>
+              <w:rPr>
+                <w:rFonts w:asciiTheme="majorBidi" w:hAnsiTheme="majorBidi" w:cstheme="majorBidi"/>
+                <w:sz w:val="18"/>
+                <w:szCs w:val="18"/>
+                <w:shd w:val="clear" w:color="auto" w:fill="FFFFFF"/>
+                <w:lang w:val="en-US"/>
+              </w:rPr>
+            </w:pPr>
+            <w:r>
+              <w:rPr>
+                <w:rFonts w:asciiTheme="majorBidi" w:hAnsiTheme="majorBidi" w:cstheme="majorBidi"/>
+                <w:sz w:val="18"/>
+                <w:szCs w:val="18"/>
+                <w:shd w:val="clear" w:color="auto" w:fill="FFFFFF"/>
+                <w:lang w:val="en-US"/>
               </w:rPr>
               <w:t>Deep learning</w:t>
-            </w:r>
-          </w:p>
-          <w:p>
-            <w:r>
-              <w:rPr>
-                <w:rFonts w:ascii="Times New Roman" w:hAnsi="Times New Roman" w:cs="Times New Roman" w:eastAsia="Times New Roman"/>
-                <w:b w:val="0"/>
-                <w:sz w:val="18"/>
-              </w:rPr>
-              <w:t>Gradient boosting</w:t>
-            </w:r>
-          </w:p>
-          <w:p>
-            <w:r>
-              <w:rPr>
-                <w:rFonts w:ascii="Times New Roman" w:hAnsi="Times New Roman" w:cs="Times New Roman" w:eastAsia="Times New Roman"/>
-                <w:b w:val="0"/>
-                <w:sz w:val="18"/>
-              </w:rPr>
-              <w:t>Ensemble learning</w:t>
-            </w:r>
-          </w:p>
-          <w:p>
-            <w:r>
-              <w:rPr>
-                <w:rFonts w:ascii="Times New Roman" w:hAnsi="Times New Roman" w:cs="Times New Roman" w:eastAsia="Times New Roman"/>
-                <w:b w:val="0"/>
-                <w:sz w:val="18"/>
-              </w:rPr>
-              <w:t>Spectral flatness</w:t>
             </w:r>
           </w:p>
         </w:tc>
         <w:tc>
           <w:tcPr>
-            <w:tcW w:w="283" w:type="dxa"/>
+            <w:tcW w:w="23" w:type="dxa"/>
             <w:tcBorders>
               <w:left w:val="nil"/>
             </w:tcBorders>
@@ -854,7 +1535,7 @@
         </w:tc>
         <w:tc>
           <w:tcPr>
-            <w:tcW w:w="7734" w:type="dxa"/>
+            <w:tcW w:w="7994" w:type="dxa"/>
             <w:vMerge/>
           </w:tcPr>
           <w:p>
@@ -880,12 +1561,24 @@
             </w:tcBorders>
           </w:tcPr>
           <w:p>
-            <w:r>
-              <w:rPr>
-                <w:rFonts w:ascii="Times New Roman" w:hAnsi="Times New Roman" w:cs="Times New Roman" w:eastAsia="Times New Roman"/>
+            <w:pPr>
+              <w:pStyle w:val="ilkyaynmetin"/>
+              <w:spacing w:before="0" w:after="0" w:line="238" w:lineRule="auto"/>
+              <w:rPr>
+                <w:rFonts w:asciiTheme="majorBidi" w:hAnsiTheme="majorBidi" w:cstheme="majorBidi"/>
                 <w:b/>
-                <w:i w:val="0"/>
-                <w:sz w:val="18"/>
+                <w:sz w:val="18"/>
+                <w:szCs w:val="18"/>
+                <w:lang w:val="en-US"/>
+              </w:rPr>
+            </w:pPr>
+            <w:r>
+              <w:rPr>
+                <w:rFonts w:asciiTheme="majorBidi" w:hAnsiTheme="majorBidi" w:cstheme="majorBidi"/>
+                <w:b/>
+                <w:sz w:val="18"/>
+                <w:szCs w:val="18"/>
+                <w:lang w:val="en-US"/>
               </w:rPr>
               <w:t>Article Info:</w:t>
             </w:r>
@@ -893,7 +1586,7 @@
         </w:tc>
         <w:tc>
           <w:tcPr>
-            <w:tcW w:w="283" w:type="dxa"/>
+            <w:tcW w:w="23" w:type="dxa"/>
           </w:tcPr>
           <w:p>
             <w:pPr>
@@ -910,7 +1603,7 @@
         </w:tc>
         <w:tc>
           <w:tcPr>
-            <w:tcW w:w="7734" w:type="dxa"/>
+            <w:tcW w:w="7994" w:type="dxa"/>
             <w:vMerge/>
           </w:tcPr>
           <w:p>
@@ -937,58 +1630,126 @@
             </w:tcBorders>
           </w:tcPr>
           <w:p>
-            <w:r>
-              <w:rPr>
-                <w:rFonts w:ascii="Times New Roman" w:hAnsi="Times New Roman" w:cs="Times New Roman" w:eastAsia="Times New Roman"/>
-                <w:b w:val="0"/>
-                <w:sz w:val="18"/>
-              </w:rPr>
-              <w:t>Research Article</w:t>
-            </w:r>
-          </w:p>
-          <w:p>
-            <w:r>
-              <w:rPr>
-                <w:rFonts w:ascii="Times New Roman" w:hAnsi="Times New Roman" w:cs="Times New Roman" w:eastAsia="Times New Roman"/>
-                <w:b w:val="0"/>
-                <w:sz w:val="18"/>
-              </w:rPr>
-              <w:t>Received: dd.mm.yyyy</w:t>
-            </w:r>
-          </w:p>
-          <w:p>
-            <w:r>
-              <w:rPr>
-                <w:rFonts w:ascii="Times New Roman" w:hAnsi="Times New Roman" w:cs="Times New Roman" w:eastAsia="Times New Roman"/>
-                <w:b w:val="0"/>
-                <w:sz w:val="18"/>
-              </w:rPr>
-              <w:t>Accepted: dd.mm.yyyy</w:t>
-            </w:r>
-          </w:p>
-          <w:p>
-            <w:r>
-              <w:rPr>
-                <w:rFonts w:ascii="Times New Roman" w:hAnsi="Times New Roman" w:cs="Times New Roman" w:eastAsia="Times New Roman"/>
-                <w:b w:val="0"/>
-                <w:sz w:val="18"/>
-              </w:rPr>
-            </w:r>
-          </w:p>
-          <w:p>
-            <w:r>
-              <w:rPr>
-                <w:rFonts w:ascii="Times New Roman" w:hAnsi="Times New Roman" w:cs="Times New Roman" w:eastAsia="Times New Roman"/>
-                <w:b w:val="0"/>
-                <w:sz w:val="18"/>
-              </w:rPr>
-              <w:t>DOI:</w:t>
+            <w:pPr>
+              <w:autoSpaceDE w:val="0"/>
+              <w:autoSpaceDN w:val="0"/>
+              <w:adjustRightInd w:val="0"/>
+              <w:spacing w:line="238" w:lineRule="auto"/>
+              <w:rPr>
+                <w:rFonts w:asciiTheme="majorBidi" w:eastAsia="TimesNewRomanPSMT" w:hAnsiTheme="majorBidi" w:cstheme="majorBidi"/>
+                <w:sz w:val="18"/>
+                <w:szCs w:val="18"/>
+                <w:lang w:val="en-US"/>
+              </w:rPr>
+            </w:pPr>
+            <w:r>
+              <w:rPr>
+                <w:rFonts w:asciiTheme="majorBidi" w:eastAsia="TimesNewRomanPSMT" w:hAnsiTheme="majorBidi" w:cstheme="majorBidi"/>
+                <w:sz w:val="18"/>
+                <w:szCs w:val="18"/>
+                <w:lang w:val="en-US"/>
+              </w:rPr>
+              <w:t xml:space="preserve">Received: </w:t>
+            </w:r>
+            <w:proofErr w:type="spellStart"/>
+            <w:proofErr w:type="gramStart"/>
+            <w:r>
+              <w:rPr>
+                <w:rFonts w:asciiTheme="majorBidi" w:eastAsia="TimesNewRomanPSMT" w:hAnsiTheme="majorBidi" w:cstheme="majorBidi"/>
+                <w:sz w:val="18"/>
+                <w:szCs w:val="18"/>
+                <w:lang w:val="en-US"/>
+              </w:rPr>
+              <w:t>dd.mm.yy</w:t>
+            </w:r>
+            <w:proofErr w:type="spellEnd"/>
+            <w:proofErr w:type="gramEnd"/>
+          </w:p>
+          <w:p>
+            <w:pPr>
+              <w:pStyle w:val="stbilgi1"/>
+              <w:tabs>
+                <w:tab w:val="clear" w:pos="4536"/>
+              </w:tabs>
+              <w:spacing w:line="238" w:lineRule="auto"/>
+              <w:jc w:val="both"/>
+              <w:rPr>
+                <w:rFonts w:asciiTheme="majorBidi" w:hAnsiTheme="majorBidi" w:cstheme="majorBidi"/>
+                <w:sz w:val="18"/>
+                <w:szCs w:val="18"/>
+                <w:lang w:val="en-US"/>
+              </w:rPr>
+            </w:pPr>
+            <w:r>
+              <w:rPr>
+                <w:rFonts w:asciiTheme="majorBidi" w:eastAsia="TimesNewRomanPSMT" w:hAnsiTheme="majorBidi" w:cstheme="majorBidi"/>
+                <w:sz w:val="18"/>
+                <w:szCs w:val="18"/>
+                <w:lang w:val="en-US"/>
+              </w:rPr>
+              <w:t xml:space="preserve">Accepted: </w:t>
+            </w:r>
+            <w:proofErr w:type="spellStart"/>
+            <w:proofErr w:type="gramStart"/>
+            <w:r>
+              <w:rPr>
+                <w:rFonts w:asciiTheme="majorBidi" w:eastAsia="TimesNewRomanPSMT" w:hAnsiTheme="majorBidi" w:cstheme="majorBidi"/>
+                <w:sz w:val="18"/>
+                <w:szCs w:val="18"/>
+                <w:lang w:val="en-US"/>
+              </w:rPr>
+              <w:t>dd.mm.yy</w:t>
+            </w:r>
+            <w:proofErr w:type="spellEnd"/>
+            <w:proofErr w:type="gramEnd"/>
+          </w:p>
+          <w:p>
+            <w:pPr>
+              <w:pStyle w:val="stbilgi1"/>
+              <w:tabs>
+                <w:tab w:val="clear" w:pos="4536"/>
+              </w:tabs>
+              <w:spacing w:line="238" w:lineRule="auto"/>
+              <w:jc w:val="both"/>
+              <w:rPr>
+                <w:rFonts w:asciiTheme="majorBidi" w:hAnsiTheme="majorBidi" w:cstheme="majorBidi"/>
+                <w:sz w:val="18"/>
+                <w:szCs w:val="18"/>
+                <w:lang w:val="en-US"/>
+              </w:rPr>
+            </w:pPr>
+          </w:p>
+          <w:p>
+            <w:pPr>
+              <w:pStyle w:val="stbilgi1"/>
+              <w:tabs>
+                <w:tab w:val="clear" w:pos="4536"/>
+              </w:tabs>
+              <w:spacing w:line="238" w:lineRule="auto"/>
+              <w:jc w:val="both"/>
+              <w:rPr>
+                <w:rFonts w:asciiTheme="majorBidi" w:hAnsiTheme="majorBidi" w:cstheme="majorBidi"/>
+                <w:b/>
+                <w:sz w:val="18"/>
+                <w:szCs w:val="18"/>
+                <w:lang w:val="en-US"/>
+              </w:rPr>
+            </w:pPr>
+            <w:r>
+              <w:rPr>
+                <w:rFonts w:asciiTheme="majorBidi" w:hAnsiTheme="majorBidi" w:cstheme="majorBidi"/>
+                <w:b/>
+                <w:sz w:val="18"/>
+                <w:szCs w:val="18"/>
+                <w:lang w:val="en-US"/>
+              </w:rPr>
+              <w:t xml:space="preserve">DOI: </w:t>
             </w:r>
           </w:p>
         </w:tc>
         <w:tc>
           <w:tcPr>
-            <w:tcW w:w="283" w:type="dxa"/>
+            <w:tcW w:w="23" w:type="dxa"/>
           </w:tcPr>
           <w:p>
             <w:pPr>
@@ -1005,7 +1766,7 @@
         </w:tc>
         <w:tc>
           <w:tcPr>
-            <w:tcW w:w="7734" w:type="dxa"/>
+            <w:tcW w:w="7994" w:type="dxa"/>
             <w:vMerge/>
           </w:tcPr>
           <w:p>
@@ -1030,19 +1791,20 @@
             </w:tcBorders>
           </w:tcPr>
           <w:p>
-            <w:r>
-              <w:rPr>
-                <w:rFonts w:ascii="Times New Roman" w:hAnsi="Times New Roman" w:cs="Times New Roman" w:eastAsia="Times New Roman"/>
-                <w:b w:val="0"/>
-                <w:i w:val="0"/>
-                <w:sz w:val="18"/>
-              </w:rPr>
-            </w:r>
+            <w:pPr>
+              <w:spacing w:line="238" w:lineRule="auto"/>
+              <w:rPr>
+                <w:rFonts w:asciiTheme="majorBidi" w:hAnsiTheme="majorBidi" w:cstheme="majorBidi"/>
+                <w:sz w:val="18"/>
+                <w:szCs w:val="18"/>
+              </w:rPr>
+            </w:pPr>
+            <w:hyperlink r:id="rId13" w:history="1"/>
           </w:p>
         </w:tc>
         <w:tc>
           <w:tcPr>
-            <w:tcW w:w="283" w:type="dxa"/>
+            <w:tcW w:w="23" w:type="dxa"/>
           </w:tcPr>
           <w:p>
             <w:pPr>
@@ -1059,7 +1821,7 @@
         </w:tc>
         <w:tc>
           <w:tcPr>
-            <w:tcW w:w="7734" w:type="dxa"/>
+            <w:tcW w:w="7994" w:type="dxa"/>
             <w:vMerge/>
           </w:tcPr>
           <w:p>
@@ -1082,19 +1844,23 @@
             <w:tcW w:w="2127" w:type="dxa"/>
           </w:tcPr>
           <w:p>
-            <w:r>
-              <w:rPr>
-                <w:rFonts w:ascii="Times New Roman" w:hAnsi="Times New Roman" w:cs="Times New Roman" w:eastAsia="Times New Roman"/>
-                <w:b w:val="0"/>
-                <w:i w:val="0"/>
-                <w:sz w:val="18"/>
-              </w:rPr>
-            </w:r>
+            <w:pPr>
+              <w:autoSpaceDE w:val="0"/>
+              <w:autoSpaceDN w:val="0"/>
+              <w:adjustRightInd w:val="0"/>
+              <w:spacing w:line="238" w:lineRule="auto"/>
+              <w:rPr>
+                <w:rFonts w:asciiTheme="majorBidi" w:eastAsia="TimesNewRomanPSMT" w:hAnsiTheme="majorBidi" w:cstheme="majorBidi"/>
+                <w:sz w:val="18"/>
+                <w:szCs w:val="18"/>
+                <w:lang w:val="en-US"/>
+              </w:rPr>
+            </w:pPr>
           </w:p>
         </w:tc>
         <w:tc>
           <w:tcPr>
-            <w:tcW w:w="283" w:type="dxa"/>
+            <w:tcW w:w="23" w:type="dxa"/>
           </w:tcPr>
           <w:p>
             <w:pPr>
@@ -1111,7 +1877,7 @@
         </w:tc>
         <w:tc>
           <w:tcPr>
-            <w:tcW w:w="7734" w:type="dxa"/>
+            <w:tcW w:w="7994" w:type="dxa"/>
             <w:vMerge/>
           </w:tcPr>
           <w:p>
@@ -1137,12 +1903,26 @@
             </w:tcBorders>
           </w:tcPr>
           <w:p>
-            <w:r>
-              <w:rPr>
-                <w:rFonts w:ascii="Times New Roman" w:hAnsi="Times New Roman" w:cs="Times New Roman" w:eastAsia="Times New Roman"/>
+            <w:pPr>
+              <w:autoSpaceDE w:val="0"/>
+              <w:autoSpaceDN w:val="0"/>
+              <w:adjustRightInd w:val="0"/>
+              <w:spacing w:line="238" w:lineRule="auto"/>
+              <w:rPr>
+                <w:rFonts w:asciiTheme="majorBidi" w:eastAsia="TimesNewRomanPSMT" w:hAnsiTheme="majorBidi" w:cstheme="majorBidi"/>
                 <w:b/>
-                <w:i w:val="0"/>
-                <w:sz w:val="18"/>
+                <w:sz w:val="18"/>
+                <w:szCs w:val="18"/>
+                <w:lang w:val="en-US"/>
+              </w:rPr>
+            </w:pPr>
+            <w:r>
+              <w:rPr>
+                <w:rFonts w:asciiTheme="majorBidi" w:hAnsiTheme="majorBidi" w:cstheme="majorBidi"/>
+                <w:b/>
+                <w:sz w:val="18"/>
+                <w:szCs w:val="18"/>
+                <w:lang w:val="en-US"/>
               </w:rPr>
               <w:t>Acknowledgement:</w:t>
             </w:r>
@@ -1150,7 +1930,7 @@
         </w:tc>
         <w:tc>
           <w:tcPr>
-            <w:tcW w:w="283" w:type="dxa"/>
+            <w:tcW w:w="23" w:type="dxa"/>
           </w:tcPr>
           <w:p>
             <w:pPr>
@@ -1167,7 +1947,7 @@
         </w:tc>
         <w:tc>
           <w:tcPr>
-            <w:tcW w:w="7734" w:type="dxa"/>
+            <w:tcW w:w="7994" w:type="dxa"/>
             <w:vMerge/>
           </w:tcPr>
           <w:p>
@@ -1193,20 +1973,23 @@
             </w:tcBorders>
           </w:tcPr>
           <w:p>
-            <w:r>
-              <w:rPr>
-                <w:rFonts w:ascii="Times New Roman" w:hAnsi="Times New Roman" w:cs="Times New Roman" w:eastAsia="Times New Roman"/>
-                <w:b w:val="0"/>
-                <w:i w:val="0"/>
-                <w:sz w:val="18"/>
-              </w:rPr>
-              <w:t>—</w:t>
-            </w:r>
+            <w:pPr>
+              <w:autoSpaceDE w:val="0"/>
+              <w:autoSpaceDN w:val="0"/>
+              <w:adjustRightInd w:val="0"/>
+              <w:spacing w:line="238" w:lineRule="auto"/>
+              <w:rPr>
+                <w:rFonts w:asciiTheme="majorBidi" w:hAnsiTheme="majorBidi" w:cstheme="majorBidi"/>
+                <w:sz w:val="18"/>
+                <w:szCs w:val="18"/>
+                <w:lang w:val="en-US"/>
+              </w:rPr>
+            </w:pPr>
           </w:p>
         </w:tc>
         <w:tc>
           <w:tcPr>
-            <w:tcW w:w="283" w:type="dxa"/>
+            <w:tcW w:w="23" w:type="dxa"/>
           </w:tcPr>
           <w:p>
             <w:pPr>
@@ -1223,7 +2006,7 @@
         </w:tc>
         <w:tc>
           <w:tcPr>
-            <w:tcW w:w="7734" w:type="dxa"/>
+            <w:tcW w:w="7994" w:type="dxa"/>
             <w:vMerge/>
           </w:tcPr>
           <w:p>
@@ -1246,19 +2029,23 @@
             <w:tcW w:w="2127" w:type="dxa"/>
           </w:tcPr>
           <w:p>
-            <w:r>
-              <w:rPr>
-                <w:rFonts w:ascii="Times New Roman" w:hAnsi="Times New Roman" w:cs="Times New Roman" w:eastAsia="Times New Roman"/>
-                <w:b w:val="0"/>
-                <w:i w:val="0"/>
-                <w:sz w:val="18"/>
-              </w:rPr>
-            </w:r>
+            <w:pPr>
+              <w:autoSpaceDE w:val="0"/>
+              <w:autoSpaceDN w:val="0"/>
+              <w:adjustRightInd w:val="0"/>
+              <w:spacing w:line="238" w:lineRule="auto"/>
+              <w:rPr>
+                <w:rFonts w:asciiTheme="majorBidi" w:eastAsia="TimesNewRomanPSMT" w:hAnsiTheme="majorBidi" w:cstheme="majorBidi"/>
+                <w:sz w:val="18"/>
+                <w:szCs w:val="18"/>
+                <w:lang w:val="en-US"/>
+              </w:rPr>
+            </w:pPr>
           </w:p>
         </w:tc>
         <w:tc>
           <w:tcPr>
-            <w:tcW w:w="283" w:type="dxa"/>
+            <w:tcW w:w="23" w:type="dxa"/>
           </w:tcPr>
           <w:p>
             <w:pPr>
@@ -1275,7 +2062,7 @@
         </w:tc>
         <w:tc>
           <w:tcPr>
-            <w:tcW w:w="7734" w:type="dxa"/>
+            <w:tcW w:w="7994" w:type="dxa"/>
             <w:vMerge/>
           </w:tcPr>
           <w:p>
@@ -1301,12 +2088,26 @@
             </w:tcBorders>
           </w:tcPr>
           <w:p>
-            <w:r>
-              <w:rPr>
-                <w:rFonts w:ascii="Times New Roman" w:hAnsi="Times New Roman" w:cs="Times New Roman" w:eastAsia="Times New Roman"/>
+            <w:pPr>
+              <w:autoSpaceDE w:val="0"/>
+              <w:autoSpaceDN w:val="0"/>
+              <w:adjustRightInd w:val="0"/>
+              <w:spacing w:line="238" w:lineRule="auto"/>
+              <w:rPr>
+                <w:rFonts w:asciiTheme="majorBidi" w:eastAsia="TimesNewRomanPSMT" w:hAnsiTheme="majorBidi" w:cstheme="majorBidi"/>
                 <w:b/>
-                <w:i w:val="0"/>
-                <w:sz w:val="18"/>
+                <w:sz w:val="18"/>
+                <w:szCs w:val="18"/>
+                <w:lang w:val="en-US"/>
+              </w:rPr>
+            </w:pPr>
+            <w:r>
+              <w:rPr>
+                <w:rFonts w:asciiTheme="majorBidi" w:hAnsiTheme="majorBidi" w:cstheme="majorBidi"/>
+                <w:b/>
+                <w:sz w:val="18"/>
+                <w:szCs w:val="18"/>
+                <w:lang w:val="en-US"/>
               </w:rPr>
               <w:t>Correspondence:</w:t>
             </w:r>
@@ -1314,7 +2115,7 @@
         </w:tc>
         <w:tc>
           <w:tcPr>
-            <w:tcW w:w="283" w:type="dxa"/>
+            <w:tcW w:w="23" w:type="dxa"/>
           </w:tcPr>
           <w:p>
             <w:pPr>
@@ -1331,7 +2132,7 @@
         </w:tc>
         <w:tc>
           <w:tcPr>
-            <w:tcW w:w="7734" w:type="dxa"/>
+            <w:tcW w:w="7994" w:type="dxa"/>
             <w:vMerge/>
           </w:tcPr>
           <w:p>
@@ -1357,39 +2158,87 @@
             </w:tcBorders>
           </w:tcPr>
           <w:p>
-            <w:r>
-              <w:rPr>
-                <w:rFonts w:ascii="Times New Roman" w:hAnsi="Times New Roman" w:cs="Times New Roman" w:eastAsia="Times New Roman"/>
-                <w:b w:val="0"/>
-                <w:sz w:val="18"/>
-              </w:rPr>
-              <w:t>Author: Hasan Arthur Altuntaş</w:t>
-            </w:r>
-          </w:p>
-          <w:p>
-            <w:r>
-              <w:rPr>
-                <w:rFonts w:ascii="Times New Roman" w:hAnsi="Times New Roman" w:cs="Times New Roman" w:eastAsia="Times New Roman"/>
-                <w:b w:val="0"/>
-                <w:sz w:val="18"/>
-              </w:rPr>
-              <w:t>e-mail: hasannarthurrr@gmail.com</w:t>
-            </w:r>
-          </w:p>
-          <w:p>
-            <w:r>
-              <w:rPr>
-                <w:rFonts w:ascii="Times New Roman" w:hAnsi="Times New Roman" w:cs="Times New Roman" w:eastAsia="Times New Roman"/>
-                <w:b w:val="0"/>
-                <w:sz w:val="18"/>
-              </w:rPr>
-              <w:t>ORCID: 0009-0002-8302-7657</w:t>
+            <w:pPr>
+              <w:autoSpaceDE w:val="0"/>
+              <w:autoSpaceDN w:val="0"/>
+              <w:adjustRightInd w:val="0"/>
+              <w:spacing w:line="238" w:lineRule="auto"/>
+              <w:rPr>
+                <w:rFonts w:asciiTheme="majorBidi" w:eastAsia="TimesNewRomanPSMT" w:hAnsiTheme="majorBidi" w:cstheme="majorBidi"/>
+                <w:sz w:val="18"/>
+                <w:szCs w:val="18"/>
+                <w:lang w:val="en-US"/>
+              </w:rPr>
+            </w:pPr>
+            <w:r>
+              <w:rPr>
+                <w:rFonts w:asciiTheme="majorBidi" w:eastAsia="TimesNewRomanPSMT" w:hAnsiTheme="majorBidi" w:cstheme="majorBidi"/>
+                <w:sz w:val="18"/>
+                <w:szCs w:val="18"/>
+                <w:lang w:val="en-US"/>
+              </w:rPr>
+              <w:t>Author:</w:t>
+            </w:r>
+          </w:p>
+          <w:p>
+            <w:pPr>
+              <w:autoSpaceDE w:val="0"/>
+              <w:autoSpaceDN w:val="0"/>
+              <w:adjustRightInd w:val="0"/>
+              <w:spacing w:line="238" w:lineRule="auto"/>
+              <w:rPr>
+                <w:rFonts w:asciiTheme="majorBidi" w:eastAsia="TimesNewRomanPSMT" w:hAnsiTheme="majorBidi" w:cstheme="majorBidi"/>
+                <w:sz w:val="18"/>
+                <w:szCs w:val="18"/>
+                <w:lang w:val="en-US"/>
+              </w:rPr>
+            </w:pPr>
+            <w:r>
+              <w:rPr>
+                <w:rFonts w:asciiTheme="majorBidi" w:eastAsia="TimesNewRomanPSMT" w:hAnsiTheme="majorBidi" w:cstheme="majorBidi"/>
+                <w:sz w:val="18"/>
+                <w:szCs w:val="18"/>
+                <w:lang w:val="en-US"/>
+              </w:rPr>
+              <w:t xml:space="preserve">e-mail: </w:t>
+            </w:r>
+          </w:p>
+          <w:p>
+            <w:pPr>
+              <w:autoSpaceDE w:val="0"/>
+              <w:autoSpaceDN w:val="0"/>
+              <w:adjustRightInd w:val="0"/>
+              <w:spacing w:line="238" w:lineRule="auto"/>
+              <w:rPr>
+                <w:rFonts w:asciiTheme="majorBidi" w:eastAsia="TimesNewRomanPSMT" w:hAnsiTheme="majorBidi" w:cstheme="majorBidi"/>
+                <w:sz w:val="18"/>
+                <w:szCs w:val="18"/>
+                <w:lang w:val="en-US"/>
+              </w:rPr>
+            </w:pPr>
+            <w:r>
+              <w:rPr>
+                <w:rFonts w:asciiTheme="majorBidi" w:eastAsia="TimesNewRomanPSMT" w:hAnsiTheme="majorBidi" w:cstheme="majorBidi"/>
+                <w:sz w:val="18"/>
+                <w:szCs w:val="18"/>
+                <w:lang w:val="en-US"/>
+              </w:rPr>
+              <w:t>phone:</w:t>
+            </w:r>
+            <w:r>
+              <w:rPr>
+                <w:rFonts w:asciiTheme="majorBidi" w:eastAsia="TimesNewRomanPSMT" w:hAnsiTheme="majorBidi" w:cstheme="majorBidi"/>
+                <w:sz w:val="18"/>
+                <w:szCs w:val="18"/>
+                <w:lang w:val="en-US"/>
+              </w:rPr>
+              <w:t xml:space="preserve"> </w:t>
             </w:r>
           </w:p>
         </w:tc>
         <w:tc>
           <w:tcPr>
-            <w:tcW w:w="283" w:type="dxa"/>
+            <w:tcW w:w="23" w:type="dxa"/>
           </w:tcPr>
           <w:p>
             <w:pPr>
@@ -1406,7 +2255,7 @@
         </w:tc>
         <w:tc>
           <w:tcPr>
-            <w:tcW w:w="7734" w:type="dxa"/>
+            <w:tcW w:w="7994" w:type="dxa"/>
             <w:vMerge/>
           </w:tcPr>
           <w:p>
@@ -1429,19 +2278,23 @@
             <w:tcW w:w="2127" w:type="dxa"/>
           </w:tcPr>
           <w:p>
-            <w:r>
-              <w:rPr>
-                <w:rFonts w:ascii="Times New Roman" w:hAnsi="Times New Roman" w:cs="Times New Roman" w:eastAsia="Times New Roman"/>
-                <w:b w:val="0"/>
-                <w:i w:val="0"/>
-                <w:sz w:val="18"/>
-              </w:rPr>
-            </w:r>
+            <w:pPr>
+              <w:autoSpaceDE w:val="0"/>
+              <w:autoSpaceDN w:val="0"/>
+              <w:adjustRightInd w:val="0"/>
+              <w:spacing w:line="238" w:lineRule="auto"/>
+              <w:rPr>
+                <w:rFonts w:asciiTheme="majorBidi" w:eastAsia="TimesNewRomanPSMT" w:hAnsiTheme="majorBidi" w:cstheme="majorBidi"/>
+                <w:sz w:val="18"/>
+                <w:szCs w:val="18"/>
+                <w:lang w:val="en-US"/>
+              </w:rPr>
+            </w:pPr>
           </w:p>
         </w:tc>
         <w:tc>
           <w:tcPr>
-            <w:tcW w:w="283" w:type="dxa"/>
+            <w:tcW w:w="23" w:type="dxa"/>
           </w:tcPr>
           <w:p>
             <w:pPr>
@@ -1458,7 +2311,7 @@
         </w:tc>
         <w:tc>
           <w:tcPr>
-            <w:tcW w:w="7734" w:type="dxa"/>
+            <w:tcW w:w="7994" w:type="dxa"/>
             <w:vMerge/>
           </w:tcPr>
           <w:p>
@@ -1470,242 +2323,6 @@
                 <w:sz w:val="18"/>
                 <w:szCs w:val="18"/>
                 <w:lang w:val="en-US"/>
-              </w:rPr>
-            </w:pPr>
-          </w:p>
-        </w:tc>
-      </w:tr>
-      <w:tr>
-        <w:tc>
-          <w:tcPr>
-            <w:tcW w:w="2127" w:type="dxa"/>
-          </w:tcPr>
-          <w:p>
-            <w:pPr>
-              <w:pStyle w:val="ListeParagraf"/>
-              <w:spacing w:line="238" w:lineRule="auto"/>
-              <w:ind w:left="0"/>
-              <w:jc w:val="both"/>
-              <w:rPr>
-                <w:rFonts w:asciiTheme="majorBidi" w:hAnsiTheme="majorBidi" w:cstheme="majorBidi"/>
-                <w:noProof/>
-                <w:sz w:val="18"/>
-                <w:szCs w:val="18"/>
-                <w:highlight w:val="green"/>
-                <w:lang w:eastAsia="tr-TR"/>
-              </w:rPr>
-            </w:pPr>
-            <w:r>
-              <w:rPr>
-                <w:rFonts w:asciiTheme="majorBidi" w:hAnsiTheme="majorBidi" w:cstheme="majorBidi"/>
-                <w:b/>
-                <w:bCs/>
-                <w:noProof/>
-                <w:sz w:val="18"/>
-                <w:szCs w:val="18"/>
-                <w:highlight w:val="green"/>
-                <w:lang w:eastAsia="tr-TR"/>
-              </w:rPr>
-              <w:t>YAZARA NOT:</w:t>
-            </w:r>
-            <w:r>
-              <w:rPr>
-                <w:rFonts w:asciiTheme="majorBidi" w:hAnsiTheme="majorBidi" w:cstheme="majorBidi"/>
-                <w:noProof/>
-                <w:sz w:val="18"/>
-                <w:szCs w:val="18"/>
-                <w:highlight w:val="green"/>
-                <w:lang w:eastAsia="tr-TR"/>
-              </w:rPr>
-              <w:t xml:space="preserve"> </w:t>
-            </w:r>
-            <w:r>
-              <w:rPr>
-                <w:rFonts w:asciiTheme="majorBidi" w:hAnsiTheme="majorBidi" w:cstheme="majorBidi"/>
-                <w:noProof/>
-                <w:sz w:val="18"/>
-                <w:szCs w:val="18"/>
-                <w:highlight w:val="green"/>
-                <w:lang w:eastAsia="tr-TR"/>
-              </w:rPr>
-              <w:t xml:space="preserve">Dergimizin Uluslararası Görünürlüğü ve Makalelerin yurtdışından atıf almalarının en önemli özelliği </w:t>
-            </w:r>
-            <w:r>
-              <w:rPr>
-                <w:rFonts w:asciiTheme="majorBidi" w:hAnsiTheme="majorBidi" w:cstheme="majorBidi"/>
-                <w:b/>
-                <w:bCs/>
-                <w:noProof/>
-                <w:sz w:val="18"/>
-                <w:szCs w:val="18"/>
-                <w:highlight w:val="green"/>
-                <w:lang w:eastAsia="tr-TR"/>
-              </w:rPr>
-              <w:t xml:space="preserve">Extenden Abstract </w:t>
-            </w:r>
-            <w:r>
-              <w:rPr>
-                <w:rFonts w:asciiTheme="majorBidi" w:hAnsiTheme="majorBidi" w:cstheme="majorBidi"/>
-                <w:noProof/>
-                <w:sz w:val="18"/>
-                <w:szCs w:val="18"/>
-                <w:highlight w:val="green"/>
-                <w:lang w:eastAsia="tr-TR"/>
-              </w:rPr>
-              <w:t xml:space="preserve">kısmı olup; Siz değerlerli yazarların, </w:t>
-            </w:r>
-            <w:r>
-              <w:rPr>
-                <w:rFonts w:asciiTheme="majorBidi" w:hAnsiTheme="majorBidi" w:cstheme="majorBidi"/>
-                <w:b/>
-                <w:bCs/>
-                <w:noProof/>
-                <w:sz w:val="18"/>
-                <w:szCs w:val="18"/>
-                <w:highlight w:val="green"/>
-                <w:lang w:eastAsia="tr-TR"/>
-              </w:rPr>
-              <w:t>Genişletilmiş İngilizce Özet sayfasını</w:t>
-            </w:r>
-            <w:r>
-              <w:rPr>
-                <w:rFonts w:asciiTheme="majorBidi" w:hAnsiTheme="majorBidi" w:cstheme="majorBidi"/>
-                <w:noProof/>
-                <w:sz w:val="18"/>
-                <w:szCs w:val="18"/>
-                <w:highlight w:val="green"/>
-                <w:lang w:eastAsia="tr-TR"/>
-              </w:rPr>
-              <w:t xml:space="preserve"> ve </w:t>
-            </w:r>
-            <w:r>
-              <w:rPr>
-                <w:rFonts w:asciiTheme="majorBidi" w:hAnsiTheme="majorBidi" w:cstheme="majorBidi"/>
-                <w:b/>
-                <w:bCs/>
-                <w:noProof/>
-                <w:sz w:val="18"/>
-                <w:szCs w:val="18"/>
-                <w:highlight w:val="green"/>
-                <w:lang w:eastAsia="tr-TR"/>
-              </w:rPr>
-              <w:t>Figure A resmini</w:t>
-            </w:r>
-            <w:r>
-              <w:rPr>
-                <w:rFonts w:asciiTheme="majorBidi" w:hAnsiTheme="majorBidi" w:cstheme="majorBidi"/>
-                <w:noProof/>
-                <w:sz w:val="18"/>
-                <w:szCs w:val="18"/>
-                <w:highlight w:val="green"/>
-                <w:lang w:eastAsia="tr-TR"/>
-              </w:rPr>
-              <w:t xml:space="preserve"> </w:t>
-            </w:r>
-            <w:r>
-              <w:rPr>
-                <w:rFonts w:asciiTheme="majorBidi" w:hAnsiTheme="majorBidi" w:cstheme="majorBidi"/>
-                <w:noProof/>
-                <w:sz w:val="18"/>
-                <w:szCs w:val="18"/>
-                <w:highlight w:val="green"/>
-                <w:lang w:eastAsia="tr-TR"/>
-              </w:rPr>
-              <w:t>bu Dosyada</w:t>
-            </w:r>
-            <w:r>
-              <w:rPr>
-                <w:rFonts w:asciiTheme="majorBidi" w:hAnsiTheme="majorBidi" w:cstheme="majorBidi"/>
-                <w:noProof/>
-                <w:sz w:val="18"/>
-                <w:szCs w:val="18"/>
-                <w:highlight w:val="green"/>
-                <w:lang w:eastAsia="tr-TR"/>
-              </w:rPr>
-              <w:t xml:space="preserve"> belirtilen formatta hazırlaması büyük önem arzetmektedir.</w:t>
-            </w:r>
-            <w:r>
-              <w:rPr>
-                <w:rFonts w:asciiTheme="majorBidi" w:hAnsiTheme="majorBidi" w:cstheme="majorBidi"/>
-                <w:noProof/>
-                <w:sz w:val="18"/>
-                <w:szCs w:val="18"/>
-                <w:highlight w:val="green"/>
-                <w:lang w:eastAsia="tr-TR"/>
-              </w:rPr>
-              <w:t xml:space="preserve"> </w:t>
-            </w:r>
-          </w:p>
-          <w:p>
-            <w:pPr>
-              <w:pStyle w:val="ListeParagraf"/>
-              <w:spacing w:line="238" w:lineRule="auto"/>
-              <w:ind w:left="0"/>
-              <w:jc w:val="both"/>
-              <w:rPr>
-                <w:rFonts w:asciiTheme="majorBidi" w:hAnsiTheme="majorBidi" w:cstheme="majorBidi"/>
-                <w:noProof/>
-                <w:sz w:val="18"/>
-                <w:szCs w:val="18"/>
-                <w:highlight w:val="green"/>
-                <w:lang w:eastAsia="tr-TR"/>
-              </w:rPr>
-            </w:pPr>
-          </w:p>
-          <w:p>
-            <w:pPr>
-              <w:pStyle w:val="ListeParagraf"/>
-              <w:spacing w:line="238" w:lineRule="auto"/>
-              <w:ind w:left="0"/>
-              <w:jc w:val="both"/>
-              <w:rPr>
-                <w:rFonts w:asciiTheme="majorBidi" w:eastAsia="TimesNewRomanPSMT" w:hAnsiTheme="majorBidi" w:cstheme="majorBidi"/>
-                <w:sz w:val="18"/>
-                <w:szCs w:val="18"/>
-              </w:rPr>
-            </w:pPr>
-            <w:r>
-              <w:rPr>
-                <w:rFonts w:asciiTheme="majorBidi" w:hAnsiTheme="majorBidi" w:cstheme="majorBidi"/>
-                <w:noProof/>
-                <w:sz w:val="18"/>
-                <w:szCs w:val="18"/>
-                <w:highlight w:val="green"/>
-                <w:lang w:eastAsia="tr-TR"/>
-              </w:rPr>
-              <w:t>Böylelikle yabancı yazarların ve okuyucuların sizin makalenizde yer alan önemli bilgilerden faydalanabilmeli ve atıf yapmalarına kolaylık sağlamalıdır.</w:t>
-            </w:r>
-          </w:p>
-        </w:tc>
-        <w:tc>
-          <w:tcPr>
-            <w:tcW w:w="283" w:type="dxa"/>
-          </w:tcPr>
-          <w:p>
-            <w:pPr>
-              <w:pStyle w:val="ilkyaynmetin"/>
-              <w:spacing w:before="0" w:after="0" w:line="240" w:lineRule="auto"/>
-              <w:rPr>
-                <w:rFonts w:asciiTheme="majorBidi" w:hAnsiTheme="majorBidi" w:cstheme="majorBidi"/>
-                <w:sz w:val="18"/>
-                <w:szCs w:val="18"/>
-              </w:rPr>
-            </w:pPr>
-          </w:p>
-        </w:tc>
-        <w:tc>
-          <w:tcPr>
-            <w:tcW w:w="7734" w:type="dxa"/>
-            <w:vMerge/>
-          </w:tcPr>
-          <w:p>
-            <w:pPr>
-              <w:pStyle w:val="ilkyaynmetin"/>
-              <w:spacing w:before="0" w:after="0" w:line="240" w:lineRule="auto"/>
-              <w:rPr>
-                <w:rFonts w:asciiTheme="majorBidi" w:hAnsiTheme="majorBidi" w:cstheme="majorBidi"/>
-                <w:sz w:val="18"/>
-                <w:szCs w:val="18"/>
               </w:rPr>
             </w:pPr>
           </w:p>
@@ -1714,9 +2331,7 @@
     </w:tbl>
     <w:p>
       <w:pPr>
-        <w:pStyle w:val="ListeParagraf"/>
         <w:spacing w:after="0" w:line="240" w:lineRule="auto"/>
-        <w:ind w:left="357"/>
         <w:jc w:val="both"/>
         <w:rPr>
           <w:rFonts w:asciiTheme="majorBidi" w:hAnsiTheme="majorBidi" w:cstheme="majorBidi"/>
@@ -1755,7 +2370,7 @@
 </file>
 
 <file path=word/endnotes.xml><?xml version="1.0" encoding="utf-8"?>
-<w:endnotes xmlns:wpc="http://schemas.microsoft.com/office/word/2010/wordprocessingCanvas" xmlns:cx="http://schemas.microsoft.com/office/drawing/2014/chartex" xmlns:cx1="http://schemas.microsoft.com/office/drawing/2015/9/8/chartex" xmlns:cx2="http://schemas.microsoft.com/office/drawing/2015/10/21/chartex" xmlns:cx3="http://schemas.microsoft.com/office/drawing/2016/5/9/chartex" xmlns:cx4="http://schemas.microsoft.com/office/drawing/2016/5/10/chartex" xmlns:cx5="http://schemas.microsoft.com/office/drawing/2016/5/11/chartex" xmlns:cx6="http://schemas.microsoft.com/office/drawing/2016/5/12/chartex" xmlns:cx7="http://schemas.microsoft.com/office/drawing/2016/5/13/chartex" xmlns:cx8="http://schemas.microsoft.com/office/drawing/2016/5/14/chartex" xmlns:mc="http://schemas.openxmlformats.org/markup-compatibility/2006" xmlns:aink="http://schemas.microsoft.com/office/drawing/2016/ink" xmlns:am3d="http://schemas.microsoft.com/office/drawing/2017/model3d" xmlns:o="urn:schemas-microsoft-com:office:office" xmlns:r="http://schemas.openxmlformats.org/officeDocument/2006/relationships" xmlns:m="http://schemas.openxmlformats.org/officeDocument/2006/math" xmlns:v="urn:schemas-microsoft-com:vml" xmlns:wp14="http://schemas.microsoft.com/office/word/2010/wordprocessingDrawing" xmlns:wp="http://schemas.openxmlformats.org/drawingml/2006/wordprocessingDrawing" xmlns:w10="urn:schemas-microsoft-com:office:word" xmlns:w="http://schemas.openxmlformats.org/wordprocessingml/2006/main" xmlns:w14="http://schemas.microsoft.com/office/word/2010/wordml" xmlns:w15="http://schemas.microsoft.com/office/word/2012/wordml" xmlns:w16cid="http://schemas.microsoft.com/office/word/2016/wordml/cid" xmlns:w16se="http://schemas.microsoft.com/office/word/2015/wordml/symex" xmlns:wpg="http://schemas.microsoft.com/office/word/2010/wordprocessingGroup" xmlns:wpi="http://schemas.microsoft.com/office/word/2010/wordprocessingInk" xmlns:wne="http://schemas.microsoft.com/office/word/2006/wordml" xmlns:wps="http://schemas.microsoft.com/office/word/2010/wordprocessingShape" mc:Ignorable="w14 w15 w16se w16cid wp14">
+<w:endnotes xmlns:wpc="http://schemas.microsoft.com/office/word/2010/wordprocessingCanvas" xmlns:cx="http://schemas.microsoft.com/office/drawing/2014/chartex" xmlns:cx1="http://schemas.microsoft.com/office/drawing/2015/9/8/chartex" xmlns:cx2="http://schemas.microsoft.com/office/drawing/2015/10/21/chartex" xmlns:cx3="http://schemas.microsoft.com/office/drawing/2016/5/9/chartex" xmlns:cx4="http://schemas.microsoft.com/office/drawing/2016/5/10/chartex" xmlns:cx5="http://schemas.microsoft.com/office/drawing/2016/5/11/chartex" xmlns:cx6="http://schemas.microsoft.com/office/drawing/2016/5/12/chartex" xmlns:cx7="http://schemas.microsoft.com/office/drawing/2016/5/13/chartex" xmlns:cx8="http://schemas.microsoft.com/office/drawing/2016/5/14/chartex" xmlns:mc="http://schemas.openxmlformats.org/markup-compatibility/2006" xmlns:aink="http://schemas.microsoft.com/office/drawing/2016/ink" xmlns:am3d="http://schemas.microsoft.com/office/drawing/2017/model3d" xmlns:o="urn:schemas-microsoft-com:office:office" xmlns:oel="http://schemas.microsoft.com/office/2019/extlst" xmlns:r="http://schemas.openxmlformats.org/officeDocument/2006/relationships" xmlns:m="http://schemas.openxmlformats.org/officeDocument/2006/math" xmlns:v="urn:schemas-microsoft-com:vml" xmlns:wp14="http://schemas.microsoft.com/office/word/2010/wordprocessingDrawing" xmlns:wp="http://schemas.openxmlformats.org/drawingml/2006/wordprocessingDrawing" xmlns:w10="urn:schemas-microsoft-com:office:word" xmlns:w="http://schemas.openxmlformats.org/wordprocessingml/2006/main" xmlns:w14="http://schemas.microsoft.com/office/word/2010/wordml" xmlns:w15="http://schemas.microsoft.com/office/word/2012/wordml" xmlns:w16cex="http://schemas.microsoft.com/office/word/2018/wordml/cex" xmlns:w16cid="http://schemas.microsoft.com/office/word/2016/wordml/cid" xmlns:w16="http://schemas.microsoft.com/office/word/2018/wordml" xmlns:w16du="http://schemas.microsoft.com/office/word/2023/wordml/word16du" xmlns:w16sdtdh="http://schemas.microsoft.com/office/word/2020/wordml/sdtdatahash" xmlns:w16sdtfl="http://schemas.microsoft.com/office/word/2024/wordml/sdtformatlock" xmlns:w16se="http://schemas.microsoft.com/office/word/2015/wordml/symex" xmlns:wpg="http://schemas.microsoft.com/office/word/2010/wordprocessingGroup" xmlns:wpi="http://schemas.microsoft.com/office/word/2010/wordprocessingInk" xmlns:wne="http://schemas.microsoft.com/office/word/2006/wordml" xmlns:wps="http://schemas.microsoft.com/office/word/2010/wordprocessingShape" mc:Ignorable="w14 w15 w16se w16cid w16 w16cex w16sdtdh w16sdtfl w16du wp14">
   <w:endnote w:type="separator" w:id="-1">
     <w:p>
       <w:pPr>
@@ -1780,7 +2395,7 @@
 </file>
 
 <file path=word/footer1.xml><?xml version="1.0" encoding="utf-8"?>
-<w:ftr xmlns:wpc="http://schemas.microsoft.com/office/word/2010/wordprocessingCanvas" xmlns:cx="http://schemas.microsoft.com/office/drawing/2014/chartex" xmlns:cx1="http://schemas.microsoft.com/office/drawing/2015/9/8/chartex" xmlns:cx2="http://schemas.microsoft.com/office/drawing/2015/10/21/chartex" xmlns:cx3="http://schemas.microsoft.com/office/drawing/2016/5/9/chartex" xmlns:cx4="http://schemas.microsoft.com/office/drawing/2016/5/10/chartex" xmlns:cx5="http://schemas.microsoft.com/office/drawing/2016/5/11/chartex" xmlns:cx6="http://schemas.microsoft.com/office/drawing/2016/5/12/chartex" xmlns:cx7="http://schemas.microsoft.com/office/drawing/2016/5/13/chartex" xmlns:cx8="http://schemas.microsoft.com/office/drawing/2016/5/14/chartex" xmlns:mc="http://schemas.openxmlformats.org/markup-compatibility/2006" xmlns:aink="http://schemas.microsoft.com/office/drawing/2016/ink" xmlns:am3d="http://schemas.microsoft.com/office/drawing/2017/model3d" xmlns:o="urn:schemas-microsoft-com:office:office" xmlns:r="http://schemas.openxmlformats.org/officeDocument/2006/relationships" xmlns:m="http://schemas.openxmlformats.org/officeDocument/2006/math" xmlns:v="urn:schemas-microsoft-com:vml" xmlns:wp14="http://schemas.microsoft.com/office/word/2010/wordprocessingDrawing" xmlns:wp="http://schemas.openxmlformats.org/drawingml/2006/wordprocessingDrawing" xmlns:w10="urn:schemas-microsoft-com:office:word" xmlns:w="http://schemas.openxmlformats.org/wordprocessingml/2006/main" xmlns:w14="http://schemas.microsoft.com/office/word/2010/wordml" xmlns:w15="http://schemas.microsoft.com/office/word/2012/wordml" xmlns:w16cid="http://schemas.microsoft.com/office/word/2016/wordml/cid" xmlns:w16se="http://schemas.microsoft.com/office/word/2015/wordml/symex" xmlns:wpg="http://schemas.microsoft.com/office/word/2010/wordprocessingGroup" xmlns:wpi="http://schemas.microsoft.com/office/word/2010/wordprocessingInk" xmlns:wne="http://schemas.microsoft.com/office/word/2006/wordml" xmlns:wps="http://schemas.microsoft.com/office/word/2010/wordprocessingShape" mc:Ignorable="w14 w15 w16se w16cid wp14">
+<w:ftr xmlns:wpc="http://schemas.microsoft.com/office/word/2010/wordprocessingCanvas" xmlns:cx="http://schemas.microsoft.com/office/drawing/2014/chartex" xmlns:cx1="http://schemas.microsoft.com/office/drawing/2015/9/8/chartex" xmlns:cx2="http://schemas.microsoft.com/office/drawing/2015/10/21/chartex" xmlns:cx3="http://schemas.microsoft.com/office/drawing/2016/5/9/chartex" xmlns:cx4="http://schemas.microsoft.com/office/drawing/2016/5/10/chartex" xmlns:cx5="http://schemas.microsoft.com/office/drawing/2016/5/11/chartex" xmlns:cx6="http://schemas.microsoft.com/office/drawing/2016/5/12/chartex" xmlns:cx7="http://schemas.microsoft.com/office/drawing/2016/5/13/chartex" xmlns:cx8="http://schemas.microsoft.com/office/drawing/2016/5/14/chartex" xmlns:mc="http://schemas.openxmlformats.org/markup-compatibility/2006" xmlns:aink="http://schemas.microsoft.com/office/drawing/2016/ink" xmlns:am3d="http://schemas.microsoft.com/office/drawing/2017/model3d" xmlns:o="urn:schemas-microsoft-com:office:office" xmlns:oel="http://schemas.microsoft.com/office/2019/extlst" xmlns:r="http://schemas.openxmlformats.org/officeDocument/2006/relationships" xmlns:m="http://schemas.openxmlformats.org/officeDocument/2006/math" xmlns:v="urn:schemas-microsoft-com:vml" xmlns:wp14="http://schemas.microsoft.com/office/word/2010/wordprocessingDrawing" xmlns:wp="http://schemas.openxmlformats.org/drawingml/2006/wordprocessingDrawing" xmlns:w10="urn:schemas-microsoft-com:office:word" xmlns:w="http://schemas.openxmlformats.org/wordprocessingml/2006/main" xmlns:w14="http://schemas.microsoft.com/office/word/2010/wordml" xmlns:w15="http://schemas.microsoft.com/office/word/2012/wordml" xmlns:w16cex="http://schemas.microsoft.com/office/word/2018/wordml/cex" xmlns:w16cid="http://schemas.microsoft.com/office/word/2016/wordml/cid" xmlns:w16="http://schemas.microsoft.com/office/word/2018/wordml" xmlns:w16du="http://schemas.microsoft.com/office/word/2023/wordml/word16du" xmlns:w16sdtdh="http://schemas.microsoft.com/office/word/2020/wordml/sdtdatahash" xmlns:w16sdtfl="http://schemas.microsoft.com/office/word/2024/wordml/sdtformatlock" xmlns:w16se="http://schemas.microsoft.com/office/word/2015/wordml/symex" xmlns:wpg="http://schemas.microsoft.com/office/word/2010/wordprocessingGroup" xmlns:wpi="http://schemas.microsoft.com/office/word/2010/wordprocessingInk" xmlns:wne="http://schemas.microsoft.com/office/word/2006/wordml" xmlns:wps="http://schemas.microsoft.com/office/word/2010/wordprocessingShape" mc:Ignorable="w14 w15 w16se w16cid w16 w16cex w16sdtdh w16sdtfl w16du wp14">
   <w:sdt>
     <w:sdtPr>
       <w:id w:val="1749285135"/>
@@ -1789,7 +2404,6 @@
         <w:docPartUnique/>
       </w:docPartObj>
     </w:sdtPr>
-    <w:sdtEndPr/>
     <w:sdtContent>
       <w:p>
         <w:pPr>
@@ -1843,7 +2457,7 @@
 </file>
 
 <file path=word/footer2.xml><?xml version="1.0" encoding="utf-8"?>
-<w:ftr xmlns:wpc="http://schemas.microsoft.com/office/word/2010/wordprocessingCanvas" xmlns:cx="http://schemas.microsoft.com/office/drawing/2014/chartex" xmlns:cx1="http://schemas.microsoft.com/office/drawing/2015/9/8/chartex" xmlns:cx2="http://schemas.microsoft.com/office/drawing/2015/10/21/chartex" xmlns:cx3="http://schemas.microsoft.com/office/drawing/2016/5/9/chartex" xmlns:cx4="http://schemas.microsoft.com/office/drawing/2016/5/10/chartex" xmlns:cx5="http://schemas.microsoft.com/office/drawing/2016/5/11/chartex" xmlns:cx6="http://schemas.microsoft.com/office/drawing/2016/5/12/chartex" xmlns:cx7="http://schemas.microsoft.com/office/drawing/2016/5/13/chartex" xmlns:cx8="http://schemas.microsoft.com/office/drawing/2016/5/14/chartex" xmlns:mc="http://schemas.openxmlformats.org/markup-compatibility/2006" xmlns:aink="http://schemas.microsoft.com/office/drawing/2016/ink" xmlns:am3d="http://schemas.microsoft.com/office/drawing/2017/model3d" xmlns:o="urn:schemas-microsoft-com:office:office" xmlns:r="http://schemas.openxmlformats.org/officeDocument/2006/relationships" xmlns:m="http://schemas.openxmlformats.org/officeDocument/2006/math" xmlns:v="urn:schemas-microsoft-com:vml" xmlns:wp14="http://schemas.microsoft.com/office/word/2010/wordprocessingDrawing" xmlns:wp="http://schemas.openxmlformats.org/drawingml/2006/wordprocessingDrawing" xmlns:w10="urn:schemas-microsoft-com:office:word" xmlns:w="http://schemas.openxmlformats.org/wordprocessingml/2006/main" xmlns:w14="http://schemas.microsoft.com/office/word/2010/wordml" xmlns:w15="http://schemas.microsoft.com/office/word/2012/wordml" xmlns:w16cid="http://schemas.microsoft.com/office/word/2016/wordml/cid" xmlns:w16se="http://schemas.microsoft.com/office/word/2015/wordml/symex" xmlns:wpg="http://schemas.microsoft.com/office/word/2010/wordprocessingGroup" xmlns:wpi="http://schemas.microsoft.com/office/word/2010/wordprocessingInk" xmlns:wne="http://schemas.microsoft.com/office/word/2006/wordml" xmlns:wps="http://schemas.microsoft.com/office/word/2010/wordprocessingShape" mc:Ignorable="w14 w15 w16se w16cid wp14">
+<w:ftr xmlns:wpc="http://schemas.microsoft.com/office/word/2010/wordprocessingCanvas" xmlns:cx="http://schemas.microsoft.com/office/drawing/2014/chartex" xmlns:cx1="http://schemas.microsoft.com/office/drawing/2015/9/8/chartex" xmlns:cx2="http://schemas.microsoft.com/office/drawing/2015/10/21/chartex" xmlns:cx3="http://schemas.microsoft.com/office/drawing/2016/5/9/chartex" xmlns:cx4="http://schemas.microsoft.com/office/drawing/2016/5/10/chartex" xmlns:cx5="http://schemas.microsoft.com/office/drawing/2016/5/11/chartex" xmlns:cx6="http://schemas.microsoft.com/office/drawing/2016/5/12/chartex" xmlns:cx7="http://schemas.microsoft.com/office/drawing/2016/5/13/chartex" xmlns:cx8="http://schemas.microsoft.com/office/drawing/2016/5/14/chartex" xmlns:mc="http://schemas.openxmlformats.org/markup-compatibility/2006" xmlns:aink="http://schemas.microsoft.com/office/drawing/2016/ink" xmlns:am3d="http://schemas.microsoft.com/office/drawing/2017/model3d" xmlns:o="urn:schemas-microsoft-com:office:office" xmlns:oel="http://schemas.microsoft.com/office/2019/extlst" xmlns:r="http://schemas.openxmlformats.org/officeDocument/2006/relationships" xmlns:m="http://schemas.openxmlformats.org/officeDocument/2006/math" xmlns:v="urn:schemas-microsoft-com:vml" xmlns:wp14="http://schemas.microsoft.com/office/word/2010/wordprocessingDrawing" xmlns:wp="http://schemas.openxmlformats.org/drawingml/2006/wordprocessingDrawing" xmlns:w10="urn:schemas-microsoft-com:office:word" xmlns:w="http://schemas.openxmlformats.org/wordprocessingml/2006/main" xmlns:w14="http://schemas.microsoft.com/office/word/2010/wordml" xmlns:w15="http://schemas.microsoft.com/office/word/2012/wordml" xmlns:w16cex="http://schemas.microsoft.com/office/word/2018/wordml/cex" xmlns:w16cid="http://schemas.microsoft.com/office/word/2016/wordml/cid" xmlns:w16="http://schemas.microsoft.com/office/word/2018/wordml" xmlns:w16du="http://schemas.microsoft.com/office/word/2023/wordml/word16du" xmlns:w16sdtdh="http://schemas.microsoft.com/office/word/2020/wordml/sdtdatahash" xmlns:w16sdtfl="http://schemas.microsoft.com/office/word/2024/wordml/sdtformatlock" xmlns:w16se="http://schemas.microsoft.com/office/word/2015/wordml/symex" xmlns:wpg="http://schemas.microsoft.com/office/word/2010/wordprocessingGroup" xmlns:wpi="http://schemas.microsoft.com/office/word/2010/wordprocessingInk" xmlns:wne="http://schemas.microsoft.com/office/word/2006/wordml" xmlns:wps="http://schemas.microsoft.com/office/word/2010/wordprocessingShape" mc:Ignorable="w14 w15 w16se w16cid w16 w16cex w16sdtdh w16sdtfl w16du wp14">
   <w:sdt>
     <w:sdtPr>
       <w:id w:val="1749285138"/>
@@ -1918,7 +2532,7 @@
 </file>
 
 <file path=word/footnotes.xml><?xml version="1.0" encoding="utf-8"?>
-<w:footnotes xmlns:wpc="http://schemas.microsoft.com/office/word/2010/wordprocessingCanvas" xmlns:cx="http://schemas.microsoft.com/office/drawing/2014/chartex" xmlns:cx1="http://schemas.microsoft.com/office/drawing/2015/9/8/chartex" xmlns:cx2="http://schemas.microsoft.com/office/drawing/2015/10/21/chartex" xmlns:cx3="http://schemas.microsoft.com/office/drawing/2016/5/9/chartex" xmlns:cx4="http://schemas.microsoft.com/office/drawing/2016/5/10/chartex" xmlns:cx5="http://schemas.microsoft.com/office/drawing/2016/5/11/chartex" xmlns:cx6="http://schemas.microsoft.com/office/drawing/2016/5/12/chartex" xmlns:cx7="http://schemas.microsoft.com/office/drawing/2016/5/13/chartex" xmlns:cx8="http://schemas.microsoft.com/office/drawing/2016/5/14/chartex" xmlns:mc="http://schemas.openxmlformats.org/markup-compatibility/2006" xmlns:aink="http://schemas.microsoft.com/office/drawing/2016/ink" xmlns:am3d="http://schemas.microsoft.com/office/drawing/2017/model3d" xmlns:o="urn:schemas-microsoft-com:office:office" xmlns:r="http://schemas.openxmlformats.org/officeDocument/2006/relationships" xmlns:m="http://schemas.openxmlformats.org/officeDocument/2006/math" xmlns:v="urn:schemas-microsoft-com:vml" xmlns:wp14="http://schemas.microsoft.com/office/word/2010/wordprocessingDrawing" xmlns:wp="http://schemas.openxmlformats.org/drawingml/2006/wordprocessingDrawing" xmlns:w10="urn:schemas-microsoft-com:office:word" xmlns:w="http://schemas.openxmlformats.org/wordprocessingml/2006/main" xmlns:w14="http://schemas.microsoft.com/office/word/2010/wordml" xmlns:w15="http://schemas.microsoft.com/office/word/2012/wordml" xmlns:w16cid="http://schemas.microsoft.com/office/word/2016/wordml/cid" xmlns:w16se="http://schemas.microsoft.com/office/word/2015/wordml/symex" xmlns:wpg="http://schemas.microsoft.com/office/word/2010/wordprocessingGroup" xmlns:wpi="http://schemas.microsoft.com/office/word/2010/wordprocessingInk" xmlns:wne="http://schemas.microsoft.com/office/word/2006/wordml" xmlns:wps="http://schemas.microsoft.com/office/word/2010/wordprocessingShape" mc:Ignorable="w14 w15 w16se w16cid wp14">
+<w:footnotes xmlns:wpc="http://schemas.microsoft.com/office/word/2010/wordprocessingCanvas" xmlns:cx="http://schemas.microsoft.com/office/drawing/2014/chartex" xmlns:cx1="http://schemas.microsoft.com/office/drawing/2015/9/8/chartex" xmlns:cx2="http://schemas.microsoft.com/office/drawing/2015/10/21/chartex" xmlns:cx3="http://schemas.microsoft.com/office/drawing/2016/5/9/chartex" xmlns:cx4="http://schemas.microsoft.com/office/drawing/2016/5/10/chartex" xmlns:cx5="http://schemas.microsoft.com/office/drawing/2016/5/11/chartex" xmlns:cx6="http://schemas.microsoft.com/office/drawing/2016/5/12/chartex" xmlns:cx7="http://schemas.microsoft.com/office/drawing/2016/5/13/chartex" xmlns:cx8="http://schemas.microsoft.com/office/drawing/2016/5/14/chartex" xmlns:mc="http://schemas.openxmlformats.org/markup-compatibility/2006" xmlns:aink="http://schemas.microsoft.com/office/drawing/2016/ink" xmlns:am3d="http://schemas.microsoft.com/office/drawing/2017/model3d" xmlns:o="urn:schemas-microsoft-com:office:office" xmlns:oel="http://schemas.microsoft.com/office/2019/extlst" xmlns:r="http://schemas.openxmlformats.org/officeDocument/2006/relationships" xmlns:m="http://schemas.openxmlformats.org/officeDocument/2006/math" xmlns:v="urn:schemas-microsoft-com:vml" xmlns:wp14="http://schemas.microsoft.com/office/word/2010/wordprocessingDrawing" xmlns:wp="http://schemas.openxmlformats.org/drawingml/2006/wordprocessingDrawing" xmlns:w10="urn:schemas-microsoft-com:office:word" xmlns:w="http://schemas.openxmlformats.org/wordprocessingml/2006/main" xmlns:w14="http://schemas.microsoft.com/office/word/2010/wordml" xmlns:w15="http://schemas.microsoft.com/office/word/2012/wordml" xmlns:w16cex="http://schemas.microsoft.com/office/word/2018/wordml/cex" xmlns:w16cid="http://schemas.microsoft.com/office/word/2016/wordml/cid" xmlns:w16="http://schemas.microsoft.com/office/word/2018/wordml" xmlns:w16du="http://schemas.microsoft.com/office/word/2023/wordml/word16du" xmlns:w16sdtdh="http://schemas.microsoft.com/office/word/2020/wordml/sdtdatahash" xmlns:w16sdtfl="http://schemas.microsoft.com/office/word/2024/wordml/sdtformatlock" xmlns:w16se="http://schemas.microsoft.com/office/word/2015/wordml/symex" xmlns:wpg="http://schemas.microsoft.com/office/word/2010/wordprocessingGroup" xmlns:wpi="http://schemas.microsoft.com/office/word/2010/wordprocessingInk" xmlns:wne="http://schemas.microsoft.com/office/word/2006/wordml" xmlns:wps="http://schemas.microsoft.com/office/word/2010/wordprocessingShape" mc:Ignorable="w14 w15 w16se w16cid w16 w16cex w16sdtdh w16sdtfl w16du wp14">
   <w:footnote w:type="separator" w:id="-1">
     <w:p>
       <w:pPr>
@@ -1943,7 +2557,7 @@
 </file>
 
 <file path=word/header1.xml><?xml version="1.0" encoding="utf-8"?>
-<w:hdr xmlns:wpc="http://schemas.microsoft.com/office/word/2010/wordprocessingCanvas" xmlns:cx="http://schemas.microsoft.com/office/drawing/2014/chartex" xmlns:cx1="http://schemas.microsoft.com/office/drawing/2015/9/8/chartex" xmlns:cx2="http://schemas.microsoft.com/office/drawing/2015/10/21/chartex" xmlns:cx3="http://schemas.microsoft.com/office/drawing/2016/5/9/chartex" xmlns:cx4="http://schemas.microsoft.com/office/drawing/2016/5/10/chartex" xmlns:cx5="http://schemas.microsoft.com/office/drawing/2016/5/11/chartex" xmlns:cx6="http://schemas.microsoft.com/office/drawing/2016/5/12/chartex" xmlns:cx7="http://schemas.microsoft.com/office/drawing/2016/5/13/chartex" xmlns:cx8="http://schemas.microsoft.com/office/drawing/2016/5/14/chartex" xmlns:mc="http://schemas.openxmlformats.org/markup-compatibility/2006" xmlns:aink="http://schemas.microsoft.com/office/drawing/2016/ink" xmlns:am3d="http://schemas.microsoft.com/office/drawing/2017/model3d" xmlns:o="urn:schemas-microsoft-com:office:office" xmlns:r="http://schemas.openxmlformats.org/officeDocument/2006/relationships" xmlns:m="http://schemas.openxmlformats.org/officeDocument/2006/math" xmlns:v="urn:schemas-microsoft-com:vml" xmlns:wp14="http://schemas.microsoft.com/office/word/2010/wordprocessingDrawing" xmlns:wp="http://schemas.openxmlformats.org/drawingml/2006/wordprocessingDrawing" xmlns:w10="urn:schemas-microsoft-com:office:word" xmlns:w="http://schemas.openxmlformats.org/wordprocessingml/2006/main" xmlns:w14="http://schemas.microsoft.com/office/word/2010/wordml" xmlns:w15="http://schemas.microsoft.com/office/word/2012/wordml" xmlns:w16cid="http://schemas.microsoft.com/office/word/2016/wordml/cid" xmlns:w16se="http://schemas.microsoft.com/office/word/2015/wordml/symex" xmlns:wpg="http://schemas.microsoft.com/office/word/2010/wordprocessingGroup" xmlns:wpi="http://schemas.microsoft.com/office/word/2010/wordprocessingInk" xmlns:wne="http://schemas.microsoft.com/office/word/2006/wordml" xmlns:wps="http://schemas.microsoft.com/office/word/2010/wordprocessingShape" mc:Ignorable="w14 w15 w16se w16cid wp14">
+<w:hdr xmlns:wpc="http://schemas.microsoft.com/office/word/2010/wordprocessingCanvas" xmlns:cx="http://schemas.microsoft.com/office/drawing/2014/chartex" xmlns:cx1="http://schemas.microsoft.com/office/drawing/2015/9/8/chartex" xmlns:cx2="http://schemas.microsoft.com/office/drawing/2015/10/21/chartex" xmlns:cx3="http://schemas.microsoft.com/office/drawing/2016/5/9/chartex" xmlns:cx4="http://schemas.microsoft.com/office/drawing/2016/5/10/chartex" xmlns:cx5="http://schemas.microsoft.com/office/drawing/2016/5/11/chartex" xmlns:cx6="http://schemas.microsoft.com/office/drawing/2016/5/12/chartex" xmlns:cx7="http://schemas.microsoft.com/office/drawing/2016/5/13/chartex" xmlns:cx8="http://schemas.microsoft.com/office/drawing/2016/5/14/chartex" xmlns:mc="http://schemas.openxmlformats.org/markup-compatibility/2006" xmlns:aink="http://schemas.microsoft.com/office/drawing/2016/ink" xmlns:am3d="http://schemas.microsoft.com/office/drawing/2017/model3d" xmlns:o="urn:schemas-microsoft-com:office:office" xmlns:oel="http://schemas.microsoft.com/office/2019/extlst" xmlns:r="http://schemas.openxmlformats.org/officeDocument/2006/relationships" xmlns:m="http://schemas.openxmlformats.org/officeDocument/2006/math" xmlns:v="urn:schemas-microsoft-com:vml" xmlns:wp14="http://schemas.microsoft.com/office/word/2010/wordprocessingDrawing" xmlns:wp="http://schemas.openxmlformats.org/drawingml/2006/wordprocessingDrawing" xmlns:w10="urn:schemas-microsoft-com:office:word" xmlns:w="http://schemas.openxmlformats.org/wordprocessingml/2006/main" xmlns:w14="http://schemas.microsoft.com/office/word/2010/wordml" xmlns:w15="http://schemas.microsoft.com/office/word/2012/wordml" xmlns:w16cex="http://schemas.microsoft.com/office/word/2018/wordml/cex" xmlns:w16cid="http://schemas.microsoft.com/office/word/2016/wordml/cid" xmlns:w16="http://schemas.microsoft.com/office/word/2018/wordml" xmlns:w16du="http://schemas.microsoft.com/office/word/2023/wordml/word16du" xmlns:w16sdtdh="http://schemas.microsoft.com/office/word/2020/wordml/sdtdatahash" xmlns:w16sdtfl="http://schemas.microsoft.com/office/word/2024/wordml/sdtformatlock" xmlns:w16se="http://schemas.microsoft.com/office/word/2015/wordml/symex" xmlns:wpg="http://schemas.microsoft.com/office/word/2010/wordprocessingGroup" xmlns:wpi="http://schemas.microsoft.com/office/word/2010/wordprocessingInk" xmlns:wne="http://schemas.microsoft.com/office/word/2006/wordml" xmlns:wps="http://schemas.microsoft.com/office/word/2010/wordprocessingShape" mc:Ignorable="w14 w15 w16se w16cid w16 w16cex w16sdtdh w16sdtfl w16du wp14">
   <w:p>
     <w:pPr>
       <w:tabs>
@@ -1993,7 +2607,7 @@
 </file>
 
 <file path=word/header2.xml><?xml version="1.0" encoding="utf-8"?>
-<w:hdr xmlns:wpc="http://schemas.microsoft.com/office/word/2010/wordprocessingCanvas" xmlns:cx="http://schemas.microsoft.com/office/drawing/2014/chartex" xmlns:cx1="http://schemas.microsoft.com/office/drawing/2015/9/8/chartex" xmlns:cx2="http://schemas.microsoft.com/office/drawing/2015/10/21/chartex" xmlns:cx3="http://schemas.microsoft.com/office/drawing/2016/5/9/chartex" xmlns:cx4="http://schemas.microsoft.com/office/drawing/2016/5/10/chartex" xmlns:cx5="http://schemas.microsoft.com/office/drawing/2016/5/11/chartex" xmlns:cx6="http://schemas.microsoft.com/office/drawing/2016/5/12/chartex" xmlns:cx7="http://schemas.microsoft.com/office/drawing/2016/5/13/chartex" xmlns:cx8="http://schemas.microsoft.com/office/drawing/2016/5/14/chartex" xmlns:mc="http://schemas.openxmlformats.org/markup-compatibility/2006" xmlns:aink="http://schemas.microsoft.com/office/drawing/2016/ink" xmlns:am3d="http://schemas.microsoft.com/office/drawing/2017/model3d" xmlns:o="urn:schemas-microsoft-com:office:office" xmlns:r="http://schemas.openxmlformats.org/officeDocument/2006/relationships" xmlns:m="http://schemas.openxmlformats.org/officeDocument/2006/math" xmlns:v="urn:schemas-microsoft-com:vml" xmlns:wp14="http://schemas.microsoft.com/office/word/2010/wordprocessingDrawing" xmlns:wp="http://schemas.openxmlformats.org/drawingml/2006/wordprocessingDrawing" xmlns:w10="urn:schemas-microsoft-com:office:word" xmlns:w="http://schemas.openxmlformats.org/wordprocessingml/2006/main" xmlns:w14="http://schemas.microsoft.com/office/word/2010/wordml" xmlns:w15="http://schemas.microsoft.com/office/word/2012/wordml" xmlns:w16cid="http://schemas.microsoft.com/office/word/2016/wordml/cid" xmlns:w16se="http://schemas.microsoft.com/office/word/2015/wordml/symex" xmlns:wpg="http://schemas.microsoft.com/office/word/2010/wordprocessingGroup" xmlns:wpi="http://schemas.microsoft.com/office/word/2010/wordprocessingInk" xmlns:wne="http://schemas.microsoft.com/office/word/2006/wordml" xmlns:wps="http://schemas.microsoft.com/office/word/2010/wordprocessingShape" mc:Ignorable="w14 w15 w16se w16cid wp14">
+<w:hdr xmlns:wpc="http://schemas.microsoft.com/office/word/2010/wordprocessingCanvas" xmlns:cx="http://schemas.microsoft.com/office/drawing/2014/chartex" xmlns:cx1="http://schemas.microsoft.com/office/drawing/2015/9/8/chartex" xmlns:cx2="http://schemas.microsoft.com/office/drawing/2015/10/21/chartex" xmlns:cx3="http://schemas.microsoft.com/office/drawing/2016/5/9/chartex" xmlns:cx4="http://schemas.microsoft.com/office/drawing/2016/5/10/chartex" xmlns:cx5="http://schemas.microsoft.com/office/drawing/2016/5/11/chartex" xmlns:cx6="http://schemas.microsoft.com/office/drawing/2016/5/12/chartex" xmlns:cx7="http://schemas.microsoft.com/office/drawing/2016/5/13/chartex" xmlns:cx8="http://schemas.microsoft.com/office/drawing/2016/5/14/chartex" xmlns:mc="http://schemas.openxmlformats.org/markup-compatibility/2006" xmlns:aink="http://schemas.microsoft.com/office/drawing/2016/ink" xmlns:am3d="http://schemas.microsoft.com/office/drawing/2017/model3d" xmlns:o="urn:schemas-microsoft-com:office:office" xmlns:oel="http://schemas.microsoft.com/office/2019/extlst" xmlns:r="http://schemas.openxmlformats.org/officeDocument/2006/relationships" xmlns:m="http://schemas.openxmlformats.org/officeDocument/2006/math" xmlns:v="urn:schemas-microsoft-com:vml" xmlns:wp14="http://schemas.microsoft.com/office/word/2010/wordprocessingDrawing" xmlns:wp="http://schemas.openxmlformats.org/drawingml/2006/wordprocessingDrawing" xmlns:w10="urn:schemas-microsoft-com:office:word" xmlns:w="http://schemas.openxmlformats.org/wordprocessingml/2006/main" xmlns:w14="http://schemas.microsoft.com/office/word/2010/wordml" xmlns:w15="http://schemas.microsoft.com/office/word/2012/wordml" xmlns:w16cex="http://schemas.microsoft.com/office/word/2018/wordml/cex" xmlns:w16cid="http://schemas.microsoft.com/office/word/2016/wordml/cid" xmlns:w16="http://schemas.microsoft.com/office/word/2018/wordml" xmlns:w16du="http://schemas.microsoft.com/office/word/2023/wordml/word16du" xmlns:w16sdtdh="http://schemas.microsoft.com/office/word/2020/wordml/sdtdatahash" xmlns:w16sdtfl="http://schemas.microsoft.com/office/word/2024/wordml/sdtformatlock" xmlns:w16se="http://schemas.microsoft.com/office/word/2015/wordml/symex" xmlns:wpg="http://schemas.microsoft.com/office/word/2010/wordprocessingGroup" xmlns:wpi="http://schemas.microsoft.com/office/word/2010/wordprocessingInk" xmlns:wne="http://schemas.microsoft.com/office/word/2006/wordml" xmlns:wps="http://schemas.microsoft.com/office/word/2010/wordprocessingShape" mc:Ignorable="w14 w15 w16se w16cid w16 w16cex w16sdtdh w16sdtfl w16du wp14">
   <w:p>
     <w:pPr>
       <w:pStyle w:val="stbilgi1"/>
@@ -2030,8 +2644,22 @@
         <w:szCs w:val="16"/>
         <w:lang w:val="en-US"/>
       </w:rPr>
-      <w:t>rchitecture of Gazi University -:-</w:t>
+      <w:t xml:space="preserve">rchitecture of Gazi University </w:t>
     </w:r>
+    <w:proofErr w:type="gramStart"/>
+    <w:r>
+      <w:rPr>
+        <w:rStyle w:val="Vurgu"/>
+        <w:rFonts w:ascii="Times New Roman" w:hAnsi="Times New Roman" w:cs="Times New Roman"/>
+        <w:i w:val="0"/>
+        <w:color w:val="000000"/>
+        <w:sz w:val="16"/>
+        <w:szCs w:val="16"/>
+        <w:lang w:val="en-US"/>
+      </w:rPr>
+      <w:t>-:-</w:t>
+    </w:r>
+    <w:proofErr w:type="gramEnd"/>
     <w:r>
       <w:rPr>
         <w:rStyle w:val="Vurgu"/>
@@ -2155,7 +2783,7 @@
 </file>
 
 <file path=word/header3.xml><?xml version="1.0" encoding="utf-8"?>
-<w:hdr xmlns:wpc="http://schemas.microsoft.com/office/word/2010/wordprocessingCanvas" xmlns:cx="http://schemas.microsoft.com/office/drawing/2014/chartex" xmlns:cx1="http://schemas.microsoft.com/office/drawing/2015/9/8/chartex" xmlns:cx2="http://schemas.microsoft.com/office/drawing/2015/10/21/chartex" xmlns:cx3="http://schemas.microsoft.com/office/drawing/2016/5/9/chartex" xmlns:cx4="http://schemas.microsoft.com/office/drawing/2016/5/10/chartex" xmlns:cx5="http://schemas.microsoft.com/office/drawing/2016/5/11/chartex" xmlns:cx6="http://schemas.microsoft.com/office/drawing/2016/5/12/chartex" xmlns:cx7="http://schemas.microsoft.com/office/drawing/2016/5/13/chartex" xmlns:cx8="http://schemas.microsoft.com/office/drawing/2016/5/14/chartex" xmlns:mc="http://schemas.openxmlformats.org/markup-compatibility/2006" xmlns:aink="http://schemas.microsoft.com/office/drawing/2016/ink" xmlns:am3d="http://schemas.microsoft.com/office/drawing/2017/model3d" xmlns:o="urn:schemas-microsoft-com:office:office" xmlns:r="http://schemas.openxmlformats.org/officeDocument/2006/relationships" xmlns:m="http://schemas.openxmlformats.org/officeDocument/2006/math" xmlns:v="urn:schemas-microsoft-com:vml" xmlns:wp14="http://schemas.microsoft.com/office/word/2010/wordprocessingDrawing" xmlns:wp="http://schemas.openxmlformats.org/drawingml/2006/wordprocessingDrawing" xmlns:w10="urn:schemas-microsoft-com:office:word" xmlns:w="http://schemas.openxmlformats.org/wordprocessingml/2006/main" xmlns:w14="http://schemas.microsoft.com/office/word/2010/wordml" xmlns:w15="http://schemas.microsoft.com/office/word/2012/wordml" xmlns:w16cid="http://schemas.microsoft.com/office/word/2016/wordml/cid" xmlns:w16se="http://schemas.microsoft.com/office/word/2015/wordml/symex" xmlns:wpg="http://schemas.microsoft.com/office/word/2010/wordprocessingGroup" xmlns:wpi="http://schemas.microsoft.com/office/word/2010/wordprocessingInk" xmlns:wne="http://schemas.microsoft.com/office/word/2006/wordml" xmlns:wps="http://schemas.microsoft.com/office/word/2010/wordprocessingShape" mc:Ignorable="w14 w15 w16se w16cid wp14">
+<w:hdr xmlns:wpc="http://schemas.microsoft.com/office/word/2010/wordprocessingCanvas" xmlns:cx="http://schemas.microsoft.com/office/drawing/2014/chartex" xmlns:cx1="http://schemas.microsoft.com/office/drawing/2015/9/8/chartex" xmlns:cx2="http://schemas.microsoft.com/office/drawing/2015/10/21/chartex" xmlns:cx3="http://schemas.microsoft.com/office/drawing/2016/5/9/chartex" xmlns:cx4="http://schemas.microsoft.com/office/drawing/2016/5/10/chartex" xmlns:cx5="http://schemas.microsoft.com/office/drawing/2016/5/11/chartex" xmlns:cx6="http://schemas.microsoft.com/office/drawing/2016/5/12/chartex" xmlns:cx7="http://schemas.microsoft.com/office/drawing/2016/5/13/chartex" xmlns:cx8="http://schemas.microsoft.com/office/drawing/2016/5/14/chartex" xmlns:mc="http://schemas.openxmlformats.org/markup-compatibility/2006" xmlns:aink="http://schemas.microsoft.com/office/drawing/2016/ink" xmlns:am3d="http://schemas.microsoft.com/office/drawing/2017/model3d" xmlns:o="urn:schemas-microsoft-com:office:office" xmlns:oel="http://schemas.microsoft.com/office/2019/extlst" xmlns:r="http://schemas.openxmlformats.org/officeDocument/2006/relationships" xmlns:m="http://schemas.openxmlformats.org/officeDocument/2006/math" xmlns:v="urn:schemas-microsoft-com:vml" xmlns:wp14="http://schemas.microsoft.com/office/word/2010/wordprocessingDrawing" xmlns:wp="http://schemas.openxmlformats.org/drawingml/2006/wordprocessingDrawing" xmlns:w10="urn:schemas-microsoft-com:office:word" xmlns:w="http://schemas.openxmlformats.org/wordprocessingml/2006/main" xmlns:w14="http://schemas.microsoft.com/office/word/2010/wordml" xmlns:w15="http://schemas.microsoft.com/office/word/2012/wordml" xmlns:w16cex="http://schemas.microsoft.com/office/word/2018/wordml/cex" xmlns:w16cid="http://schemas.microsoft.com/office/word/2016/wordml/cid" xmlns:w16="http://schemas.microsoft.com/office/word/2018/wordml" xmlns:w16du="http://schemas.microsoft.com/office/word/2023/wordml/word16du" xmlns:w16sdtdh="http://schemas.microsoft.com/office/word/2020/wordml/sdtdatahash" xmlns:w16sdtfl="http://schemas.microsoft.com/office/word/2024/wordml/sdtformatlock" xmlns:w16se="http://schemas.microsoft.com/office/word/2015/wordml/symex" xmlns:wpg="http://schemas.microsoft.com/office/word/2010/wordprocessingGroup" xmlns:wpi="http://schemas.microsoft.com/office/word/2010/wordprocessingInk" xmlns:wne="http://schemas.microsoft.com/office/word/2006/wordml" xmlns:wps="http://schemas.microsoft.com/office/word/2010/wordprocessingShape" mc:Ignorable="w14 w15 w16se w16cid w16 w16cex w16sdtdh w16sdtfl w16du wp14">
   <w:p>
     <w:pPr>
       <w:tabs>
@@ -2216,7 +2844,7 @@
 </file>
 
 <file path=word/numbering.xml><?xml version="1.0" encoding="utf-8"?>
-<w:numbering xmlns:wpc="http://schemas.microsoft.com/office/word/2010/wordprocessingCanvas" xmlns:cx="http://schemas.microsoft.com/office/drawing/2014/chartex" xmlns:cx1="http://schemas.microsoft.com/office/drawing/2015/9/8/chartex" xmlns:cx2="http://schemas.microsoft.com/office/drawing/2015/10/21/chartex" xmlns:cx3="http://schemas.microsoft.com/office/drawing/2016/5/9/chartex" xmlns:cx4="http://schemas.microsoft.com/office/drawing/2016/5/10/chartex" xmlns:cx5="http://schemas.microsoft.com/office/drawing/2016/5/11/chartex" xmlns:cx6="http://schemas.microsoft.com/office/drawing/2016/5/12/chartex" xmlns:cx7="http://schemas.microsoft.com/office/drawing/2016/5/13/chartex" xmlns:cx8="http://schemas.microsoft.com/office/drawing/2016/5/14/chartex" xmlns:mc="http://schemas.openxmlformats.org/markup-compatibility/2006" xmlns:aink="http://schemas.microsoft.com/office/drawing/2016/ink" xmlns:am3d="http://schemas.microsoft.com/office/drawing/2017/model3d" xmlns:o="urn:schemas-microsoft-com:office:office" xmlns:r="http://schemas.openxmlformats.org/officeDocument/2006/relationships" xmlns:m="http://schemas.openxmlformats.org/officeDocument/2006/math" xmlns:v="urn:schemas-microsoft-com:vml" xmlns:wp14="http://schemas.microsoft.com/office/word/2010/wordprocessingDrawing" xmlns:wp="http://schemas.openxmlformats.org/drawingml/2006/wordprocessingDrawing" xmlns:w10="urn:schemas-microsoft-com:office:word" xmlns:w="http://schemas.openxmlformats.org/wordprocessingml/2006/main" xmlns:w14="http://schemas.microsoft.com/office/word/2010/wordml" xmlns:w15="http://schemas.microsoft.com/office/word/2012/wordml" xmlns:w16cid="http://schemas.microsoft.com/office/word/2016/wordml/cid" xmlns:w16se="http://schemas.microsoft.com/office/word/2015/wordml/symex" xmlns:wpg="http://schemas.microsoft.com/office/word/2010/wordprocessingGroup" xmlns:wpi="http://schemas.microsoft.com/office/word/2010/wordprocessingInk" xmlns:wne="http://schemas.microsoft.com/office/word/2006/wordml" xmlns:wps="http://schemas.microsoft.com/office/word/2010/wordprocessingShape" mc:Ignorable="w14 w15 w16se w16cid wp14">
+<w:numbering xmlns:wpc="http://schemas.microsoft.com/office/word/2010/wordprocessingCanvas" xmlns:cx="http://schemas.microsoft.com/office/drawing/2014/chartex" xmlns:cx1="http://schemas.microsoft.com/office/drawing/2015/9/8/chartex" xmlns:cx2="http://schemas.microsoft.com/office/drawing/2015/10/21/chartex" xmlns:cx3="http://schemas.microsoft.com/office/drawing/2016/5/9/chartex" xmlns:cx4="http://schemas.microsoft.com/office/drawing/2016/5/10/chartex" xmlns:cx5="http://schemas.microsoft.com/office/drawing/2016/5/11/chartex" xmlns:cx6="http://schemas.microsoft.com/office/drawing/2016/5/12/chartex" xmlns:cx7="http://schemas.microsoft.com/office/drawing/2016/5/13/chartex" xmlns:cx8="http://schemas.microsoft.com/office/drawing/2016/5/14/chartex" xmlns:mc="http://schemas.openxmlformats.org/markup-compatibility/2006" xmlns:aink="http://schemas.microsoft.com/office/drawing/2016/ink" xmlns:am3d="http://schemas.microsoft.com/office/drawing/2017/model3d" xmlns:o="urn:schemas-microsoft-com:office:office" xmlns:oel="http://schemas.microsoft.com/office/2019/extlst" xmlns:r="http://schemas.openxmlformats.org/officeDocument/2006/relationships" xmlns:m="http://schemas.openxmlformats.org/officeDocument/2006/math" xmlns:v="urn:schemas-microsoft-com:vml" xmlns:wp14="http://schemas.microsoft.com/office/word/2010/wordprocessingDrawing" xmlns:wp="http://schemas.openxmlformats.org/drawingml/2006/wordprocessingDrawing" xmlns:w10="urn:schemas-microsoft-com:office:word" xmlns:w="http://schemas.openxmlformats.org/wordprocessingml/2006/main" xmlns:w14="http://schemas.microsoft.com/office/word/2010/wordml" xmlns:w15="http://schemas.microsoft.com/office/word/2012/wordml" xmlns:w16cex="http://schemas.microsoft.com/office/word/2018/wordml/cex" xmlns:w16cid="http://schemas.microsoft.com/office/word/2016/wordml/cid" xmlns:w16="http://schemas.microsoft.com/office/word/2018/wordml" xmlns:w16du="http://schemas.microsoft.com/office/word/2023/wordml/word16du" xmlns:w16sdtdh="http://schemas.microsoft.com/office/word/2020/wordml/sdtdatahash" xmlns:w16sdtfl="http://schemas.microsoft.com/office/word/2024/wordml/sdtformatlock" xmlns:w16se="http://schemas.microsoft.com/office/word/2015/wordml/symex" xmlns:wpg="http://schemas.microsoft.com/office/word/2010/wordprocessingGroup" xmlns:wpi="http://schemas.microsoft.com/office/word/2010/wordprocessingInk" xmlns:wne="http://schemas.microsoft.com/office/word/2006/wordml" xmlns:wps="http://schemas.microsoft.com/office/word/2010/wordprocessingShape" mc:Ignorable="w14 w15 w16se w16cid w16 w16cex w16sdtdh w16sdtfl w16du wp14">
   <w:abstractNum w:abstractNumId="0" w15:restartNumberingAfterBreak="0">
     <w:nsid w:val="04D21BC3"/>
     <w:multiLevelType w:val="hybridMultilevel"/>
@@ -4447,71 +5075,71 @@
       </w:rPr>
     </w:lvl>
   </w:abstractNum>
-  <w:num w:numId="1">
+  <w:num w:numId="1" w16cid:durableId="1275863079">
     <w:abstractNumId w:val="17"/>
   </w:num>
-  <w:num w:numId="2">
+  <w:num w:numId="2" w16cid:durableId="147284530">
     <w:abstractNumId w:val="18"/>
   </w:num>
-  <w:num w:numId="3">
+  <w:num w:numId="3" w16cid:durableId="965308908">
     <w:abstractNumId w:val="0"/>
   </w:num>
-  <w:num w:numId="4">
+  <w:num w:numId="4" w16cid:durableId="31923978">
     <w:abstractNumId w:val="8"/>
   </w:num>
-  <w:num w:numId="5">
+  <w:num w:numId="5" w16cid:durableId="2135512990">
     <w:abstractNumId w:val="12"/>
   </w:num>
-  <w:num w:numId="6">
+  <w:num w:numId="6" w16cid:durableId="1938826433">
     <w:abstractNumId w:val="19"/>
   </w:num>
-  <w:num w:numId="7">
+  <w:num w:numId="7" w16cid:durableId="1539509098">
     <w:abstractNumId w:val="3"/>
   </w:num>
-  <w:num w:numId="8">
+  <w:num w:numId="8" w16cid:durableId="231893490">
     <w:abstractNumId w:val="11"/>
   </w:num>
-  <w:num w:numId="9">
+  <w:num w:numId="9" w16cid:durableId="671104469">
     <w:abstractNumId w:val="10"/>
   </w:num>
-  <w:num w:numId="10">
+  <w:num w:numId="10" w16cid:durableId="1702248059">
     <w:abstractNumId w:val="15"/>
   </w:num>
-  <w:num w:numId="11">
+  <w:num w:numId="11" w16cid:durableId="2114586535">
     <w:abstractNumId w:val="7"/>
   </w:num>
-  <w:num w:numId="12">
+  <w:num w:numId="12" w16cid:durableId="804615621">
     <w:abstractNumId w:val="2"/>
   </w:num>
-  <w:num w:numId="13">
+  <w:num w:numId="13" w16cid:durableId="1461613452">
     <w:abstractNumId w:val="13"/>
   </w:num>
-  <w:num w:numId="14">
+  <w:num w:numId="14" w16cid:durableId="1608928835">
     <w:abstractNumId w:val="9"/>
   </w:num>
-  <w:num w:numId="15">
+  <w:num w:numId="15" w16cid:durableId="870919372">
     <w:abstractNumId w:val="5"/>
   </w:num>
-  <w:num w:numId="16">
+  <w:num w:numId="16" w16cid:durableId="148523238">
     <w:abstractNumId w:val="4"/>
   </w:num>
-  <w:num w:numId="17">
+  <w:num w:numId="17" w16cid:durableId="708142834">
     <w:abstractNumId w:val="6"/>
   </w:num>
-  <w:num w:numId="18">
+  <w:num w:numId="18" w16cid:durableId="1057583650">
     <w:abstractNumId w:val="1"/>
   </w:num>
-  <w:num w:numId="19">
+  <w:num w:numId="19" w16cid:durableId="115147880">
     <w:abstractNumId w:val="16"/>
   </w:num>
-  <w:num w:numId="20">
+  <w:num w:numId="20" w16cid:durableId="974063015">
     <w:abstractNumId w:val="14"/>
   </w:num>
 </w:numbering>
 </file>
 
 <file path=word/styles.xml><?xml version="1.0" encoding="utf-8"?>
-<w:styles xmlns:mc="http://schemas.openxmlformats.org/markup-compatibility/2006" xmlns:r="http://schemas.openxmlformats.org/officeDocument/2006/relationships" xmlns:w="http://schemas.openxmlformats.org/wordprocessingml/2006/main" xmlns:w14="http://schemas.microsoft.com/office/word/2010/wordml" xmlns:w15="http://schemas.microsoft.com/office/word/2012/wordml" xmlns:w16cid="http://schemas.microsoft.com/office/word/2016/wordml/cid" xmlns:w16se="http://schemas.microsoft.com/office/word/2015/wordml/symex" mc:Ignorable="w14 w15 w16se w16cid">
+<w:styles xmlns:mc="http://schemas.openxmlformats.org/markup-compatibility/2006" xmlns:r="http://schemas.openxmlformats.org/officeDocument/2006/relationships" xmlns:w="http://schemas.openxmlformats.org/wordprocessingml/2006/main" xmlns:w14="http://schemas.microsoft.com/office/word/2010/wordml" xmlns:w15="http://schemas.microsoft.com/office/word/2012/wordml" xmlns:w16cex="http://schemas.microsoft.com/office/word/2018/wordml/cex" xmlns:w16cid="http://schemas.microsoft.com/office/word/2016/wordml/cid" xmlns:w16="http://schemas.microsoft.com/office/word/2018/wordml" xmlns:w16du="http://schemas.microsoft.com/office/word/2023/wordml/word16du" xmlns:w16sdtdh="http://schemas.microsoft.com/office/word/2020/wordml/sdtdatahash" xmlns:w16sdtfl="http://schemas.microsoft.com/office/word/2024/wordml/sdtformatlock" xmlns:w16se="http://schemas.microsoft.com/office/word/2015/wordml/symex" mc:Ignorable="w14 w15 w16se w16cid w16 w16cex w16sdtdh w16sdtfl w16du">
   <w:docDefaults>
     <w:rPrDefault>
       <w:rPr>
@@ -4527,7 +5155,7 @@
       </w:pPr>
     </w:pPrDefault>
   </w:docDefaults>
-  <w:latentStyles w:defLockedState="0" w:defUIPriority="99" w:defSemiHidden="0" w:defUnhideWhenUsed="0" w:defQFormat="0" w:count="375">
+  <w:latentStyles w:defLockedState="0" w:defUIPriority="99" w:defSemiHidden="0" w:defUnhideWhenUsed="0" w:defQFormat="0" w:count="376">
     <w:lsdException w:name="Normal" w:uiPriority="0" w:qFormat="1"/>
     <w:lsdException w:name="heading 1" w:uiPriority="9" w:qFormat="1"/>
     <w:lsdException w:name="heading 2" w:semiHidden="1" w:uiPriority="9" w:unhideWhenUsed="1" w:qFormat="1"/>
@@ -4902,6 +5530,7 @@
     <w:lsdException w:name="Smart Hyperlink" w:semiHidden="1" w:unhideWhenUsed="1"/>
     <w:lsdException w:name="Hashtag" w:semiHidden="1" w:unhideWhenUsed="1"/>
     <w:lsdException w:name="Unresolved Mention" w:semiHidden="1" w:unhideWhenUsed="1"/>
+    <w:lsdException w:name="Smart Link" w:semiHidden="1" w:unhideWhenUsed="1"/>
   </w:latentStyles>
   <w:style w:type="paragraph" w:default="1" w:styleId="Normal">
     <w:name w:val="Normal"/>
@@ -5339,6 +5968,26 @@
       <w:szCs w:val="20"/>
     </w:rPr>
   </w:style>
+  <w:style w:type="paragraph" w:styleId="GvdeMetni">
+    <w:name w:val="Body Text"/>
+    <w:basedOn w:val="Normal"/>
+    <w:link w:val="GvdeMetniChar"/>
+    <w:uiPriority w:val="99"/>
+    <w:semiHidden/>
+    <w:unhideWhenUsed/>
+    <w:rsid w:val="00203784"/>
+    <w:pPr>
+      <w:spacing w:after="120"/>
+    </w:pPr>
+  </w:style>
+  <w:style w:type="character" w:customStyle="1" w:styleId="GvdeMetniChar">
+    <w:name w:val="Gövde Metni Char"/>
+    <w:basedOn w:val="VarsaylanParagrafYazTipi"/>
+    <w:link w:val="GvdeMetni"/>
+    <w:uiPriority w:val="99"/>
+    <w:semiHidden/>
+    <w:rsid w:val="00203784"/>
+  </w:style>
 </w:styles>
 </file>
 

</xml_diff>

<commit_message>
Remove outdated documents and scripts related to AURIS project deliverables, including the control checklist, extended English abstract, cover page, and main article text. This cleanup ensures that only the most relevant and updated files are retained in the repository.
</commit_message>
<xml_diff>
--- a/docs/academic/paper/deliverables/AURIS_Genisletilmis_Ingilizce_Ozet.docx
+++ b/docs/academic/paper/deliverables/AURIS_Genisletilmis_Ingilizce_Ozet.docx
@@ -707,128 +707,6 @@
               <w:jc w:val="both"/>
               <w:rPr>
                 <w:rFonts w:asciiTheme="majorBidi" w:hAnsiTheme="majorBidi" w:cstheme="majorBidi"/>
-                <w:sz w:val="18"/>
-                <w:szCs w:val="18"/>
-                <w:lang w:val="en-US"/>
-              </w:rPr>
-            </w:pPr>
-            <w:r>
-              <w:rPr>
-                <w:rFonts w:asciiTheme="majorBidi" w:hAnsiTheme="majorBidi" w:cstheme="majorBidi"/>
-                <w:sz w:val="18"/>
-                <w:szCs w:val="18"/>
-                <w:lang w:val="en-US"/>
-              </w:rPr>
-              <w:t xml:space="preserve">The proliferation of text-to-music generators such as Suno, </w:t>
-            </w:r>
-            <w:proofErr w:type="spellStart"/>
-            <w:r>
-              <w:rPr>
-                <w:rFonts w:asciiTheme="majorBidi" w:hAnsiTheme="majorBidi" w:cstheme="majorBidi"/>
-                <w:sz w:val="18"/>
-                <w:szCs w:val="18"/>
-                <w:lang w:val="en-US"/>
-              </w:rPr>
-              <w:t>Udio</w:t>
-            </w:r>
-            <w:proofErr w:type="spellEnd"/>
-            <w:r>
-              <w:rPr>
-                <w:rFonts w:asciiTheme="majorBidi" w:hAnsiTheme="majorBidi" w:cstheme="majorBidi"/>
-                <w:sz w:val="18"/>
-                <w:szCs w:val="18"/>
-                <w:lang w:val="en-US"/>
-              </w:rPr>
-              <w:t xml:space="preserve"> and </w:t>
-            </w:r>
-            <w:proofErr w:type="spellStart"/>
-            <w:r>
-              <w:rPr>
-                <w:rFonts w:asciiTheme="majorBidi" w:hAnsiTheme="majorBidi" w:cstheme="majorBidi"/>
-                <w:sz w:val="18"/>
-                <w:szCs w:val="18"/>
-                <w:lang w:val="en-US"/>
-              </w:rPr>
-              <w:t>MusicGen</w:t>
-            </w:r>
-            <w:proofErr w:type="spellEnd"/>
-            <w:r>
-              <w:rPr>
-                <w:rFonts w:asciiTheme="majorBidi" w:hAnsiTheme="majorBidi" w:cstheme="majorBidi"/>
-                <w:sz w:val="18"/>
-                <w:szCs w:val="18"/>
-                <w:lang w:val="en-US"/>
-              </w:rPr>
-              <w:t xml:space="preserve"> has created a detection problem of practical importance for copyright attribution, streaming-platform integrity and artist economics. This paper proposes AURIS, a system that couples a 47-dimensional handcrafted acoustic feature vector with an ensemble of eleven classifiers. The models are trained on a dataset of 5,195 samples drawn from twelve AI generation systems and multiple human sources (GTZAN, FMA, </w:t>
-            </w:r>
-            <w:proofErr w:type="spellStart"/>
-            <w:r>
-              <w:rPr>
-                <w:rFonts w:asciiTheme="majorBidi" w:hAnsiTheme="majorBidi" w:cstheme="majorBidi"/>
-                <w:sz w:val="18"/>
-                <w:szCs w:val="18"/>
-                <w:lang w:val="en-US"/>
-              </w:rPr>
-              <w:t>SleepyJesse</w:t>
-            </w:r>
-            <w:proofErr w:type="spellEnd"/>
-            <w:r>
-              <w:rPr>
-                <w:rFonts w:asciiTheme="majorBidi" w:hAnsiTheme="majorBidi" w:cstheme="majorBidi"/>
-                <w:sz w:val="18"/>
-                <w:szCs w:val="18"/>
-                <w:lang w:val="en-US"/>
-              </w:rPr>
-              <w:t xml:space="preserve"> covers) under 5-fold cross-validation. </w:t>
-            </w:r>
-            <w:proofErr w:type="spellStart"/>
-            <w:r>
-              <w:rPr>
-                <w:rFonts w:asciiTheme="majorBidi" w:hAnsiTheme="majorBidi" w:cstheme="majorBidi"/>
-                <w:sz w:val="18"/>
-                <w:szCs w:val="18"/>
-                <w:lang w:val="en-US"/>
-              </w:rPr>
-              <w:t>LightGBM</w:t>
-            </w:r>
-            <w:proofErr w:type="spellEnd"/>
-            <w:r>
-              <w:rPr>
-                <w:rFonts w:asciiTheme="majorBidi" w:hAnsiTheme="majorBidi" w:cstheme="majorBidi"/>
-                <w:sz w:val="18"/>
-                <w:szCs w:val="18"/>
-                <w:lang w:val="en-US"/>
-              </w:rPr>
-              <w:t xml:space="preserve"> achieves the top ROC-AUC of 0.9548 (±0.0023). Spectral-flatness standard deviation ranks first in feature importance. A Youden-J </w:t>
-            </w:r>
-            <w:proofErr w:type="spellStart"/>
-            <w:r>
-              <w:rPr>
-                <w:rFonts w:asciiTheme="majorBidi" w:hAnsiTheme="majorBidi" w:cstheme="majorBidi"/>
-                <w:sz w:val="18"/>
-                <w:szCs w:val="18"/>
-                <w:lang w:val="en-US"/>
-              </w:rPr>
-              <w:t>optimised</w:t>
-            </w:r>
-            <w:proofErr w:type="spellEnd"/>
-            <w:r>
-              <w:rPr>
-                <w:rFonts w:asciiTheme="majorBidi" w:hAnsiTheme="majorBidi" w:cstheme="majorBidi"/>
-                <w:sz w:val="18"/>
-                <w:szCs w:val="18"/>
-                <w:lang w:val="en-US"/>
-              </w:rPr>
-              <w:t xml:space="preserve"> threshold of θ* = 0.4316 improves balanced accuracy. The architecture of AURIS is presented in Figure A.</w:t>
-            </w:r>
-          </w:p>
-          <w:p>
-            <w:pPr>
-              <w:pStyle w:val="ListeParagraf"/>
-              <w:ind w:left="0"/>
-              <w:jc w:val="both"/>
-              <w:rPr>
-                <w:rFonts w:asciiTheme="majorBidi" w:hAnsiTheme="majorBidi" w:cstheme="majorBidi"/>
                 <w:sz w:val="16"/>
                 <w:szCs w:val="16"/>
                 <w:highlight w:val="yellow"/>
@@ -836,6 +714,115 @@
                 <w:lang w:val="en-US"/>
               </w:rPr>
             </w:pPr>
+            <w:r>
+              <w:rPr>
+                <w:rFonts w:asciiTheme="majorBidi" w:hAnsiTheme="majorBidi" w:cstheme="majorBidi"/>
+                <w:sz w:val="18"/>
+                <w:szCs w:val="18"/>
+                <w:lang w:val="en-US"/>
+              </w:rPr>
+              <w:t xml:space="preserve">The proliferation of text-to-music generators such as Suno, </w:t>
+            </w:r>
+            <w:proofErr w:type="spellStart"/>
+            <w:r>
+              <w:rPr>
+                <w:rFonts w:asciiTheme="majorBidi" w:hAnsiTheme="majorBidi" w:cstheme="majorBidi"/>
+                <w:sz w:val="18"/>
+                <w:szCs w:val="18"/>
+                <w:lang w:val="en-US"/>
+              </w:rPr>
+              <w:t>Udio</w:t>
+            </w:r>
+            <w:proofErr w:type="spellEnd"/>
+            <w:r>
+              <w:rPr>
+                <w:rFonts w:asciiTheme="majorBidi" w:hAnsiTheme="majorBidi" w:cstheme="majorBidi"/>
+                <w:sz w:val="18"/>
+                <w:szCs w:val="18"/>
+                <w:lang w:val="en-US"/>
+              </w:rPr>
+              <w:t xml:space="preserve"> and </w:t>
+            </w:r>
+            <w:proofErr w:type="spellStart"/>
+            <w:r>
+              <w:rPr>
+                <w:rFonts w:asciiTheme="majorBidi" w:hAnsiTheme="majorBidi" w:cstheme="majorBidi"/>
+                <w:sz w:val="18"/>
+                <w:szCs w:val="18"/>
+                <w:lang w:val="en-US"/>
+              </w:rPr>
+              <w:t>MusicGen</w:t>
+            </w:r>
+            <w:proofErr w:type="spellEnd"/>
+            <w:r>
+              <w:rPr>
+                <w:rFonts w:asciiTheme="majorBidi" w:hAnsiTheme="majorBidi" w:cstheme="majorBidi"/>
+                <w:sz w:val="18"/>
+                <w:szCs w:val="18"/>
+                <w:lang w:val="en-US"/>
+              </w:rPr>
+              <w:t xml:space="preserve"> has created a detection problem of practical importance for copyright attribution, streaming-platform integrity and artist economics. This paper proposes AURIS, a system that couples a 47-dimensional handcrafted acoustic feature vector with an ensemble of eleven classifiers. The models are trained on a dataset of 5,195 samples drawn from twelve AI generation systems and multiple human sources (GTZAN, FMA, </w:t>
+            </w:r>
+            <w:proofErr w:type="spellStart"/>
+            <w:r>
+              <w:rPr>
+                <w:rFonts w:asciiTheme="majorBidi" w:hAnsiTheme="majorBidi" w:cstheme="majorBidi"/>
+                <w:sz w:val="18"/>
+                <w:szCs w:val="18"/>
+                <w:lang w:val="en-US"/>
+              </w:rPr>
+              <w:t>SleepyJesse</w:t>
+            </w:r>
+            <w:proofErr w:type="spellEnd"/>
+            <w:r>
+              <w:rPr>
+                <w:rFonts w:asciiTheme="majorBidi" w:hAnsiTheme="majorBidi" w:cstheme="majorBidi"/>
+                <w:sz w:val="18"/>
+                <w:szCs w:val="18"/>
+                <w:lang w:val="en-US"/>
+              </w:rPr>
+              <w:t xml:space="preserve"> covers) under 5-fold cross-validation. </w:t>
+            </w:r>
+            <w:proofErr w:type="spellStart"/>
+            <w:r>
+              <w:rPr>
+                <w:rFonts w:asciiTheme="majorBidi" w:hAnsiTheme="majorBidi" w:cstheme="majorBidi"/>
+                <w:sz w:val="18"/>
+                <w:szCs w:val="18"/>
+                <w:lang w:val="en-US"/>
+              </w:rPr>
+              <w:t>LightGBM</w:t>
+            </w:r>
+            <w:proofErr w:type="spellEnd"/>
+            <w:r>
+              <w:rPr>
+                <w:rFonts w:asciiTheme="majorBidi" w:hAnsiTheme="majorBidi" w:cstheme="majorBidi"/>
+                <w:sz w:val="18"/>
+                <w:szCs w:val="18"/>
+                <w:lang w:val="en-US"/>
+              </w:rPr>
+              <w:t xml:space="preserve"> achieves the top ROC-AUC of 0.9548 (±0.0023). Spectral-flatness standard deviation ranks first in feature importance. A Youden-J </w:t>
+            </w:r>
+            <w:proofErr w:type="spellStart"/>
+            <w:r>
+              <w:rPr>
+                <w:rFonts w:asciiTheme="majorBidi" w:hAnsiTheme="majorBidi" w:cstheme="majorBidi"/>
+                <w:sz w:val="18"/>
+                <w:szCs w:val="18"/>
+                <w:lang w:val="en-US"/>
+              </w:rPr>
+              <w:t>optimised</w:t>
+            </w:r>
+            <w:proofErr w:type="spellEnd"/>
+            <w:r>
+              <w:rPr>
+                <w:rFonts w:asciiTheme="majorBidi" w:hAnsiTheme="majorBidi" w:cstheme="majorBidi"/>
+                <w:sz w:val="18"/>
+                <w:szCs w:val="18"/>
+                <w:lang w:val="en-US"/>
+              </w:rPr>
+              <w:t xml:space="preserve"> threshold of θ* = 0.4316 improves balanced accuracy. The architecture of AURIS is presented in Figure A.</w:t>
+            </w:r>
           </w:p>
           <w:p>
             <w:pPr>

</xml_diff>

<commit_message>
Add pipeline diagram generation script and new document file
- Introduced a new Python script `regen_pipeline_en.py` for generating a pipeline diagram using Matplotlib.
- The script creates a visual representation of the audio processing pipeline with labeled boxes and arrows.
- Added a new document file `~$RIS_Makale_Metni.docx` to the deliverables directory.
</commit_message>
<xml_diff>
--- a/docs/academic/paper/deliverables/AURIS_Genisletilmis_Ingilizce_Ozet.docx
+++ b/docs/academic/paper/deliverables/AURIS_Genisletilmis_Ingilizce_Ozet.docx
@@ -707,6 +707,128 @@
               <w:jc w:val="both"/>
               <w:rPr>
                 <w:rFonts w:asciiTheme="majorBidi" w:hAnsiTheme="majorBidi" w:cstheme="majorBidi"/>
+                <w:sz w:val="18"/>
+                <w:szCs w:val="18"/>
+                <w:lang w:val="en-US"/>
+              </w:rPr>
+            </w:pPr>
+            <w:r>
+              <w:rPr>
+                <w:rFonts w:asciiTheme="majorBidi" w:hAnsiTheme="majorBidi" w:cstheme="majorBidi"/>
+                <w:sz w:val="18"/>
+                <w:szCs w:val="18"/>
+                <w:lang w:val="en-US"/>
+              </w:rPr>
+              <w:t xml:space="preserve">The proliferation of text-to-music generators such as Suno, </w:t>
+            </w:r>
+            <w:proofErr w:type="spellStart"/>
+            <w:r>
+              <w:rPr>
+                <w:rFonts w:asciiTheme="majorBidi" w:hAnsiTheme="majorBidi" w:cstheme="majorBidi"/>
+                <w:sz w:val="18"/>
+                <w:szCs w:val="18"/>
+                <w:lang w:val="en-US"/>
+              </w:rPr>
+              <w:t>Udio</w:t>
+            </w:r>
+            <w:proofErr w:type="spellEnd"/>
+            <w:r>
+              <w:rPr>
+                <w:rFonts w:asciiTheme="majorBidi" w:hAnsiTheme="majorBidi" w:cstheme="majorBidi"/>
+                <w:sz w:val="18"/>
+                <w:szCs w:val="18"/>
+                <w:lang w:val="en-US"/>
+              </w:rPr>
+              <w:t xml:space="preserve"> and </w:t>
+            </w:r>
+            <w:proofErr w:type="spellStart"/>
+            <w:r>
+              <w:rPr>
+                <w:rFonts w:asciiTheme="majorBidi" w:hAnsiTheme="majorBidi" w:cstheme="majorBidi"/>
+                <w:sz w:val="18"/>
+                <w:szCs w:val="18"/>
+                <w:lang w:val="en-US"/>
+              </w:rPr>
+              <w:t>MusicGen</w:t>
+            </w:r>
+            <w:proofErr w:type="spellEnd"/>
+            <w:r>
+              <w:rPr>
+                <w:rFonts w:asciiTheme="majorBidi" w:hAnsiTheme="majorBidi" w:cstheme="majorBidi"/>
+                <w:sz w:val="18"/>
+                <w:szCs w:val="18"/>
+                <w:lang w:val="en-US"/>
+              </w:rPr>
+              <w:t xml:space="preserve"> has created a detection problem of practical importance for copyright attribution, streaming-platform integrity and artist economics. This paper proposes AURIS, a system that couples a 47-dimensional handcrafted acoustic feature vector with an ensemble of eleven classifiers. The models are trained on a dataset of 5,195 samples drawn from twelve AI generation systems and multiple human sources (GTZAN, FMA, </w:t>
+            </w:r>
+            <w:proofErr w:type="spellStart"/>
+            <w:r>
+              <w:rPr>
+                <w:rFonts w:asciiTheme="majorBidi" w:hAnsiTheme="majorBidi" w:cstheme="majorBidi"/>
+                <w:sz w:val="18"/>
+                <w:szCs w:val="18"/>
+                <w:lang w:val="en-US"/>
+              </w:rPr>
+              <w:t>SleepyJesse</w:t>
+            </w:r>
+            <w:proofErr w:type="spellEnd"/>
+            <w:r>
+              <w:rPr>
+                <w:rFonts w:asciiTheme="majorBidi" w:hAnsiTheme="majorBidi" w:cstheme="majorBidi"/>
+                <w:sz w:val="18"/>
+                <w:szCs w:val="18"/>
+                <w:lang w:val="en-US"/>
+              </w:rPr>
+              <w:t xml:space="preserve"> covers) under 5-fold cross-validation. </w:t>
+            </w:r>
+            <w:proofErr w:type="spellStart"/>
+            <w:r>
+              <w:rPr>
+                <w:rFonts w:asciiTheme="majorBidi" w:hAnsiTheme="majorBidi" w:cstheme="majorBidi"/>
+                <w:sz w:val="18"/>
+                <w:szCs w:val="18"/>
+                <w:lang w:val="en-US"/>
+              </w:rPr>
+              <w:t>LightGBM</w:t>
+            </w:r>
+            <w:proofErr w:type="spellEnd"/>
+            <w:r>
+              <w:rPr>
+                <w:rFonts w:asciiTheme="majorBidi" w:hAnsiTheme="majorBidi" w:cstheme="majorBidi"/>
+                <w:sz w:val="18"/>
+                <w:szCs w:val="18"/>
+                <w:lang w:val="en-US"/>
+              </w:rPr>
+              <w:t xml:space="preserve"> achieves the top ROC-AUC of 0.9548 (±0.0023). Spectral-flatness standard deviation ranks first in feature importance. A Youden-J </w:t>
+            </w:r>
+            <w:proofErr w:type="spellStart"/>
+            <w:r>
+              <w:rPr>
+                <w:rFonts w:asciiTheme="majorBidi" w:hAnsiTheme="majorBidi" w:cstheme="majorBidi"/>
+                <w:sz w:val="18"/>
+                <w:szCs w:val="18"/>
+                <w:lang w:val="en-US"/>
+              </w:rPr>
+              <w:t>optimised</w:t>
+            </w:r>
+            <w:proofErr w:type="spellEnd"/>
+            <w:r>
+              <w:rPr>
+                <w:rFonts w:asciiTheme="majorBidi" w:hAnsiTheme="majorBidi" w:cstheme="majorBidi"/>
+                <w:sz w:val="18"/>
+                <w:szCs w:val="18"/>
+                <w:lang w:val="en-US"/>
+              </w:rPr>
+              <w:t xml:space="preserve"> threshold of θ* = 0.4316 improves balanced accuracy. The architecture of AURIS is presented in Figure A.</w:t>
+            </w:r>
+          </w:p>
+          <w:p>
+            <w:pPr>
+              <w:pStyle w:val="ListeParagraf"/>
+              <w:ind w:left="0"/>
+              <w:jc w:val="both"/>
+              <w:rPr>
+                <w:rFonts w:asciiTheme="majorBidi" w:hAnsiTheme="majorBidi" w:cstheme="majorBidi"/>
                 <w:sz w:val="16"/>
                 <w:szCs w:val="16"/>
                 <w:highlight w:val="yellow"/>
@@ -714,115 +836,6 @@
                 <w:lang w:val="en-US"/>
               </w:rPr>
             </w:pPr>
-            <w:r>
-              <w:rPr>
-                <w:rFonts w:asciiTheme="majorBidi" w:hAnsiTheme="majorBidi" w:cstheme="majorBidi"/>
-                <w:sz w:val="18"/>
-                <w:szCs w:val="18"/>
-                <w:lang w:val="en-US"/>
-              </w:rPr>
-              <w:t xml:space="preserve">The proliferation of text-to-music generators such as Suno, </w:t>
-            </w:r>
-            <w:proofErr w:type="spellStart"/>
-            <w:r>
-              <w:rPr>
-                <w:rFonts w:asciiTheme="majorBidi" w:hAnsiTheme="majorBidi" w:cstheme="majorBidi"/>
-                <w:sz w:val="18"/>
-                <w:szCs w:val="18"/>
-                <w:lang w:val="en-US"/>
-              </w:rPr>
-              <w:t>Udio</w:t>
-            </w:r>
-            <w:proofErr w:type="spellEnd"/>
-            <w:r>
-              <w:rPr>
-                <w:rFonts w:asciiTheme="majorBidi" w:hAnsiTheme="majorBidi" w:cstheme="majorBidi"/>
-                <w:sz w:val="18"/>
-                <w:szCs w:val="18"/>
-                <w:lang w:val="en-US"/>
-              </w:rPr>
-              <w:t xml:space="preserve"> and </w:t>
-            </w:r>
-            <w:proofErr w:type="spellStart"/>
-            <w:r>
-              <w:rPr>
-                <w:rFonts w:asciiTheme="majorBidi" w:hAnsiTheme="majorBidi" w:cstheme="majorBidi"/>
-                <w:sz w:val="18"/>
-                <w:szCs w:val="18"/>
-                <w:lang w:val="en-US"/>
-              </w:rPr>
-              <w:t>MusicGen</w:t>
-            </w:r>
-            <w:proofErr w:type="spellEnd"/>
-            <w:r>
-              <w:rPr>
-                <w:rFonts w:asciiTheme="majorBidi" w:hAnsiTheme="majorBidi" w:cstheme="majorBidi"/>
-                <w:sz w:val="18"/>
-                <w:szCs w:val="18"/>
-                <w:lang w:val="en-US"/>
-              </w:rPr>
-              <w:t xml:space="preserve"> has created a detection problem of practical importance for copyright attribution, streaming-platform integrity and artist economics. This paper proposes AURIS, a system that couples a 47-dimensional handcrafted acoustic feature vector with an ensemble of eleven classifiers. The models are trained on a dataset of 5,195 samples drawn from twelve AI generation systems and multiple human sources (GTZAN, FMA, </w:t>
-            </w:r>
-            <w:proofErr w:type="spellStart"/>
-            <w:r>
-              <w:rPr>
-                <w:rFonts w:asciiTheme="majorBidi" w:hAnsiTheme="majorBidi" w:cstheme="majorBidi"/>
-                <w:sz w:val="18"/>
-                <w:szCs w:val="18"/>
-                <w:lang w:val="en-US"/>
-              </w:rPr>
-              <w:t>SleepyJesse</w:t>
-            </w:r>
-            <w:proofErr w:type="spellEnd"/>
-            <w:r>
-              <w:rPr>
-                <w:rFonts w:asciiTheme="majorBidi" w:hAnsiTheme="majorBidi" w:cstheme="majorBidi"/>
-                <w:sz w:val="18"/>
-                <w:szCs w:val="18"/>
-                <w:lang w:val="en-US"/>
-              </w:rPr>
-              <w:t xml:space="preserve"> covers) under 5-fold cross-validation. </w:t>
-            </w:r>
-            <w:proofErr w:type="spellStart"/>
-            <w:r>
-              <w:rPr>
-                <w:rFonts w:asciiTheme="majorBidi" w:hAnsiTheme="majorBidi" w:cstheme="majorBidi"/>
-                <w:sz w:val="18"/>
-                <w:szCs w:val="18"/>
-                <w:lang w:val="en-US"/>
-              </w:rPr>
-              <w:t>LightGBM</w:t>
-            </w:r>
-            <w:proofErr w:type="spellEnd"/>
-            <w:r>
-              <w:rPr>
-                <w:rFonts w:asciiTheme="majorBidi" w:hAnsiTheme="majorBidi" w:cstheme="majorBidi"/>
-                <w:sz w:val="18"/>
-                <w:szCs w:val="18"/>
-                <w:lang w:val="en-US"/>
-              </w:rPr>
-              <w:t xml:space="preserve"> achieves the top ROC-AUC of 0.9548 (±0.0023). Spectral-flatness standard deviation ranks first in feature importance. A Youden-J </w:t>
-            </w:r>
-            <w:proofErr w:type="spellStart"/>
-            <w:r>
-              <w:rPr>
-                <w:rFonts w:asciiTheme="majorBidi" w:hAnsiTheme="majorBidi" w:cstheme="majorBidi"/>
-                <w:sz w:val="18"/>
-                <w:szCs w:val="18"/>
-                <w:lang w:val="en-US"/>
-              </w:rPr>
-              <w:t>optimised</w:t>
-            </w:r>
-            <w:proofErr w:type="spellEnd"/>
-            <w:r>
-              <w:rPr>
-                <w:rFonts w:asciiTheme="majorBidi" w:hAnsiTheme="majorBidi" w:cstheme="majorBidi"/>
-                <w:sz w:val="18"/>
-                <w:szCs w:val="18"/>
-                <w:lang w:val="en-US"/>
-              </w:rPr>
-              <w:t xml:space="preserve"> threshold of θ* = 0.4316 improves balanced accuracy. The architecture of AURIS is presented in Figure A.</w:t>
-            </w:r>
           </w:p>
           <w:p>
             <w:pPr>
@@ -840,8 +853,8 @@
                 <w:noProof/>
               </w:rPr>
               <w:drawing>
-                <wp:inline distT="0" distB="0" distL="0" distR="0" wp14:anchorId="718DEE24" wp14:editId="6CF5D5CF">
-                  <wp:extent cx="4917832" cy="1566407"/>
+                <wp:inline distT="0" distB="0" distL="0" distR="0" wp14:anchorId="718DEE24" wp14:editId="1230AB0A">
+                  <wp:extent cx="4917832" cy="953296"/>
                   <wp:effectExtent l="0" t="0" r="0" b="0"/>
                   <wp:docPr id="62" name="Picture 62"/>
                   <wp:cNvGraphicFramePr>
@@ -851,11 +864,17 @@
                     <a:graphicData uri="http://schemas.openxmlformats.org/drawingml/2006/picture">
                       <pic:pic xmlns:pic="http://schemas.openxmlformats.org/drawingml/2006/picture">
                         <pic:nvPicPr>
-                          <pic:cNvPr id="0" name="paper_pipeline_diagram.png"/>
+                          <pic:cNvPr id="62" name="Picture 62"/>
                           <pic:cNvPicPr/>
                         </pic:nvPicPr>
                         <pic:blipFill>
-                          <a:blip r:embed="rId12"/>
+                          <a:blip r:embed="rId12" cstate="print">
+                            <a:extLst>
+                              <a:ext uri="{28A0092B-C50C-407E-A947-70E740481C1C}">
+                                <a14:useLocalDpi xmlns:a14="http://schemas.microsoft.com/office/drawing/2010/main" val="0"/>
+                              </a:ext>
+                            </a:extLst>
+                          </a:blip>
                           <a:stretch>
                             <a:fillRect/>
                           </a:stretch>
@@ -863,7 +882,7 @@
                         <pic:spPr>
                           <a:xfrm>
                             <a:off x="0" y="0"/>
-                            <a:ext cx="4958041" cy="1579214"/>
+                            <a:ext cx="4917832" cy="953296"/>
                           </a:xfrm>
                           <a:prstGeom prst="rect">
                             <a:avLst/>

</xml_diff>

<commit_message>
Refactor Telif Hakkı Devir Formu and remove obsolete files
</commit_message>
<xml_diff>
--- a/docs/academic/paper/deliverables/AURIS_Genisletilmis_Ingilizce_Ozet.docx
+++ b/docs/academic/paper/deliverables/AURIS_Genisletilmis_Ingilizce_Ozet.docx
@@ -68,7 +68,27 @@
                 <w:szCs w:val="28"/>
                 <w:lang w:val="en-US"/>
               </w:rPr>
-              <w:t>AURIS: A multi-model ensemble approach for the detection of AI-generated music</w:t>
+              <w:t xml:space="preserve">Community Learning in the Detection of AI-Generated Music: A </w:t>
+            </w:r>
+            <w:proofErr w:type="spellStart"/>
+            <w:r>
+              <w:rPr>
+                <w:rFonts w:asciiTheme="majorBidi" w:hAnsiTheme="majorBidi" w:cstheme="majorBidi"/>
+                <w:sz w:val="28"/>
+                <w:szCs w:val="28"/>
+                <w:lang w:val="en-US"/>
+              </w:rPr>
+              <w:t>LightGBM</w:t>
+            </w:r>
+            <w:proofErr w:type="spellEnd"/>
+            <w:r>
+              <w:rPr>
+                <w:rFonts w:asciiTheme="majorBidi" w:hAnsiTheme="majorBidi" w:cstheme="majorBidi"/>
+                <w:sz w:val="28"/>
+                <w:szCs w:val="28"/>
+                <w:lang w:val="en-US"/>
+              </w:rPr>
+              <w:t>-Based Approach Using Heterogeneous Acoustic Features</w:t>
             </w:r>
           </w:p>
         </w:tc>
@@ -1443,20 +1463,8 @@
                 <w:szCs w:val="18"/>
                 <w:lang w:val="en-US"/>
               </w:rPr>
-              <w:t xml:space="preserve">Ensemble </w:t>
-            </w:r>
-            <w:proofErr w:type="gramStart"/>
-            <w:r>
-              <w:rPr>
-                <w:rFonts w:asciiTheme="majorBidi" w:hAnsiTheme="majorBidi" w:cstheme="majorBidi"/>
-                <w:bCs/>
-                <w:sz w:val="18"/>
-                <w:szCs w:val="18"/>
-                <w:lang w:val="en-US"/>
-              </w:rPr>
-              <w:t>learning</w:t>
-            </w:r>
-            <w:proofErr w:type="gramEnd"/>
+              <w:t>Ensemble learning</w:t>
+            </w:r>
           </w:p>
           <w:p>
             <w:pPr>
@@ -1658,7 +1666,6 @@
               <w:t xml:space="preserve">Received: </w:t>
             </w:r>
             <w:proofErr w:type="spellStart"/>
-            <w:proofErr w:type="gramStart"/>
             <w:r>
               <w:rPr>
                 <w:rFonts w:asciiTheme="majorBidi" w:eastAsia="TimesNewRomanPSMT" w:hAnsiTheme="majorBidi" w:cstheme="majorBidi"/>
@@ -1669,7 +1676,6 @@
               <w:t>dd.mm.yy</w:t>
             </w:r>
             <w:proofErr w:type="spellEnd"/>
-            <w:proofErr w:type="gramEnd"/>
           </w:p>
           <w:p>
             <w:pPr>
@@ -1696,7 +1702,6 @@
               <w:t xml:space="preserve">Accepted: </w:t>
             </w:r>
             <w:proofErr w:type="spellStart"/>
-            <w:proofErr w:type="gramStart"/>
             <w:r>
               <w:rPr>
                 <w:rFonts w:asciiTheme="majorBidi" w:eastAsia="TimesNewRomanPSMT" w:hAnsiTheme="majorBidi" w:cstheme="majorBidi"/>
@@ -1707,7 +1712,6 @@
               <w:t>dd.mm.yy</w:t>
             </w:r>
             <w:proofErr w:type="spellEnd"/>
-            <w:proofErr w:type="gramEnd"/>
           </w:p>
           <w:p>
             <w:pPr>
@@ -2650,22 +2654,8 @@
         <w:szCs w:val="16"/>
         <w:lang w:val="en-US"/>
       </w:rPr>
-      <w:t xml:space="preserve">rchitecture of Gazi University </w:t>
+      <w:t>rchitecture of Gazi University -:-</w:t>
     </w:r>
-    <w:proofErr w:type="gramStart"/>
-    <w:r>
-      <w:rPr>
-        <w:rStyle w:val="Vurgu"/>
-        <w:rFonts w:ascii="Times New Roman" w:hAnsi="Times New Roman" w:cs="Times New Roman"/>
-        <w:i w:val="0"/>
-        <w:color w:val="000000"/>
-        <w:sz w:val="16"/>
-        <w:szCs w:val="16"/>
-        <w:lang w:val="en-US"/>
-      </w:rPr>
-      <w:t>-:-</w:t>
-    </w:r>
-    <w:proofErr w:type="gramEnd"/>
     <w:r>
       <w:rPr>
         <w:rStyle w:val="Vurgu"/>

</xml_diff>